<commit_message>
dodane natuknice na podnaslove
</commit_message>
<xml_diff>
--- a/HOTEL_Documents/HotelManagment_IvaPleic.docx
+++ b/HOTEL_Documents/HotelManagment_IvaPleic.docx
@@ -1543,10 +1543,7 @@
         <w:br w:type="page"/>
       </w:r>
     </w:p>
-    <w:p>
-      <w:bookmarkStart w:id="0" w:name="_GoBack"/>
-      <w:bookmarkEnd w:id="0"/>
-    </w:p>
+    <w:p/>
     <w:p>
       <w:pPr>
         <w:rPr>
@@ -4852,12 +4849,12 @@
       <w:pPr>
         <w:pStyle w:val="Heading1"/>
       </w:pPr>
-      <w:bookmarkStart w:id="1" w:name="_Toc175782379"/>
+      <w:bookmarkStart w:id="0" w:name="_Toc175782379"/>
       <w:r>
         <w:lastRenderedPageBreak/>
         <w:t>UVOD</w:t>
       </w:r>
-      <w:bookmarkEnd w:id="1"/>
+      <w:bookmarkEnd w:id="0"/>
     </w:p>
     <w:p>
       <w:pPr>
@@ -5017,25 +5014,25 @@
       <w:pPr>
         <w:pStyle w:val="Heading1"/>
       </w:pPr>
-      <w:bookmarkStart w:id="2" w:name="_Toc175782380"/>
+      <w:bookmarkStart w:id="1" w:name="_Toc175782380"/>
       <w:r>
         <w:lastRenderedPageBreak/>
         <w:t>OPIS APLIKACIJE</w:t>
       </w:r>
+      <w:bookmarkEnd w:id="1"/>
+    </w:p>
+    <w:p>
+      <w:pPr>
+        <w:pStyle w:val="Heading2"/>
+      </w:pPr>
+      <w:bookmarkStart w:id="2" w:name="_Toc175782381"/>
+      <w:r>
+        <w:t>Osnovne funkcionalnosti aplikacije</w:t>
+      </w:r>
       <w:bookmarkEnd w:id="2"/>
     </w:p>
     <w:p>
       <w:pPr>
-        <w:pStyle w:val="Heading2"/>
-      </w:pPr>
-      <w:bookmarkStart w:id="3" w:name="_Toc175782381"/>
-      <w:r>
-        <w:t>Osnovne funkcionalnosti aplikacije</w:t>
-      </w:r>
-      <w:bookmarkEnd w:id="3"/>
-    </w:p>
-    <w:p>
-      <w:pPr>
         <w:ind w:firstLine="567"/>
       </w:pPr>
       <w:r>
@@ -5047,7 +5044,13 @@
         <w:ind w:firstLine="360"/>
       </w:pPr>
       <w:r>
-        <w:t>Glavne funkcionalnosti aplikacije obuhvaćaju tri osnovne komponente: upravljanje rezervacijama, upravljanje gostima i upravljanje sobama. Ove funkcionalnosti omogućuju hotelima da učinkovito organiziraju i optimiziraju svoje operacije, osiguravajući da svaki gost ima besprijekorno iskustvo boravka.</w:t>
+        <w:t xml:space="preserve">Glavne funkcionalnosti aplikacije obuhvaćaju tri osnovne komponente: </w:t>
+      </w:r>
+      <w:r>
+        <w:t>upravljanje rezervacijama, upravljanje gostima i upravljanje sobama.</w:t>
+      </w:r>
+      <w:r>
+        <w:t xml:space="preserve"> Ove funkcionalnosti omogućuju hotelima da učinkovito organiziraju i optimiziraju svoje operacije, osiguravajući da svaki gost ima besprijekorno iskustvo boravka.</w:t>
       </w:r>
     </w:p>
     <w:p>
@@ -5235,14 +5238,14 @@
       <w:pPr>
         <w:pStyle w:val="Heading2"/>
       </w:pPr>
-      <w:bookmarkStart w:id="4" w:name="_Toc175782382"/>
+      <w:bookmarkStart w:id="3" w:name="_Toc175782382"/>
       <w:r>
         <w:t>Glavni dijelovi aplikacij</w:t>
       </w:r>
       <w:r>
         <w:t>e</w:t>
       </w:r>
-      <w:bookmarkEnd w:id="4"/>
+      <w:bookmarkEnd w:id="3"/>
     </w:p>
     <w:p>
       <w:pPr>
@@ -5488,11 +5491,11 @@
       <w:pPr>
         <w:pStyle w:val="Heading2"/>
       </w:pPr>
-      <w:bookmarkStart w:id="5" w:name="_Toc175782383"/>
+      <w:bookmarkStart w:id="4" w:name="_Toc175782383"/>
       <w:r>
         <w:t>Dizajn korisničkog sučelja</w:t>
       </w:r>
-      <w:bookmarkEnd w:id="5"/>
+      <w:bookmarkEnd w:id="4"/>
     </w:p>
     <w:p>
       <w:pPr>
@@ -5565,11 +5568,11 @@
       <w:pPr>
         <w:pStyle w:val="Heading2"/>
       </w:pPr>
-      <w:bookmarkStart w:id="6" w:name="_Toc175782384"/>
+      <w:bookmarkStart w:id="5" w:name="_Toc175782384"/>
       <w:r>
         <w:t>Plan razvoja</w:t>
       </w:r>
-      <w:bookmarkEnd w:id="6"/>
+      <w:bookmarkEnd w:id="5"/>
     </w:p>
     <w:p>
       <w:pPr>
@@ -5653,22 +5656,22 @@
       <w:pPr>
         <w:pStyle w:val="Heading1"/>
       </w:pPr>
-      <w:bookmarkStart w:id="7" w:name="_Toc175782385"/>
+      <w:bookmarkStart w:id="6" w:name="_Toc175782385"/>
       <w:r>
         <w:lastRenderedPageBreak/>
         <w:t>ZAHTJEVI APLIKACIJE</w:t>
       </w:r>
+      <w:bookmarkEnd w:id="6"/>
+    </w:p>
+    <w:p>
+      <w:pPr>
+        <w:pStyle w:val="Heading2"/>
+      </w:pPr>
+      <w:bookmarkStart w:id="7" w:name="_Toc175782386"/>
+      <w:r>
+        <w:t>Funkcionalni zahtjevi</w:t>
+      </w:r>
       <w:bookmarkEnd w:id="7"/>
-    </w:p>
-    <w:p>
-      <w:pPr>
-        <w:pStyle w:val="Heading2"/>
-      </w:pPr>
-      <w:bookmarkStart w:id="8" w:name="_Toc175782386"/>
-      <w:r>
-        <w:t>Funkcionalni zahtjevi</w:t>
-      </w:r>
-      <w:bookmarkEnd w:id="8"/>
     </w:p>
     <w:p>
       <w:pPr>
@@ -5688,7 +5691,7 @@
           <w:b w:val="0"/>
         </w:rPr>
       </w:pPr>
-      <w:bookmarkStart w:id="9" w:name="_Toc175782387"/>
+      <w:bookmarkStart w:id="8" w:name="_Toc175782387"/>
       <w:r>
         <w:rPr>
           <w:rStyle w:val="Strong"/>
@@ -5696,7 +5699,7 @@
         </w:rPr>
         <w:t>Upravljanje hotelom i resursima</w:t>
       </w:r>
-      <w:bookmarkEnd w:id="9"/>
+      <w:bookmarkEnd w:id="8"/>
     </w:p>
     <w:p>
       <w:pPr>
@@ -5865,29 +5868,26 @@
       <w:pPr>
         <w:pStyle w:val="Heading3"/>
       </w:pPr>
-      <w:bookmarkStart w:id="10" w:name="_Toc175782388"/>
+      <w:bookmarkStart w:id="9" w:name="_Toc175782388"/>
       <w:r>
         <w:t>Rezervacije i poslovanje hotela</w:t>
       </w:r>
+      <w:bookmarkEnd w:id="9"/>
+    </w:p>
+    <w:p/>
+    <w:p>
+      <w:pPr>
+        <w:pStyle w:val="Heading2"/>
+      </w:pPr>
+      <w:bookmarkStart w:id="10" w:name="_Toc175782389"/>
+      <w:r>
+        <w:t>Nefunkcionalni zahtjevi</w:t>
+      </w:r>
       <w:bookmarkEnd w:id="10"/>
     </w:p>
-    <w:p/>
-    <w:p>
-      <w:pPr>
-        <w:pStyle w:val="Heading2"/>
-      </w:pPr>
-      <w:bookmarkStart w:id="11" w:name="_Toc175782389"/>
-      <w:r>
-        <w:t>Nefunkcionalni zahtjevi</w:t>
-      </w:r>
-      <w:bookmarkEnd w:id="11"/>
-    </w:p>
-    <w:p>
-      <w:r>
-        <w:t>Ova skupina funkcionalnih zahtjeva odnosi se na procese vezane uz rezervacije i svakodnevno poslovanje hotela. Klj</w:t>
-      </w:r>
-      <w:r>
-        <w:t>učne funkcionalnosti uključuju:</w:t>
+    <w:p>
+      <w:r>
+        <w:t>Ova skupina funkcionalnih zahtjeva odnosi se na procese vezane uz rezervacije i svakodnevno poslovanje hotela. Ključne funkcionalnosti uključuju:</w:t>
       </w:r>
     </w:p>
     <w:p>
@@ -6113,23 +6113,23 @@
       <w:pPr>
         <w:pStyle w:val="Heading1"/>
       </w:pPr>
-      <w:bookmarkStart w:id="12" w:name="_Toc175782390"/>
+      <w:bookmarkStart w:id="11" w:name="_Toc175782390"/>
       <w:r>
         <w:lastRenderedPageBreak/>
         <w:t>MODELIRANJE SUSTAVA</w:t>
       </w:r>
+      <w:bookmarkEnd w:id="11"/>
+    </w:p>
+    <w:p/>
+    <w:p>
+      <w:pPr>
+        <w:pStyle w:val="Heading2"/>
+      </w:pPr>
+      <w:bookmarkStart w:id="12" w:name="_Toc175782391"/>
+      <w:r>
+        <w:t>ER diagram</w:t>
+      </w:r>
       <w:bookmarkEnd w:id="12"/>
-    </w:p>
-    <w:p/>
-    <w:p>
-      <w:pPr>
-        <w:pStyle w:val="Heading2"/>
-      </w:pPr>
-      <w:bookmarkStart w:id="13" w:name="_Toc175782391"/>
-      <w:r>
-        <w:t>ER diagram</w:t>
-      </w:r>
-      <w:bookmarkEnd w:id="13"/>
     </w:p>
     <w:p>
       <w:r>
@@ -6184,40 +6184,61 @@
       <w:pPr>
         <w:pStyle w:val="Heading2"/>
       </w:pPr>
-      <w:bookmarkStart w:id="14" w:name="_Toc175782392"/>
+      <w:bookmarkStart w:id="13" w:name="_Toc175782392"/>
       <w:r>
         <w:t>Black-box model</w:t>
       </w:r>
+      <w:bookmarkEnd w:id="13"/>
+    </w:p>
+    <w:p>
+      <w:pPr>
+        <w:pStyle w:val="Heading2"/>
+      </w:pPr>
+      <w:bookmarkStart w:id="14" w:name="_Toc175782393"/>
+      <w:r>
+        <w:t>White-box model</w:t>
+      </w:r>
       <w:bookmarkEnd w:id="14"/>
     </w:p>
     <w:p>
-      <w:pPr>
-        <w:pStyle w:val="Heading2"/>
-      </w:pPr>
-      <w:bookmarkStart w:id="15" w:name="_Toc175782393"/>
-      <w:r>
-        <w:t>White-box model</w:t>
-      </w:r>
-      <w:bookmarkEnd w:id="15"/>
+      <w:r>
+        <w:t xml:space="preserve">-moduli </w:t>
+      </w:r>
     </w:p>
     <w:p>
       <w:pPr>
         <w:pStyle w:val="Heading1"/>
       </w:pPr>
-      <w:bookmarkStart w:id="16" w:name="_Toc175782394"/>
+      <w:bookmarkStart w:id="15" w:name="_Toc175782394"/>
       <w:r>
         <w:lastRenderedPageBreak/>
         <w:t>DIZAJN SUSTAVA</w:t>
       </w:r>
+      <w:bookmarkEnd w:id="15"/>
+    </w:p>
+    <w:p>
+      <w:pPr>
+        <w:pStyle w:val="Heading2"/>
+      </w:pPr>
+      <w:bookmarkStart w:id="16" w:name="_Toc175782395"/>
+      <w:r>
+        <w:t>Dizajn arhitekture sustava</w:t>
+      </w:r>
       <w:bookmarkEnd w:id="16"/>
     </w:p>
     <w:p>
+      <w:r>
+        <w:t>.</w:t>
+      </w:r>
+    </w:p>
+    <w:p/>
+    <w:p>
       <w:pPr>
         <w:pStyle w:val="Heading2"/>
       </w:pPr>
-      <w:bookmarkStart w:id="17" w:name="_Toc175782395"/>
-      <w:r>
-        <w:t>Dizajn arhitekture sustava</w:t>
+      <w:bookmarkStart w:id="17" w:name="_Toc175782396"/>
+      <w:r>
+        <w:t>Arhitektura aplikacije</w:t>
       </w:r>
       <w:bookmarkEnd w:id="17"/>
     </w:p>
@@ -6226,79 +6247,109 @@
         <w:t>.</w:t>
       </w:r>
     </w:p>
-    <w:p/>
     <w:p>
       <w:pPr>
         <w:pStyle w:val="Heading2"/>
       </w:pPr>
-      <w:bookmarkStart w:id="18" w:name="_Toc175782396"/>
-      <w:r>
-        <w:t>Arhitektura aplikacije</w:t>
+      <w:bookmarkStart w:id="18" w:name="_Toc175782397"/>
+      <w:r>
+        <w:t>B</w:t>
+      </w:r>
+      <w:r>
+        <w:t xml:space="preserve">aza podataka i upravljanje </w:t>
+      </w:r>
+      <w:r>
+        <w:t>podacima</w:t>
       </w:r>
       <w:bookmarkEnd w:id="18"/>
     </w:p>
     <w:p>
       <w:r>
-        <w:t>.</w:t>
+        <w:t>-popis svih tablica u bazi</w:t>
+      </w:r>
+    </w:p>
+    <w:p>
+      <w:r>
+        <w:t>-relacije medu njima</w:t>
+      </w:r>
+    </w:p>
+    <w:p>
+      <w:r>
+        <w:t>-storane procedure</w:t>
+      </w:r>
+    </w:p>
+    <w:p>
+      <w:r>
+        <w:t>-nacin kako pozivam storane procedure u bazi</w:t>
       </w:r>
     </w:p>
     <w:p>
       <w:pPr>
         <w:pStyle w:val="Heading2"/>
       </w:pPr>
-      <w:bookmarkStart w:id="19" w:name="_Toc175782397"/>
-      <w:r>
-        <w:t>B</w:t>
-      </w:r>
-      <w:r>
-        <w:t xml:space="preserve">aza podataka i upravljanje </w:t>
-      </w:r>
-      <w:r>
-        <w:t>podacima</w:t>
+      <w:bookmarkStart w:id="19" w:name="_Toc175782398"/>
+      <w:r>
+        <w:t>Detaljni prikaz sučelja aplikacije</w:t>
       </w:r>
       <w:bookmarkEnd w:id="19"/>
     </w:p>
     <w:p>
-      <w:pPr>
-        <w:pStyle w:val="Heading2"/>
-      </w:pPr>
-      <w:bookmarkStart w:id="20" w:name="_Toc175782398"/>
-      <w:r>
-        <w:t>Detaljni prikaz sučelja aplikacije</w:t>
-      </w:r>
-      <w:bookmarkEnd w:id="20"/>
+      <w:r>
+        <w:t>-prikaz glavnih formi rezervacije.sobe.goste, dashboard, i neki primjer malih formi za crud operacije</w:t>
+      </w:r>
     </w:p>
     <w:p>
       <w:pPr>
         <w:pStyle w:val="Heading1"/>
       </w:pPr>
-      <w:bookmarkStart w:id="21" w:name="_Toc175782399"/>
+      <w:bookmarkStart w:id="20" w:name="_Toc175782399"/>
       <w:r>
         <w:lastRenderedPageBreak/>
         <w:t>IMPLEMENTACIJA APLIKACIJE</w:t>
       </w:r>
+      <w:bookmarkEnd w:id="20"/>
+    </w:p>
+    <w:p>
+      <w:pPr>
+        <w:pStyle w:val="Heading2"/>
+      </w:pPr>
+      <w:bookmarkStart w:id="21" w:name="_Toc175782400"/>
+      <w:r>
+        <w:t>Korištene tehnologije</w:t>
+      </w:r>
       <w:bookmarkEnd w:id="21"/>
     </w:p>
     <w:p>
+      <w:r>
+        <w:t>-WinForms.Microsoft SQL Server, .net</w:t>
+      </w:r>
+    </w:p>
+    <w:p>
       <w:pPr>
         <w:pStyle w:val="Heading2"/>
       </w:pPr>
-      <w:bookmarkStart w:id="22" w:name="_Toc175782400"/>
-      <w:r>
-        <w:t>Korištene tehnologije</w:t>
+      <w:bookmarkStart w:id="22" w:name="_Toc175782401"/>
+      <w:r>
+        <w:t>Struktura aplikacije i kod</w:t>
       </w:r>
       <w:bookmarkEnd w:id="22"/>
     </w:p>
     <w:p>
-      <w:pPr>
-        <w:pStyle w:val="Heading2"/>
-      </w:pPr>
-      <w:bookmarkStart w:id="23" w:name="_Toc175782401"/>
-      <w:r>
-        <w:t>Struktura aplikacije i kod</w:t>
-      </w:r>
+      <w:r>
+        <w:t>-</w:t>
+      </w:r>
+      <w:r>
+        <w:t>SCREENSHOT SOULUTION EXPLORERA</w:t>
+      </w:r>
+    </w:p>
+    <w:p>
+      <w:r>
+        <w:t>-pocetna tocka programa</w:t>
+      </w:r>
+      <w:bookmarkStart w:id="23" w:name="_GoBack"/>
       <w:bookmarkEnd w:id="23"/>
     </w:p>
+    <w:p/>
     <w:p>
       <w:pPr>
         <w:pStyle w:val="Heading2"/>
@@ -12961,7 +13012,7 @@
       <w:rPr>
         <w:noProof/>
       </w:rPr>
-      <w:t>15</w:t>
+      <w:t>17</w:t>
     </w:r>
     <w:r>
       <w:rPr>
@@ -17418,7 +17469,7 @@
 </file>
 
 <file path=customXml/itemProps1.xml><?xml version="1.0" encoding="utf-8"?>
-<ds:datastoreItem xmlns:ds="http://schemas.openxmlformats.org/officeDocument/2006/customXml" ds:itemID="{79CF3C85-367C-42AB-BCC4-0626FA9CF5D2}">
+<ds:datastoreItem xmlns:ds="http://schemas.openxmlformats.org/officeDocument/2006/customXml" ds:itemID="{6A8D05D4-06C1-44FD-B8AF-8665FF375A51}">
   <ds:schemaRefs>
     <ds:schemaRef ds:uri="http://schemas.openxmlformats.org/officeDocument/2006/bibliography"/>
   </ds:schemaRefs>

</xml_diff>

<commit_message>
Provjerena 2 poglavlja i uvod
</commit_message>
<xml_diff>
--- a/HOTEL_Documents/HotelManagment_IvaPleic.docx
+++ b/HOTEL_Documents/HotelManagment_IvaPleic.docx
@@ -132,6 +132,7 @@
         <w:spacing w:after="120"/>
         <w:ind w:firstLine="0"/>
         <w:rPr>
+          <w:rFonts w:ascii="Arial" w:hAnsi="Arial"/>
           <w:color w:val="000000"/>
           <w:sz w:val="44"/>
           <w:szCs w:val="44"/>
@@ -139,6 +140,7 @@
       </w:pPr>
       <w:r>
         <w:rPr>
+          <w:rFonts w:ascii="Arial" w:hAnsi="Arial"/>
           <w:color w:val="000000"/>
           <w:sz w:val="44"/>
           <w:szCs w:val="44"/>
@@ -250,7 +252,39 @@
           <w:sz w:val="32"/>
           <w:szCs w:val="32"/>
         </w:rPr>
-        <w:t>Split, mjesec godina.</w:t>
+        <w:t xml:space="preserve">Split, </w:t>
+      </w:r>
+      <w:r>
+        <w:rPr>
+          <w:rFonts w:ascii="Arial" w:hAnsi="Arial"/>
+          <w:sz w:val="32"/>
+          <w:szCs w:val="32"/>
+        </w:rPr>
+        <w:t>rujan</w:t>
+      </w:r>
+      <w:r>
+        <w:rPr>
+          <w:rFonts w:ascii="Arial" w:hAnsi="Arial"/>
+          <w:sz w:val="32"/>
+          <w:szCs w:val="32"/>
+        </w:rPr>
+        <w:t xml:space="preserve"> </w:t>
+      </w:r>
+      <w:r>
+        <w:rPr>
+          <w:rFonts w:ascii="Arial" w:hAnsi="Arial"/>
+          <w:sz w:val="32"/>
+          <w:szCs w:val="32"/>
+        </w:rPr>
+        <w:t>2024</w:t>
+      </w:r>
+      <w:r>
+        <w:rPr>
+          <w:rFonts w:ascii="Arial" w:hAnsi="Arial"/>
+          <w:sz w:val="32"/>
+          <w:szCs w:val="32"/>
+        </w:rPr>
+        <w:t>.</w:t>
       </w:r>
     </w:p>
     <w:p>
@@ -497,7 +531,13 @@
         <w:rPr>
           <w:lang w:val="sv-SE"/>
         </w:rPr>
-        <w:t>Sveučilišni preddiplomski</w:t>
+        <w:t>Sveučilišni prije</w:t>
+      </w:r>
+      <w:r>
+        <w:rPr>
+          <w:lang w:val="sv-SE"/>
+        </w:rPr>
+        <w:t>diplomski</w:t>
       </w:r>
       <w:r>
         <w:rPr>
@@ -865,7 +905,23 @@
           <w:sz w:val="27"/>
           <w:szCs w:val="27"/>
         </w:rPr>
-        <w:t>Razviti desktop aplikaciju za holističko upravljanje hotelskim poslovanjem, koristeći tehnologije .NET, C# i Microsoft SQL Server. Implementirati ključne funkcionalnosti koje obuhvaćaju dinamičko dodavanje, izmjenu i prikaz rezervacija, praćenje check-in/check-out procesa, prikaz raspoloživosti soba te praćenje troškova i prihoda kroz vremenske periode. Projekt pruža priliku za stjecanje dubljeg razumijevanja rada s Microsoft SQL Server bazom podataka, implementaciju CRUD operacija, te osnaživanje vještina u okviru .NET i C#</w:t>
+        <w:t>Razviti desktop aplikaciju za holističko upravljanje hotelskim poslovanjem, koristeći tehnologije .NET, C# i Microsoft SQL Server. Implementirati ključne funkcionalnosti koje obuhvaćaju dinamičko dodavanje, izmjenu i prikaz rezervacija, praće</w:t>
+      </w:r>
+      <w:r>
+        <w:rPr>
+          <w:color w:val="000000"/>
+          <w:sz w:val="27"/>
+          <w:szCs w:val="27"/>
+        </w:rPr>
+        <w:t xml:space="preserve">nje check-in/check-out procesa te </w:t>
+      </w:r>
+      <w:r>
+        <w:rPr>
+          <w:color w:val="000000"/>
+          <w:sz w:val="27"/>
+          <w:szCs w:val="27"/>
+        </w:rPr>
+        <w:t>prikaz raspoloživosti soba. Projekt pruža priliku za stjecanje dubljeg razumijevanja rada s Microsoft SQL Server bazom podataka, implementaciju CRUD operacija, te osnaživanje vještina u okviru .NET i C#</w:t>
       </w:r>
       <w:r>
         <w:rPr>
@@ -950,7 +1006,7 @@
           <w:lang w:val="sv-SE"/>
         </w:rPr>
         <w:tab/>
-        <w:t>16.02.2024</w:t>
+        <w:t>dd.mm.yyyy</w:t>
       </w:r>
     </w:p>
     <w:p>
@@ -966,6 +1022,7 @@
     </w:p>
     <w:p>
       <w:pPr>
+        <w:shd w:val="clear" w:color="auto" w:fill="FFFFFF" w:themeFill="background1"/>
         <w:tabs>
           <w:tab w:val="left" w:pos="2268"/>
           <w:tab w:val="left" w:pos="2835"/>
@@ -989,25 +1046,10 @@
       </w:r>
       <w:r>
         <w:rPr>
-          <w:highlight w:val="yellow"/>
-          <w:shd w:val="clear" w:color="auto" w:fill="CCCCCC"/>
+          <w:shd w:val="clear" w:color="auto" w:fill="FFFFFF" w:themeFill="background1"/>
           <w:lang w:val="sv-SE"/>
         </w:rPr>
-        <w:t>dd.mm.yyyy</w:t>
-      </w:r>
-      <w:r>
-        <w:rPr>
-          <w:shd w:val="clear" w:color="auto" w:fill="CCCCCC"/>
-          <w:lang w:val="sv-SE"/>
-        </w:rPr>
-        <w:t>.</w:t>
-      </w:r>
-      <w:r>
-        <w:rPr>
-          <w:shd w:val="clear" w:color="auto" w:fill="CCCCCC"/>
-          <w:lang w:val="sv-SE"/>
-        </w:rPr>
-        <w:t xml:space="preserve"> (deset dana prije završetka semestra u kojem je rad prijavljen)</w:t>
+        <w:t>13.09.2024</w:t>
       </w:r>
     </w:p>
     <w:p>
@@ -1586,7 +1628,7 @@
         </w:rPr>
         <w:fldChar w:fldCharType="separate"/>
       </w:r>
-      <w:hyperlink w:anchor="_Toc176203448" w:history="1">
+      <w:hyperlink w:anchor="_Toc176299288" w:history="1">
         <w:r>
           <w:rPr>
             <w:rStyle w:val="Hyperlink"/>
@@ -1630,7 +1672,7 @@
             <w:noProof/>
             <w:webHidden/>
           </w:rPr>
-          <w:instrText xml:space="preserve"> PAGEREF _Toc176203448 \h </w:instrText>
+          <w:instrText xml:space="preserve"> PAGEREF _Toc176299288 \h </w:instrText>
         </w:r>
         <w:r>
           <w:rPr>
@@ -1672,7 +1714,7 @@
           <w:lang w:eastAsia="hr-HR"/>
         </w:rPr>
       </w:pPr>
-      <w:hyperlink w:anchor="_Toc176203449" w:history="1">
+      <w:hyperlink w:anchor="_Toc176299289" w:history="1">
         <w:r>
           <w:rPr>
             <w:rStyle w:val="Hyperlink"/>
@@ -1716,7 +1758,7 @@
             <w:noProof/>
             <w:webHidden/>
           </w:rPr>
-          <w:instrText xml:space="preserve"> PAGEREF _Toc176203449 \h </w:instrText>
+          <w:instrText xml:space="preserve"> PAGEREF _Toc176299289 \h </w:instrText>
         </w:r>
         <w:r>
           <w:rPr>
@@ -1758,7 +1800,7 @@
           <w:lang w:eastAsia="hr-HR"/>
         </w:rPr>
       </w:pPr>
-      <w:hyperlink w:anchor="_Toc176203450" w:history="1">
+      <w:hyperlink w:anchor="_Toc176299290" w:history="1">
         <w:r>
           <w:rPr>
             <w:rStyle w:val="Hyperlink"/>
@@ -1802,7 +1844,7 @@
             <w:noProof/>
             <w:webHidden/>
           </w:rPr>
-          <w:instrText xml:space="preserve"> PAGEREF _Toc176203450 \h </w:instrText>
+          <w:instrText xml:space="preserve"> PAGEREF _Toc176299290 \h </w:instrText>
         </w:r>
         <w:r>
           <w:rPr>
@@ -1844,7 +1886,7 @@
           <w:lang w:eastAsia="hr-HR"/>
         </w:rPr>
       </w:pPr>
-      <w:hyperlink w:anchor="_Toc176203451" w:history="1">
+      <w:hyperlink w:anchor="_Toc176299291" w:history="1">
         <w:r>
           <w:rPr>
             <w:rStyle w:val="Hyperlink"/>
@@ -1888,7 +1930,7 @@
             <w:noProof/>
             <w:webHidden/>
           </w:rPr>
-          <w:instrText xml:space="preserve"> PAGEREF _Toc176203451 \h </w:instrText>
+          <w:instrText xml:space="preserve"> PAGEREF _Toc176299291 \h </w:instrText>
         </w:r>
         <w:r>
           <w:rPr>
@@ -1930,7 +1972,7 @@
           <w:lang w:eastAsia="hr-HR"/>
         </w:rPr>
       </w:pPr>
-      <w:hyperlink w:anchor="_Toc176203452" w:history="1">
+      <w:hyperlink w:anchor="_Toc176299292" w:history="1">
         <w:r>
           <w:rPr>
             <w:rStyle w:val="Hyperlink"/>
@@ -1974,7 +2016,7 @@
             <w:noProof/>
             <w:webHidden/>
           </w:rPr>
-          <w:instrText xml:space="preserve"> PAGEREF _Toc176203452 \h </w:instrText>
+          <w:instrText xml:space="preserve"> PAGEREF _Toc176299292 \h </w:instrText>
         </w:r>
         <w:r>
           <w:rPr>
@@ -2016,7 +2058,7 @@
           <w:lang w:eastAsia="hr-HR"/>
         </w:rPr>
       </w:pPr>
-      <w:hyperlink w:anchor="_Toc176203453" w:history="1">
+      <w:hyperlink w:anchor="_Toc176299293" w:history="1">
         <w:r>
           <w:rPr>
             <w:rStyle w:val="Hyperlink"/>
@@ -2060,7 +2102,7 @@
             <w:noProof/>
             <w:webHidden/>
           </w:rPr>
-          <w:instrText xml:space="preserve"> PAGEREF _Toc176203453 \h </w:instrText>
+          <w:instrText xml:space="preserve"> PAGEREF _Toc176299293 \h </w:instrText>
         </w:r>
         <w:r>
           <w:rPr>
@@ -2102,7 +2144,7 @@
           <w:lang w:eastAsia="hr-HR"/>
         </w:rPr>
       </w:pPr>
-      <w:hyperlink w:anchor="_Toc176203454" w:history="1">
+      <w:hyperlink w:anchor="_Toc176299294" w:history="1">
         <w:r>
           <w:rPr>
             <w:rStyle w:val="Hyperlink"/>
@@ -2146,7 +2188,7 @@
             <w:noProof/>
             <w:webHidden/>
           </w:rPr>
-          <w:instrText xml:space="preserve"> PAGEREF _Toc176203454 \h </w:instrText>
+          <w:instrText xml:space="preserve"> PAGEREF _Toc176299294 \h </w:instrText>
         </w:r>
         <w:r>
           <w:rPr>
@@ -2188,7 +2230,7 @@
           <w:lang w:eastAsia="hr-HR"/>
         </w:rPr>
       </w:pPr>
-      <w:hyperlink w:anchor="_Toc176203455" w:history="1">
+      <w:hyperlink w:anchor="_Toc176299295" w:history="1">
         <w:r>
           <w:rPr>
             <w:rStyle w:val="Hyperlink"/>
@@ -2232,7 +2274,7 @@
             <w:noProof/>
             <w:webHidden/>
           </w:rPr>
-          <w:instrText xml:space="preserve"> PAGEREF _Toc176203455 \h </w:instrText>
+          <w:instrText xml:space="preserve"> PAGEREF _Toc176299295 \h </w:instrText>
         </w:r>
         <w:r>
           <w:rPr>
@@ -2274,7 +2316,7 @@
           <w:lang w:eastAsia="hr-HR"/>
         </w:rPr>
       </w:pPr>
-      <w:hyperlink w:anchor="_Toc176203456" w:history="1">
+      <w:hyperlink w:anchor="_Toc176299296" w:history="1">
         <w:r>
           <w:rPr>
             <w:rStyle w:val="Hyperlink"/>
@@ -2318,7 +2360,7 @@
             <w:noProof/>
             <w:webHidden/>
           </w:rPr>
-          <w:instrText xml:space="preserve"> PAGEREF _Toc176203456 \h </w:instrText>
+          <w:instrText xml:space="preserve"> PAGEREF _Toc176299296 \h </w:instrText>
         </w:r>
         <w:r>
           <w:rPr>
@@ -2360,7 +2402,7 @@
           <w:lang w:eastAsia="hr-HR"/>
         </w:rPr>
       </w:pPr>
-      <w:hyperlink w:anchor="_Toc176203457" w:history="1">
+      <w:hyperlink w:anchor="_Toc176299297" w:history="1">
         <w:r>
           <w:rPr>
             <w:rStyle w:val="Hyperlink"/>
@@ -2404,7 +2446,7 @@
             <w:noProof/>
             <w:webHidden/>
           </w:rPr>
-          <w:instrText xml:space="preserve"> PAGEREF _Toc176203457 \h </w:instrText>
+          <w:instrText xml:space="preserve"> PAGEREF _Toc176299297 \h </w:instrText>
         </w:r>
         <w:r>
           <w:rPr>
@@ -2446,7 +2488,7 @@
           <w:lang w:eastAsia="hr-HR"/>
         </w:rPr>
       </w:pPr>
-      <w:hyperlink w:anchor="_Toc176203458" w:history="1">
+      <w:hyperlink w:anchor="_Toc176299298" w:history="1">
         <w:r>
           <w:rPr>
             <w:rStyle w:val="Hyperlink"/>
@@ -2490,7 +2532,7 @@
             <w:noProof/>
             <w:webHidden/>
           </w:rPr>
-          <w:instrText xml:space="preserve"> PAGEREF _Toc176203458 \h </w:instrText>
+          <w:instrText xml:space="preserve"> PAGEREF _Toc176299298 \h </w:instrText>
         </w:r>
         <w:r>
           <w:rPr>
@@ -2532,7 +2574,7 @@
           <w:lang w:eastAsia="hr-HR"/>
         </w:rPr>
       </w:pPr>
-      <w:hyperlink w:anchor="_Toc176203459" w:history="1">
+      <w:hyperlink w:anchor="_Toc176299299" w:history="1">
         <w:r>
           <w:rPr>
             <w:rStyle w:val="Hyperlink"/>
@@ -2576,7 +2618,7 @@
             <w:noProof/>
             <w:webHidden/>
           </w:rPr>
-          <w:instrText xml:space="preserve"> PAGEREF _Toc176203459 \h </w:instrText>
+          <w:instrText xml:space="preserve"> PAGEREF _Toc176299299 \h </w:instrText>
         </w:r>
         <w:r>
           <w:rPr>
@@ -2618,7 +2660,7 @@
           <w:lang w:eastAsia="hr-HR"/>
         </w:rPr>
       </w:pPr>
-      <w:hyperlink w:anchor="_Toc176203460" w:history="1">
+      <w:hyperlink w:anchor="_Toc176299300" w:history="1">
         <w:r>
           <w:rPr>
             <w:rStyle w:val="Hyperlink"/>
@@ -2662,7 +2704,7 @@
             <w:noProof/>
             <w:webHidden/>
           </w:rPr>
-          <w:instrText xml:space="preserve"> PAGEREF _Toc176203460 \h </w:instrText>
+          <w:instrText xml:space="preserve"> PAGEREF _Toc176299300 \h </w:instrText>
         </w:r>
         <w:r>
           <w:rPr>
@@ -2704,7 +2746,7 @@
           <w:lang w:eastAsia="hr-HR"/>
         </w:rPr>
       </w:pPr>
-      <w:hyperlink w:anchor="_Toc176203461" w:history="1">
+      <w:hyperlink w:anchor="_Toc176299301" w:history="1">
         <w:r>
           <w:rPr>
             <w:rStyle w:val="Hyperlink"/>
@@ -2756,7 +2798,7 @@
             <w:noProof/>
             <w:webHidden/>
           </w:rPr>
-          <w:instrText xml:space="preserve"> PAGEREF _Toc176203461 \h </w:instrText>
+          <w:instrText xml:space="preserve"> PAGEREF _Toc176299301 \h </w:instrText>
         </w:r>
         <w:r>
           <w:rPr>
@@ -2798,7 +2840,7 @@
           <w:lang w:eastAsia="hr-HR"/>
         </w:rPr>
       </w:pPr>
-      <w:hyperlink w:anchor="_Toc176203462" w:history="1">
+      <w:hyperlink w:anchor="_Toc176299302" w:history="1">
         <w:r>
           <w:rPr>
             <w:rStyle w:val="Hyperlink"/>
@@ -2850,7 +2892,7 @@
             <w:noProof/>
             <w:webHidden/>
           </w:rPr>
-          <w:instrText xml:space="preserve"> PAGEREF _Toc176203462 \h </w:instrText>
+          <w:instrText xml:space="preserve"> PAGEREF _Toc176299302 \h </w:instrText>
         </w:r>
         <w:r>
           <w:rPr>
@@ -2892,7 +2934,7 @@
           <w:lang w:eastAsia="hr-HR"/>
         </w:rPr>
       </w:pPr>
-      <w:hyperlink w:anchor="_Toc176203463" w:history="1">
+      <w:hyperlink w:anchor="_Toc176299303" w:history="1">
         <w:r>
           <w:rPr>
             <w:rStyle w:val="Hyperlink"/>
@@ -2936,7 +2978,7 @@
             <w:noProof/>
             <w:webHidden/>
           </w:rPr>
-          <w:instrText xml:space="preserve"> PAGEREF _Toc176203463 \h </w:instrText>
+          <w:instrText xml:space="preserve"> PAGEREF _Toc176299303 \h </w:instrText>
         </w:r>
         <w:r>
           <w:rPr>
@@ -2978,7 +3020,7 @@
           <w:lang w:eastAsia="hr-HR"/>
         </w:rPr>
       </w:pPr>
-      <w:hyperlink w:anchor="_Toc176203464" w:history="1">
+      <w:hyperlink w:anchor="_Toc176299304" w:history="1">
         <w:r>
           <w:rPr>
             <w:rStyle w:val="Hyperlink"/>
@@ -3022,7 +3064,7 @@
             <w:noProof/>
             <w:webHidden/>
           </w:rPr>
-          <w:instrText xml:space="preserve"> PAGEREF _Toc176203464 \h </w:instrText>
+          <w:instrText xml:space="preserve"> PAGEREF _Toc176299304 \h </w:instrText>
         </w:r>
         <w:r>
           <w:rPr>
@@ -3064,7 +3106,7 @@
           <w:lang w:eastAsia="hr-HR"/>
         </w:rPr>
       </w:pPr>
-      <w:hyperlink w:anchor="_Toc176203465" w:history="1">
+      <w:hyperlink w:anchor="_Toc176299305" w:history="1">
         <w:r>
           <w:rPr>
             <w:rStyle w:val="Hyperlink"/>
@@ -3108,7 +3150,7 @@
             <w:noProof/>
             <w:webHidden/>
           </w:rPr>
-          <w:instrText xml:space="preserve"> PAGEREF _Toc176203465 \h </w:instrText>
+          <w:instrText xml:space="preserve"> PAGEREF _Toc176299305 \h </w:instrText>
         </w:r>
         <w:r>
           <w:rPr>
@@ -3150,7 +3192,7 @@
           <w:lang w:eastAsia="hr-HR"/>
         </w:rPr>
       </w:pPr>
-      <w:hyperlink w:anchor="_Toc176203466" w:history="1">
+      <w:hyperlink w:anchor="_Toc176299306" w:history="1">
         <w:r>
           <w:rPr>
             <w:rStyle w:val="Hyperlink"/>
@@ -3194,7 +3236,7 @@
             <w:noProof/>
             <w:webHidden/>
           </w:rPr>
-          <w:instrText xml:space="preserve"> PAGEREF _Toc176203466 \h </w:instrText>
+          <w:instrText xml:space="preserve"> PAGEREF _Toc176299306 \h </w:instrText>
         </w:r>
         <w:r>
           <w:rPr>
@@ -3236,7 +3278,7 @@
           <w:lang w:eastAsia="hr-HR"/>
         </w:rPr>
       </w:pPr>
-      <w:hyperlink w:anchor="_Toc176203467" w:history="1">
+      <w:hyperlink w:anchor="_Toc176299307" w:history="1">
         <w:r>
           <w:rPr>
             <w:rStyle w:val="Hyperlink"/>
@@ -3280,7 +3322,7 @@
             <w:noProof/>
             <w:webHidden/>
           </w:rPr>
-          <w:instrText xml:space="preserve"> PAGEREF _Toc176203467 \h </w:instrText>
+          <w:instrText xml:space="preserve"> PAGEREF _Toc176299307 \h </w:instrText>
         </w:r>
         <w:r>
           <w:rPr>
@@ -3322,7 +3364,7 @@
           <w:lang w:eastAsia="hr-HR"/>
         </w:rPr>
       </w:pPr>
-      <w:hyperlink w:anchor="_Toc176203468" w:history="1">
+      <w:hyperlink w:anchor="_Toc176299308" w:history="1">
         <w:r>
           <w:rPr>
             <w:rStyle w:val="Hyperlink"/>
@@ -3366,7 +3408,7 @@
             <w:noProof/>
             <w:webHidden/>
           </w:rPr>
-          <w:instrText xml:space="preserve"> PAGEREF _Toc176203468 \h </w:instrText>
+          <w:instrText xml:space="preserve"> PAGEREF _Toc176299308 \h </w:instrText>
         </w:r>
         <w:r>
           <w:rPr>
@@ -3408,7 +3450,7 @@
           <w:lang w:eastAsia="hr-HR"/>
         </w:rPr>
       </w:pPr>
-      <w:hyperlink w:anchor="_Toc176203469" w:history="1">
+      <w:hyperlink w:anchor="_Toc176299309" w:history="1">
         <w:r>
           <w:rPr>
             <w:rStyle w:val="Hyperlink"/>
@@ -3452,7 +3494,7 @@
             <w:noProof/>
             <w:webHidden/>
           </w:rPr>
-          <w:instrText xml:space="preserve"> PAGEREF _Toc176203469 \h </w:instrText>
+          <w:instrText xml:space="preserve"> PAGEREF _Toc176299309 \h </w:instrText>
         </w:r>
         <w:r>
           <w:rPr>
@@ -3494,7 +3536,7 @@
           <w:lang w:eastAsia="hr-HR"/>
         </w:rPr>
       </w:pPr>
-      <w:hyperlink w:anchor="_Toc176203470" w:history="1">
+      <w:hyperlink w:anchor="_Toc176299310" w:history="1">
         <w:r>
           <w:rPr>
             <w:rStyle w:val="Hyperlink"/>
@@ -3538,7 +3580,7 @@
             <w:noProof/>
             <w:webHidden/>
           </w:rPr>
-          <w:instrText xml:space="preserve"> PAGEREF _Toc176203470 \h </w:instrText>
+          <w:instrText xml:space="preserve"> PAGEREF _Toc176299310 \h </w:instrText>
         </w:r>
         <w:r>
           <w:rPr>
@@ -3580,7 +3622,7 @@
           <w:lang w:eastAsia="hr-HR"/>
         </w:rPr>
       </w:pPr>
-      <w:hyperlink w:anchor="_Toc176203471" w:history="1">
+      <w:hyperlink w:anchor="_Toc176299311" w:history="1">
         <w:r>
           <w:rPr>
             <w:rStyle w:val="Hyperlink"/>
@@ -3624,7 +3666,7 @@
             <w:noProof/>
             <w:webHidden/>
           </w:rPr>
-          <w:instrText xml:space="preserve"> PAGEREF _Toc176203471 \h </w:instrText>
+          <w:instrText xml:space="preserve"> PAGEREF _Toc176299311 \h </w:instrText>
         </w:r>
         <w:r>
           <w:rPr>
@@ -3666,7 +3708,7 @@
           <w:lang w:eastAsia="hr-HR"/>
         </w:rPr>
       </w:pPr>
-      <w:hyperlink w:anchor="_Toc176203472" w:history="1">
+      <w:hyperlink w:anchor="_Toc176299312" w:history="1">
         <w:r>
           <w:rPr>
             <w:rStyle w:val="Hyperlink"/>
@@ -3710,7 +3752,7 @@
             <w:noProof/>
             <w:webHidden/>
           </w:rPr>
-          <w:instrText xml:space="preserve"> PAGEREF _Toc176203472 \h </w:instrText>
+          <w:instrText xml:space="preserve"> PAGEREF _Toc176299312 \h </w:instrText>
         </w:r>
         <w:r>
           <w:rPr>
@@ -3730,7 +3772,7 @@
             <w:noProof/>
             <w:webHidden/>
           </w:rPr>
-          <w:t>32</w:t>
+          <w:t>34</w:t>
         </w:r>
         <w:r>
           <w:rPr>
@@ -3752,7 +3794,7 @@
           <w:lang w:eastAsia="hr-HR"/>
         </w:rPr>
       </w:pPr>
-      <w:hyperlink w:anchor="_Toc176203473" w:history="1">
+      <w:hyperlink w:anchor="_Toc176299313" w:history="1">
         <w:r>
           <w:rPr>
             <w:rStyle w:val="Hyperlink"/>
@@ -3796,7 +3838,7 @@
             <w:noProof/>
             <w:webHidden/>
           </w:rPr>
-          <w:instrText xml:space="preserve"> PAGEREF _Toc176203473 \h </w:instrText>
+          <w:instrText xml:space="preserve"> PAGEREF _Toc176299313 \h </w:instrText>
         </w:r>
         <w:r>
           <w:rPr>
@@ -3816,7 +3858,7 @@
             <w:noProof/>
             <w:webHidden/>
           </w:rPr>
-          <w:t>33</w:t>
+          <w:t>36</w:t>
         </w:r>
         <w:r>
           <w:rPr>
@@ -3838,7 +3880,7 @@
           <w:lang w:eastAsia="hr-HR"/>
         </w:rPr>
       </w:pPr>
-      <w:hyperlink w:anchor="_Toc176203474" w:history="1">
+      <w:hyperlink w:anchor="_Toc176299314" w:history="1">
         <w:r>
           <w:rPr>
             <w:rStyle w:val="Hyperlink"/>
@@ -3865,7 +3907,7 @@
             <w:noProof/>
             <w:webHidden/>
           </w:rPr>
-          <w:instrText xml:space="preserve"> PAGEREF _Toc176203474 \h </w:instrText>
+          <w:instrText xml:space="preserve"> PAGEREF _Toc176299314 \h </w:instrText>
         </w:r>
         <w:r>
           <w:rPr>
@@ -3885,7 +3927,7 @@
             <w:noProof/>
             <w:webHidden/>
           </w:rPr>
-          <w:t>34</w:t>
+          <w:t>37</w:t>
         </w:r>
         <w:r>
           <w:rPr>
@@ -3907,7 +3949,7 @@
           <w:lang w:eastAsia="hr-HR"/>
         </w:rPr>
       </w:pPr>
-      <w:hyperlink w:anchor="_Toc176203475" w:history="1">
+      <w:hyperlink w:anchor="_Toc176299315" w:history="1">
         <w:r>
           <w:rPr>
             <w:rStyle w:val="Hyperlink"/>
@@ -3934,7 +3976,7 @@
             <w:noProof/>
             <w:webHidden/>
           </w:rPr>
-          <w:instrText xml:space="preserve"> PAGEREF _Toc176203475 \h </w:instrText>
+          <w:instrText xml:space="preserve"> PAGEREF _Toc176299315 \h </w:instrText>
         </w:r>
         <w:r>
           <w:rPr>
@@ -3954,7 +3996,7 @@
             <w:noProof/>
             <w:webHidden/>
           </w:rPr>
-          <w:t>35</w:t>
+          <w:t>38</w:t>
         </w:r>
         <w:r>
           <w:rPr>
@@ -3976,7 +4018,7 @@
           <w:lang w:eastAsia="hr-HR"/>
         </w:rPr>
       </w:pPr>
-      <w:hyperlink w:anchor="_Toc176203476" w:history="1">
+      <w:hyperlink w:anchor="_Toc176299316" w:history="1">
         <w:r>
           <w:rPr>
             <w:rStyle w:val="Hyperlink"/>
@@ -4003,7 +4045,7 @@
             <w:noProof/>
             <w:webHidden/>
           </w:rPr>
-          <w:instrText xml:space="preserve"> PAGEREF _Toc176203476 \h </w:instrText>
+          <w:instrText xml:space="preserve"> PAGEREF _Toc176299316 \h </w:instrText>
         </w:r>
         <w:r>
           <w:rPr>
@@ -4023,7 +4065,7 @@
             <w:noProof/>
             <w:webHidden/>
           </w:rPr>
-          <w:t>35</w:t>
+          <w:t>38</w:t>
         </w:r>
         <w:r>
           <w:rPr>
@@ -4045,7 +4087,7 @@
           <w:lang w:eastAsia="hr-HR"/>
         </w:rPr>
       </w:pPr>
-      <w:hyperlink w:anchor="_Toc176203477" w:history="1">
+      <w:hyperlink w:anchor="_Toc176299317" w:history="1">
         <w:r>
           <w:rPr>
             <w:rStyle w:val="Hyperlink"/>
@@ -4072,7 +4114,7 @@
             <w:noProof/>
             <w:webHidden/>
           </w:rPr>
-          <w:instrText xml:space="preserve"> PAGEREF _Toc176203477 \h </w:instrText>
+          <w:instrText xml:space="preserve"> PAGEREF _Toc176299317 \h </w:instrText>
         </w:r>
         <w:r>
           <w:rPr>
@@ -4092,7 +4134,7 @@
             <w:noProof/>
             <w:webHidden/>
           </w:rPr>
-          <w:t>35</w:t>
+          <w:t>38</w:t>
         </w:r>
         <w:r>
           <w:rPr>
@@ -4114,7 +4156,7 @@
           <w:lang w:eastAsia="hr-HR"/>
         </w:rPr>
       </w:pPr>
-      <w:hyperlink w:anchor="_Toc176203478" w:history="1">
+      <w:hyperlink w:anchor="_Toc176299318" w:history="1">
         <w:r>
           <w:rPr>
             <w:rStyle w:val="Hyperlink"/>
@@ -4141,7 +4183,7 @@
             <w:noProof/>
             <w:webHidden/>
           </w:rPr>
-          <w:instrText xml:space="preserve"> PAGEREF _Toc176203478 \h </w:instrText>
+          <w:instrText xml:space="preserve"> PAGEREF _Toc176299318 \h </w:instrText>
         </w:r>
         <w:r>
           <w:rPr>
@@ -4161,7 +4203,7 @@
             <w:noProof/>
             <w:webHidden/>
           </w:rPr>
-          <w:t>35</w:t>
+          <w:t>38</w:t>
         </w:r>
         <w:r>
           <w:rPr>
@@ -4183,7 +4225,7 @@
           <w:lang w:eastAsia="hr-HR"/>
         </w:rPr>
       </w:pPr>
-      <w:hyperlink w:anchor="_Toc176203479" w:history="1">
+      <w:hyperlink w:anchor="_Toc176299319" w:history="1">
         <w:r>
           <w:rPr>
             <w:rStyle w:val="Hyperlink"/>
@@ -4210,7 +4252,7 @@
             <w:noProof/>
             <w:webHidden/>
           </w:rPr>
-          <w:instrText xml:space="preserve"> PAGEREF _Toc176203479 \h </w:instrText>
+          <w:instrText xml:space="preserve"> PAGEREF _Toc176299319 \h </w:instrText>
         </w:r>
         <w:r>
           <w:rPr>
@@ -4230,7 +4272,7 @@
             <w:noProof/>
             <w:webHidden/>
           </w:rPr>
-          <w:t>35</w:t>
+          <w:t>38</w:t>
         </w:r>
         <w:r>
           <w:rPr>
@@ -4252,7 +4294,7 @@
           <w:lang w:eastAsia="hr-HR"/>
         </w:rPr>
       </w:pPr>
-      <w:hyperlink w:anchor="_Toc176203480" w:history="1">
+      <w:hyperlink w:anchor="_Toc176299320" w:history="1">
         <w:r>
           <w:rPr>
             <w:rStyle w:val="Hyperlink"/>
@@ -4279,7 +4321,7 @@
             <w:noProof/>
             <w:webHidden/>
           </w:rPr>
-          <w:instrText xml:space="preserve"> PAGEREF _Toc176203480 \h </w:instrText>
+          <w:instrText xml:space="preserve"> PAGEREF _Toc176299320 \h </w:instrText>
         </w:r>
         <w:r>
           <w:rPr>
@@ -4299,7 +4341,7 @@
             <w:noProof/>
             <w:webHidden/>
           </w:rPr>
-          <w:t>35</w:t>
+          <w:t>39</w:t>
         </w:r>
         <w:r>
           <w:rPr>
@@ -4321,7 +4363,7 @@
           <w:lang w:eastAsia="hr-HR"/>
         </w:rPr>
       </w:pPr>
-      <w:hyperlink w:anchor="_Toc176203481" w:history="1">
+      <w:hyperlink w:anchor="_Toc176299321" w:history="1">
         <w:r>
           <w:rPr>
             <w:rStyle w:val="Hyperlink"/>
@@ -4348,7 +4390,7 @@
             <w:noProof/>
             <w:webHidden/>
           </w:rPr>
-          <w:instrText xml:space="preserve"> PAGEREF _Toc176203481 \h </w:instrText>
+          <w:instrText xml:space="preserve"> PAGEREF _Toc176299321 \h </w:instrText>
         </w:r>
         <w:r>
           <w:rPr>
@@ -4368,7 +4410,7 @@
             <w:noProof/>
             <w:webHidden/>
           </w:rPr>
-          <w:t>36</w:t>
+          <w:t>39</w:t>
         </w:r>
         <w:r>
           <w:rPr>
@@ -4390,7 +4432,7 @@
           <w:lang w:eastAsia="hr-HR"/>
         </w:rPr>
       </w:pPr>
-      <w:hyperlink w:anchor="_Toc176203482" w:history="1">
+      <w:hyperlink w:anchor="_Toc176299322" w:history="1">
         <w:r>
           <w:rPr>
             <w:rStyle w:val="Hyperlink"/>
@@ -4417,7 +4459,7 @@
             <w:noProof/>
             <w:webHidden/>
           </w:rPr>
-          <w:instrText xml:space="preserve"> PAGEREF _Toc176203482 \h </w:instrText>
+          <w:instrText xml:space="preserve"> PAGEREF _Toc176299322 \h </w:instrText>
         </w:r>
         <w:r>
           <w:rPr>
@@ -4437,7 +4479,7 @@
             <w:noProof/>
             <w:webHidden/>
           </w:rPr>
-          <w:t>36</w:t>
+          <w:t>39</w:t>
         </w:r>
         <w:r>
           <w:rPr>
@@ -4459,7 +4501,7 @@
           <w:lang w:eastAsia="hr-HR"/>
         </w:rPr>
       </w:pPr>
-      <w:hyperlink w:anchor="_Toc176203483" w:history="1">
+      <w:hyperlink w:anchor="_Toc176299323" w:history="1">
         <w:r>
           <w:rPr>
             <w:rStyle w:val="Hyperlink"/>
@@ -4486,7 +4528,7 @@
             <w:noProof/>
             <w:webHidden/>
           </w:rPr>
-          <w:instrText xml:space="preserve"> PAGEREF _Toc176203483 \h </w:instrText>
+          <w:instrText xml:space="preserve"> PAGEREF _Toc176299323 \h </w:instrText>
         </w:r>
         <w:r>
           <w:rPr>
@@ -4506,7 +4548,7 @@
             <w:noProof/>
             <w:webHidden/>
           </w:rPr>
-          <w:t>36</w:t>
+          <w:t>39</w:t>
         </w:r>
         <w:r>
           <w:rPr>
@@ -4528,7 +4570,7 @@
           <w:lang w:eastAsia="hr-HR"/>
         </w:rPr>
       </w:pPr>
-      <w:hyperlink w:anchor="_Toc176203484" w:history="1">
+      <w:hyperlink w:anchor="_Toc176299324" w:history="1">
         <w:r>
           <w:rPr>
             <w:rStyle w:val="Hyperlink"/>
@@ -4555,7 +4597,7 @@
             <w:noProof/>
             <w:webHidden/>
           </w:rPr>
-          <w:instrText xml:space="preserve"> PAGEREF _Toc176203484 \h </w:instrText>
+          <w:instrText xml:space="preserve"> PAGEREF _Toc176299324 \h </w:instrText>
         </w:r>
         <w:r>
           <w:rPr>
@@ -4575,7 +4617,7 @@
             <w:noProof/>
             <w:webHidden/>
           </w:rPr>
-          <w:t>40</w:t>
+          <w:t>43</w:t>
         </w:r>
         <w:r>
           <w:rPr>
@@ -4606,7 +4648,7 @@
       <w:pPr>
         <w:pStyle w:val="Heading1"/>
       </w:pPr>
-      <w:bookmarkStart w:id="0" w:name="_Toc176203448"/>
+      <w:bookmarkStart w:id="0" w:name="_Toc176299288"/>
       <w:r>
         <w:lastRenderedPageBreak/>
         <w:t>UVOD</w:t>
@@ -4621,28 +4663,40 @@
         <w:ind w:firstLine="432"/>
       </w:pPr>
       <w:r>
-        <w:t xml:space="preserve">Hotelska industrija suočava se s brojnim izazovima u svakodnevnom poslovanju, uključujući upravljanje rezervacijama, evidenciju gostiju i praćenje raspoloživosti soba. S obzirom na </w:t>
-      </w:r>
-      <w:r>
-        <w:t>brz</w:t>
-      </w:r>
-      <w:r>
-        <w:t xml:space="preserve"> razvoj tehnologije i </w:t>
-      </w:r>
-      <w:r>
-        <w:t>rasteće</w:t>
-      </w:r>
-      <w:r>
-        <w:t xml:space="preserve"> online platforme poput Booking.com i Airbnb, od hotelskih </w:t>
-      </w:r>
-      <w:r>
-        <w:t>sustava</w:t>
-      </w:r>
-      <w:r>
-        <w:t xml:space="preserve"> se očekuje visoka razina preciznosti i prilagodljivosti. Moderni hoteli moraju se uskladiti s tim platformama, kako bi se učinkovito natjecali na tržištu i zadovoljili sve zahtjeve gostiju.</w:t>
-      </w:r>
-      <w:r>
-        <w:t xml:space="preserve"> </w:t>
+        <w:t xml:space="preserve">Hotelska industrija danas se suočava s brojnim izazovima, uključujući brz razvoj tehnologije i rast </w:t>
+      </w:r>
+      <w:r>
+        <w:rPr>
+          <w:i/>
+        </w:rPr>
+        <w:t>online</w:t>
+      </w:r>
+      <w:r>
+        <w:t xml:space="preserve"> platformi pop</w:t>
+      </w:r>
+      <w:r>
+        <w:t xml:space="preserve">ut Booking.com i Airbnb, koje su postale </w:t>
+      </w:r>
+      <w:r>
+        <w:t>glavni</w:t>
+      </w:r>
+      <w:r>
+        <w:t xml:space="preserve"> sustavi za rezervacije i komunikaciju sa gostima.</w:t>
+      </w:r>
+      <w:r>
+        <w:t xml:space="preserve"> Stoga se od hotelskih sustava očekuje visoka </w:t>
+      </w:r>
+      <w:r>
+        <w:t>preciznost i prilagodljivost</w:t>
+      </w:r>
+      <w:r>
+        <w:t xml:space="preserve"> kako bi se zadržala konkurentnost na tržištu. Suvremeni hoteli moraju se prilagoditi ovim platformama te optimizirati s</w:t>
+      </w:r>
+      <w:r>
+        <w:t xml:space="preserve">voje operacije i usluge kako bi </w:t>
+      </w:r>
+      <w:r>
+        <w:t>ispunili zahtjeve i očekivanja gostiju te ostali konkurentni na tržištu.</w:t>
       </w:r>
     </w:p>
     <w:p>
@@ -4653,16 +4707,25 @@
         <w:ind w:firstLine="432"/>
       </w:pPr>
       <w:r>
-        <w:t>Neki</w:t>
-      </w:r>
-      <w:r>
-        <w:t xml:space="preserve"> od ključnih </w:t>
-      </w:r>
-      <w:r>
-        <w:t>izazova</w:t>
-      </w:r>
-      <w:r>
-        <w:t xml:space="preserve"> s kojima se hoteli suočavaju je potreba za preciznim praćenjem rezervacija, prijava i odjava gostiju, te upravljanjem operativnim troškovima i logistikom. Nedostatak točnosti u ovim procesima može dovesti do nezadovoljstva gostiju, smanjenja ugleda hotela i čak financijskih gubitaka. Stoga je važno razviti učinkovita softverska rješenja koja omogućuju uspješno upravljanje svim tim zadacima.</w:t>
+        <w:t>Digitalna transformacija donosi nove prilike, ali i izazove, uključujući potrebu za precizni</w:t>
+      </w:r>
+      <w:r>
+        <w:t>m praćenjem rezervacija, prijave</w:t>
+      </w:r>
+      <w:r>
+        <w:t xml:space="preserve"> i odjav</w:t>
+      </w:r>
+      <w:r>
+        <w:t>e</w:t>
+      </w:r>
+      <w:r>
+        <w:t xml:space="preserve"> gostiju, te upravljanjem operativnim troškovima i logistikom.</w:t>
+      </w:r>
+      <w:r>
+        <w:t xml:space="preserve"> </w:t>
+      </w:r>
+      <w:r>
+        <w:t>Nedostatak preciznosti u ovim procesima može rezultirati nezadovoljstvom gostiju, narušavanjem ugleda hotela i potencijalnim financijskim gubicima.  Zbog toga je vrlo bitno razviti softverska rješenja koja omogućuju učinkovito upravljanje svim ovim zadacima.</w:t>
       </w:r>
     </w:p>
     <w:p>
@@ -4673,10 +4736,63 @@
         <w:ind w:firstLine="432"/>
       </w:pPr>
       <w:r>
-        <w:t>Cilj ovog rada bio je razviti desktop aplikaciju koja će pomoći hotelskom osoblju u obavljanju svakodnevnih zadataka. Aplikacija je dizajnirana da bude jednostavna za korištenje, čak i za korisnike s osnov</w:t>
-      </w:r>
-      <w:r>
-        <w:t>nim računalnim vještinama.</w:t>
+        <w:t>Ovaj rad je usmjeren na razvoj</w:t>
+      </w:r>
+      <w:r>
+        <w:t xml:space="preserve"> </w:t>
+      </w:r>
+      <w:r>
+        <w:rPr>
+          <w:i/>
+        </w:rPr>
+        <w:t>desktop</w:t>
+      </w:r>
+      <w:r>
+        <w:t xml:space="preserve"> aplikaciju koja će hotelskom osoblju</w:t>
+      </w:r>
+      <w:r>
+        <w:t xml:space="preserve"> </w:t>
+      </w:r>
+      <w:r>
+        <w:t>pomoći</w:t>
+      </w:r>
+      <w:r>
+        <w:t xml:space="preserve"> u obavljanju svakodnevnih zadataka</w:t>
+      </w:r>
+      <w:r>
+        <w:t>, poput upravljanja rezervacijama,vođenja evidencije gostiju i praćenja prihoda i rashoda</w:t>
+      </w:r>
+      <w:r>
+        <w:t xml:space="preserve">. </w:t>
+      </w:r>
+      <w:r>
+        <w:t>Aplikacija omogućuje jednostavno spremanje podataka i praćenje hotelskih operacija, doprinoseći digitalizaciji poslovanja. Iako postoji širok spektar funkcionalnosti koje bi se mogle implementirati, fokus je stavljen na glavne značajke koje su klj</w:t>
+      </w:r>
+      <w:r>
+        <w:t>učne za učinkovit rad hotela. Sučelje je dizajnirano da bude jednostavno</w:t>
+      </w:r>
+      <w:r>
+        <w:t xml:space="preserve"> za korištenje, čak i za </w:t>
+      </w:r>
+      <w:r>
+        <w:t>korisnike s</w:t>
+      </w:r>
+      <w:r>
+        <w:t xml:space="preserve"> osnovnim znanjima o računalima.</w:t>
+      </w:r>
+    </w:p>
+    <w:p>
+      <w:pPr>
+        <w:ind w:firstLine="432"/>
+      </w:pPr>
+      <w:r>
+        <w:t xml:space="preserve">Ostatak rada strukturiran je </w:t>
+      </w:r>
+      <w:r>
+        <w:t>na sljedeći način</w:t>
+      </w:r>
+      <w:r>
+        <w:t>: Poglavlje 2 pruža detaljan opis glavnih funkcionalnosti aplikacije, dok Poglavlje 3 razmatra funkcionalne zahtjeve sustava. Poglavlje 4 fokusira se na dizajn sustava, a Poglavlje 5 detaljno opisuje implementaciju aplikacije i korištene tehnologije. Na kraju, u Poglavlju 6 nalaze se zaključci i smjernice za budući razvoj aplikacije.</w:t>
       </w:r>
     </w:p>
     <w:p>
@@ -4686,92 +4802,12 @@
         </w:tabs>
         <w:ind w:firstLine="432"/>
       </w:pPr>
-      <w:r>
-        <w:t>U ovom radu, za učinkovito upravljanje bazom podataka</w:t>
-      </w:r>
-      <w:r>
-        <w:t xml:space="preserve"> se koristi </w:t>
-      </w:r>
-      <w:r>
-        <w:rPr>
-          <w:i/>
-        </w:rPr>
-        <w:t>Microsoft SQL Server</w:t>
-      </w:r>
-      <w:r>
-        <w:t xml:space="preserve">, dok se za izradu korisničkog sučelja koriste </w:t>
-      </w:r>
-      <w:r>
-        <w:rPr>
-          <w:i/>
-        </w:rPr>
-        <w:t>Windows Forme</w:t>
-      </w:r>
-      <w:r>
-        <w:t xml:space="preserve"> unutar </w:t>
-      </w:r>
-      <w:r>
-        <w:rPr>
-          <w:i/>
-        </w:rPr>
-        <w:t>.NET okvira</w:t>
-      </w:r>
-      <w:r>
-        <w:t xml:space="preserve">. Iako </w:t>
-      </w:r>
-      <w:r>
-        <w:rPr>
-          <w:i/>
-        </w:rPr>
-        <w:t>Windows Forme</w:t>
-      </w:r>
-      <w:r>
-        <w:t xml:space="preserve"> predstavljaju najjednostavniji način za izradu korisničkih sučelja, ovd</w:t>
-      </w:r>
-      <w:r>
-        <w:t>je sam</w:t>
-      </w:r>
-      <w:r>
-        <w:t xml:space="preserve"> se </w:t>
-      </w:r>
-      <w:r>
-        <w:t>fokusirala</w:t>
-      </w:r>
-      <w:r>
-        <w:t xml:space="preserve"> na preciznu manipulaciju podacima i optimizaciju funkcionalnosti aplikacije, a ne na kompleksnost dizajna sučelja.</w:t>
-      </w:r>
-    </w:p>
-    <w:p>
-      <w:pPr>
-        <w:tabs>
-          <w:tab w:val="left" w:pos="3261"/>
-        </w:tabs>
-        <w:ind w:firstLine="432"/>
-      </w:pPr>
-      <w:r>
-        <w:t xml:space="preserve">Ostatak rada organiziran je na sljedeći način: Poglavlje 2 </w:t>
-      </w:r>
-      <w:r>
-        <w:t>pruža uvod u desktop aplikacije,</w:t>
-      </w:r>
-      <w:r>
-        <w:t xml:space="preserve"> Poglavlje 3 opisuje </w:t>
-      </w:r>
-      <w:r>
-        <w:t>tehnolologije koje su korištene tijekom razvoja aplikacije,</w:t>
-      </w:r>
-      <w:r>
-        <w:t xml:space="preserve"> Poglavlje 4 detaljno objašnjava implementaciju aplikacije i testiranje njenih funkcionalnosti. Na kraju, Poglavlje 5 donosi zaključke i razmatra mogućnosti za buduće prošir</w:t>
-      </w:r>
-      <w:r>
-        <w:t>enje funkcionalnosti aplikacije.</w:t>
-      </w:r>
     </w:p>
     <w:p>
       <w:pPr>
         <w:pStyle w:val="Heading1"/>
       </w:pPr>
-      <w:bookmarkStart w:id="1" w:name="_Toc176203449"/>
+      <w:bookmarkStart w:id="1" w:name="_Toc176299289"/>
       <w:r>
         <w:lastRenderedPageBreak/>
         <w:t>OPIS APLIKACIJE</w:t>
@@ -4782,7 +4818,7 @@
       <w:pPr>
         <w:pStyle w:val="Heading2"/>
       </w:pPr>
-      <w:bookmarkStart w:id="2" w:name="_Toc176203450"/>
+      <w:bookmarkStart w:id="2" w:name="_Toc176299290"/>
       <w:r>
         <w:t>Osnovne funkcionalnosti aplikacije</w:t>
       </w:r>
@@ -4796,10 +4832,22 @@
         <w:t>Iako hoteli svakodnevno dodaju razne dodatke i usluge kako bi unaprijedili iskustvo svojih gostiju, osnovni elementi hotelskog poslovanja ostaju nepromijenj</w:t>
       </w:r>
       <w:r>
-        <w:t>eni: gost, soba i rezervacija. Opisana a</w:t>
-      </w:r>
-      <w:r>
-        <w:t>plikacija za upravljanje hotelom fokusira se na ove ključne aspekte, dok istovremeno uključuje dodatne funkcionalnosti koje poboljšavaju udobnost boravka</w:t>
+        <w:t>eni: gos</w:t>
+      </w:r>
+      <w:r>
+        <w:t>t, soba i rezervacija. A</w:t>
+      </w:r>
+      <w:r>
+        <w:t>plikacija za upravljanje hotelskim poslovanjem</w:t>
+      </w:r>
+      <w:r>
+        <w:t xml:space="preserve"> fokusira se na ove ključne </w:t>
+      </w:r>
+      <w:r>
+        <w:t>elemente</w:t>
+      </w:r>
+      <w:r>
+        <w:t>, dok istovremeno uključuje dodatne funkcionalnosti koje poboljšavaju udobnost boravka</w:t>
       </w:r>
       <w:r>
         <w:t xml:space="preserve"> gosta</w:t>
@@ -4837,10 +4885,19 @@
         <w:t>Upravljanje rezervacijama:</w:t>
       </w:r>
       <w:r>
-        <w:t xml:space="preserve"> Rezervacij</w:t>
-      </w:r>
-      <w:r>
-        <w:t>e su srž svake hotelske usluge te ova</w:t>
+        <w:t xml:space="preserve"> </w:t>
+      </w:r>
+      <w:r>
+        <w:t>Rezervacij</w:t>
+      </w:r>
+      <w:r>
+        <w:t xml:space="preserve">e su </w:t>
+      </w:r>
+      <w:r>
+        <w:t>temelj</w:t>
+      </w:r>
+      <w:r>
+        <w:t xml:space="preserve"> svake hotelske usluge te ova</w:t>
       </w:r>
       <w:r>
         <w:t xml:space="preserve"> aplikacija omogućava:</w:t>
@@ -4855,7 +4912,13 @@
         </w:numPr>
       </w:pPr>
       <w:r>
-        <w:t>Kreiranje rezervacija: Korisnici mogu unositi nove rezervacije, odabirući sobe i definirajući datume boravka.</w:t>
+        <w:rPr>
+          <w:b/>
+        </w:rPr>
+        <w:t>Kreiranje rezervacija:</w:t>
+      </w:r>
+      <w:r>
+        <w:t xml:space="preserve"> Korisnici mogu unositi nove rezervacije, odabirući sobe i definirajući datume boravka.</w:t>
       </w:r>
     </w:p>
     <w:p>
@@ -4867,7 +4930,13 @@
         </w:numPr>
       </w:pPr>
       <w:r>
-        <w:t xml:space="preserve">Praćenje rezervacija: Omogućava pregled svih detalja o rezervacijama, uključujući različite statuse kao što su rezervirana, plaćena, otkazana, check-in, check-out (plaćeno i neplaćeno). </w:t>
+        <w:rPr>
+          <w:b/>
+        </w:rPr>
+        <w:t>Praćenje rezervacija:</w:t>
+      </w:r>
+      <w:r>
+        <w:t xml:space="preserve"> Omogućava pregled svih detalja o rezervacijama, uključujući različite statuse kao što su rezervirana, plaćena, otkazana, check-in, check-out (plaćeno i neplaćeno). </w:t>
       </w:r>
     </w:p>
     <w:p>
@@ -4879,7 +4948,13 @@
         </w:numPr>
       </w:pPr>
       <w:r>
-        <w:t>Ažuriranje rezervacija: Omogućava korisnicima da mijenjaju postojeće rezervacije, poput promjena u datumima boravka ili vrsti sobe.</w:t>
+        <w:rPr>
+          <w:b/>
+        </w:rPr>
+        <w:t>Ažuriranje rezervacija:</w:t>
+      </w:r>
+      <w:r>
+        <w:t xml:space="preserve"> Omogućava korisnicima da mijenjaju postojeće rezervacije, poput promjena u datumima boravka ili vrsti sobe.</w:t>
       </w:r>
     </w:p>
     <w:p>
@@ -4891,7 +4966,13 @@
         </w:numPr>
       </w:pPr>
       <w:r>
-        <w:t>Brisanje rezervacija: Kada rezervacija više nije potrebna, korisnici mogu označiti rezervacije kao zaključane.</w:t>
+        <w:rPr>
+          <w:b/>
+        </w:rPr>
+        <w:t>Brisanje rezervacija:</w:t>
+      </w:r>
+      <w:r>
+        <w:t xml:space="preserve"> Kada rezervacija više nije potrebna, korisnici mogu označiti rezervacije kao zaključane.</w:t>
       </w:r>
     </w:p>
     <w:p>
@@ -4931,7 +5012,43 @@
         </w:numPr>
       </w:pPr>
       <w:r>
-        <w:t>Unos podataka o gostima: Evidentiranje osnovnih informacija o gostima, poput imena, kontakata i preferencija, omogućuje bolju personalizaciju usluga.</w:t>
+        <w:rPr>
+          <w:b/>
+        </w:rPr>
+        <w:t>Unos podataka o gostima:</w:t>
+      </w:r>
+      <w:r>
+        <w:t xml:space="preserve"> Evidentiranje osnovnih informacija o </w:t>
+      </w:r>
+      <w:r>
+        <w:t>gostima,</w:t>
+      </w:r>
+      <w:r>
+        <w:t xml:space="preserve"> </w:t>
+      </w:r>
+      <w:r>
+        <w:t>kao što su osobni podaci</w:t>
+      </w:r>
+      <w:r>
+        <w:t xml:space="preserve"> i služben</w:t>
+      </w:r>
+      <w:r>
+        <w:t xml:space="preserve">i </w:t>
+      </w:r>
+      <w:r>
+        <w:t>identifikacijsk</w:t>
+      </w:r>
+      <w:r>
+        <w:t>i</w:t>
+      </w:r>
+      <w:r>
+        <w:t xml:space="preserve"> poda</w:t>
+      </w:r>
+      <w:r>
+        <w:t>ci</w:t>
+      </w:r>
+      <w:r>
+        <w:t>.</w:t>
       </w:r>
     </w:p>
     <w:p>
@@ -4943,7 +5060,13 @@
         </w:numPr>
       </w:pPr>
       <w:r>
-        <w:t>Praćenje boravka: Bilježenje informacija o dolascima, odlascima i specifičnim zahtjevima gostiju pomaže u pružanju bolje usluge i upravljanju njihovim iskustvom u hotelu.</w:t>
+        <w:rPr>
+          <w:b/>
+        </w:rPr>
+        <w:t>Praćenje boravka:</w:t>
+      </w:r>
+      <w:r>
+        <w:t xml:space="preserve"> Bilježenje informacija o dolascima, odlascima i specifičnim zahtjevima gostiju pomaže u pružanju bolje usluge i upravljanju njihovim iskustvom u hotelu.</w:t>
       </w:r>
     </w:p>
     <w:p>
@@ -4978,7 +5101,6 @@
         <w:rPr>
           <w:b/>
         </w:rPr>
-        <w:lastRenderedPageBreak/>
         <w:t>Upravljanje sobama</w:t>
       </w:r>
       <w:r>
@@ -4994,7 +5116,13 @@
         </w:numPr>
       </w:pPr>
       <w:r>
-        <w:t>Unos i ažuriranje podataka o sobama: Dodavanje novih soba, ažuriranje informacija o postojećim sobama i praćenje njihovih statusa.</w:t>
+        <w:rPr>
+          <w:b/>
+        </w:rPr>
+        <w:t>Unos i ažuriranje podataka o sobama:</w:t>
+      </w:r>
+      <w:r>
+        <w:t xml:space="preserve"> Dodavanje novih soba, ažuriranje informacija o postojećim sobama i praćenje njihovih statusa.</w:t>
       </w:r>
     </w:p>
     <w:p>
@@ -5006,7 +5134,13 @@
         </w:numPr>
       </w:pPr>
       <w:r>
-        <w:t>Praćenje dostupnosti soba: Praćenje zauzetosti soba i usklađivanje sa rezervacijama kako bi se osigurala optimalna iskorištenost kapaciteta hotela.</w:t>
+        <w:rPr>
+          <w:b/>
+        </w:rPr>
+        <w:t>Praćenje dostupnosti soba:</w:t>
+      </w:r>
+      <w:r>
+        <w:t xml:space="preserve"> Praćenje zauzetosti soba i usklađivanje sa rezervacijama kako bi se osigurala optimalna iskorištenost kapaciteta hotela.</w:t>
       </w:r>
     </w:p>
     <w:p>
@@ -5014,7 +5148,7 @@
         <w:pStyle w:val="Heading2"/>
       </w:pPr>
       <w:bookmarkStart w:id="3" w:name="_Ref176086038"/>
-      <w:bookmarkStart w:id="4" w:name="_Toc176203451"/>
+      <w:bookmarkStart w:id="4" w:name="_Toc176299291"/>
       <w:r>
         <w:t>Glavni dijelovi aplikacij</w:t>
       </w:r>
@@ -5052,45 +5186,13 @@
         <w:tab/>
       </w:r>
       <w:r>
-        <w:rPr>
-          <w:rFonts w:eastAsia="Times New Roman"/>
-          <w:bCs/>
-          <w:lang w:eastAsia="hr-HR"/>
-        </w:rPr>
-        <w:t xml:space="preserve">Funkcionalnosti aplikacije su podijeljene u </w:t>
-      </w:r>
-      <w:r>
-        <w:rPr>
-          <w:rFonts w:eastAsia="Times New Roman"/>
-          <w:b/>
-          <w:bCs/>
-          <w:lang w:eastAsia="hr-HR"/>
-        </w:rPr>
-        <w:t>četiri vrste formi</w:t>
-      </w:r>
-      <w:r>
-        <w:rPr>
-          <w:rFonts w:eastAsia="Times New Roman"/>
-          <w:bCs/>
-          <w:lang w:eastAsia="hr-HR"/>
-        </w:rPr>
-        <w:t>, koje su strukturirane kako bi omogućile učinkovit pristup svim ključni</w:t>
-      </w:r>
-      <w:r>
-        <w:rPr>
-          <w:rFonts w:eastAsia="Times New Roman"/>
-          <w:bCs/>
-          <w:lang w:eastAsia="hr-HR"/>
-        </w:rPr>
-        <w:t>m</w:t>
-      </w:r>
-      <w:r>
-        <w:rPr>
-          <w:rFonts w:eastAsia="Times New Roman"/>
-          <w:bCs/>
-          <w:lang w:eastAsia="hr-HR"/>
-        </w:rPr>
-        <w:t xml:space="preserve"> aspektima upravljanja hotelom:</w:t>
+        <w:t xml:space="preserve">Sve funkcionalnosti aplikacije mogu se prikazati kroz četiri </w:t>
+      </w:r>
+      <w:r>
+        <w:t>vrste formi</w:t>
+      </w:r>
+      <w:r>
+        <w:t>:</w:t>
       </w:r>
     </w:p>
     <w:p>
@@ -5131,7 +5233,13 @@
         </w:rPr>
       </w:pPr>
       <w:r>
-        <w:t>Prva forma koju korisnici susreću prilikom pokretanja aplikacije. Omogućuje korisnicima prijavu u sustav pomoću vjerodajnica, čime se osigurava pristup svim funkcionalnostima aplikacije.</w:t>
+        <w:t>Ovo je prva</w:t>
+      </w:r>
+      <w:r>
+        <w:t xml:space="preserve"> forma koju korisnik vidi</w:t>
+      </w:r>
+      <w:r>
+        <w:t xml:space="preserve"> prilikom pokretanja aplikacije. Omogućuje korisnicima prijavu u sustav pomoću vjerodajnica, čime se osigurava pristup svim funkcionalnostima aplikacije.</w:t>
       </w:r>
     </w:p>
     <w:p>
@@ -5155,7 +5263,26 @@
           <w:bCs/>
           <w:lang w:eastAsia="hr-HR"/>
         </w:rPr>
-        <w:t>Glavna forma - „Dashboard“</w:t>
+        <w:t>Glavna forma – „</w:t>
+      </w:r>
+      <w:r>
+        <w:rPr>
+          <w:rFonts w:eastAsia="Times New Roman"/>
+          <w:b/>
+          <w:bCs/>
+          <w:i/>
+          <w:lang w:eastAsia="hr-HR"/>
+        </w:rPr>
+        <w:t>Dashboard</w:t>
+      </w:r>
+      <w:r>
+        <w:rPr>
+          <w:rFonts w:eastAsia="Times New Roman"/>
+          <w:b/>
+          <w:bCs/>
+          <w:lang w:eastAsia="hr-HR"/>
+        </w:rPr>
+        <w:t>“</w:t>
       </w:r>
     </w:p>
     <w:p>
@@ -5173,7 +5300,10 @@
         </w:rPr>
       </w:pPr>
       <w:r>
-        <w:t>Nakon prijave, korisnici ulaze u glavnu formu koja služi kao središnje sučelje. Ova forma pruža pregled svih dostupnih funkcionalnosti i omogućuje navigaciju do specifičnih područja aplikacije.</w:t>
+        <w:t>Nakon prijave, korisnik ulazi</w:t>
+      </w:r>
+      <w:r>
+        <w:t xml:space="preserve"> u glavnu formu koja služi kao središnje sučelje. Ova forma pruža pregled svih dostupnih funkcionalnosti i omogućuje navigaciju do specifičnih područja aplikacije.</w:t>
       </w:r>
     </w:p>
     <w:p>
@@ -5199,6 +5329,15 @@
         </w:rPr>
         <w:t>Podforme za specifične funkcionalnost</w:t>
       </w:r>
+      <w:r>
+        <w:rPr>
+          <w:rFonts w:eastAsia="Times New Roman"/>
+          <w:b/>
+          <w:bCs/>
+          <w:lang w:eastAsia="hr-HR"/>
+        </w:rPr>
+        <w:t>i</w:t>
+      </w:r>
     </w:p>
     <w:p>
       <w:pPr>
@@ -5215,7 +5354,13 @@
         </w:rPr>
       </w:pPr>
       <w:r>
-        <w:t>Ovisno o odabiru iz glavne forme, otvaraju se podforme za različite funkcionalnosti. Ove podforme omogućuju korisnicima da upravljaju rezervacijama, gostima i sobama, te obavljaju specifične zadatke unutar tih područja.</w:t>
+        <w:t>Ovisno o odabiru iz glavne forme, otvaraju se podforme za različite funkcionalnosti. Ove podforme omogućuju korisni</w:t>
+      </w:r>
+      <w:r>
+        <w:t xml:space="preserve">ku da upravlja </w:t>
+      </w:r>
+      <w:r>
+        <w:t>rezervacijama, gostima i sobama, te obavlja specifične zadatke unutar tih područja.</w:t>
       </w:r>
     </w:p>
     <w:p>
@@ -5257,19 +5402,22 @@
         </w:rPr>
       </w:pPr>
       <w:r>
-        <w:t xml:space="preserve">Unutar podformi, postoje manje forme koje omogućuju CRUD operacije (kreiranje, čitanje, ažuriranje, brisanje) nad određenim klasama ili tablicama u </w:t>
-      </w:r>
+        <w:t>Unutar podformi, postoje manje forme koje omogućuju CRUD operacije (kreiranje, čitanje, ažur</w:t>
+      </w:r>
+      <w:r>
+        <w:t xml:space="preserve">iranje, brisanje) nad određenim </w:t>
+      </w:r>
+      <w:r>
+        <w:t>tablicama u bazi podataka.</w:t>
+      </w:r>
+    </w:p>
+    <w:p>
+      <w:pPr>
+        <w:pStyle w:val="Heading2"/>
+      </w:pPr>
+      <w:bookmarkStart w:id="5" w:name="_Toc176299292"/>
       <w:r>
         <w:lastRenderedPageBreak/>
-        <w:t>bazi podataka. Ove male forme omogućuju detaljno upravljanje podacima i njihovim statusima.</w:t>
-      </w:r>
-    </w:p>
-    <w:p>
-      <w:pPr>
-        <w:pStyle w:val="Heading2"/>
-      </w:pPr>
-      <w:bookmarkStart w:id="5" w:name="_Toc176203452"/>
-      <w:r>
         <w:t>Dizajn korisničkog sučelja</w:t>
       </w:r>
       <w:bookmarkEnd w:id="5"/>
@@ -5287,7 +5435,19 @@
         <w:rPr>
           <w:i/>
         </w:rPr>
-        <w:t>WinForms</w:t>
+        <w:t>Win</w:t>
+      </w:r>
+      <w:r>
+        <w:rPr>
+          <w:i/>
+        </w:rPr>
+        <w:t xml:space="preserve">dows </w:t>
+      </w:r>
+      <w:r>
+        <w:rPr>
+          <w:i/>
+        </w:rPr>
+        <w:t>Forms</w:t>
       </w:r>
       <w:r>
         <w:t xml:space="preserve"> tehnologiji, koja pruža jednostavan i učinkovit način za izgradnju </w:t>
@@ -5299,7 +5459,13 @@
         <w:t>desktop</w:t>
       </w:r>
       <w:r>
-        <w:t xml:space="preserve"> aplikacija s grafičkim korisničkim sučeljem. Ključne karakteristike dizajna uključuju</w:t>
+        <w:t xml:space="preserve"> aplikacija s grafičkim korisničkim sučeljem. </w:t>
+      </w:r>
+      <w:r>
+        <w:t>Bitne karakteristike</w:t>
+      </w:r>
+      <w:r>
+        <w:t xml:space="preserve"> dizajna uključuju</w:t>
       </w:r>
       <w:r>
         <w:t xml:space="preserve"> </w:t>
@@ -5345,7 +5511,7 @@
       <w:pPr>
         <w:pStyle w:val="Heading2"/>
       </w:pPr>
-      <w:bookmarkStart w:id="6" w:name="_Toc176203453"/>
+      <w:bookmarkStart w:id="6" w:name="_Toc176299293"/>
       <w:r>
         <w:t>Plan razvoja</w:t>
       </w:r>
@@ -5356,7 +5522,19 @@
         <w:ind w:firstLine="567"/>
       </w:pPr>
       <w:r>
-        <w:t>Razvoj aplikacije pristupio je postepeno kako bi se osigurala ispravnost i učinkovitost svih ključnih funkcionalnosti. Krenulo se od osnovnih elemenata potrebnih za cjelokupno funkcioniranje aplikacije, s naglaskom na postupno dodavanje složenijih komponenti.</w:t>
+        <w:t>Razvoj aplikacije</w:t>
+      </w:r>
+      <w:r>
+        <w:t xml:space="preserve"> krenio </w:t>
+      </w:r>
+      <w:r>
+        <w:t xml:space="preserve"> je postepeno kako bi se osigurala</w:t>
+      </w:r>
+      <w:r>
+        <w:t xml:space="preserve"> ispravnost i učinkovitost svih</w:t>
+      </w:r>
+      <w:r>
+        <w:t xml:space="preserve"> funkcionalnosti. Krenulo se od osnovnih elemenata potrebnih za cjelokupno funkcioniranje aplikacije, s naglaskom na postupno dodavanje složenijih komponenti.</w:t>
       </w:r>
     </w:p>
     <w:p>
@@ -5376,7 +5554,28 @@
         <w:t xml:space="preserve"> upravljanje sobama</w:t>
       </w:r>
       <w:r>
-        <w:t>, kao što su informacije o tipovima soba, njihovim karakteristikama i cijenama. Ove komponente omogućuju pravilno pohranjivanje i upravljanje ključnim podacima.</w:t>
+        <w:t xml:space="preserve">, kao što su informacije o tipovima soba, njihovim karakteristikama i cijenama. Ove komponente omogućuju pravilno pohranjivanje </w:t>
+      </w:r>
+      <w:r>
+        <w:t xml:space="preserve">soba i podataka vezanih za </w:t>
+      </w:r>
+      <w:r>
+        <w:t xml:space="preserve">njih </w:t>
+      </w:r>
+      <w:r>
+        <w:t xml:space="preserve">kao što su dodaci u sobi, </w:t>
+      </w:r>
+      <w:r>
+        <w:t xml:space="preserve">tipovi soba koje mogu postojati te </w:t>
+      </w:r>
+      <w:r>
+        <w:t xml:space="preserve"> kat na kojem se nalazi </w:t>
+      </w:r>
+      <w:r>
+        <w:t>soba</w:t>
+      </w:r>
+      <w:r>
+        <w:t>.</w:t>
       </w:r>
     </w:p>
     <w:p>
@@ -5396,12 +5595,21 @@
         <w:t>upravljanje gostima</w:t>
       </w:r>
       <w:r>
-        <w:t>. Ova faza obuhvatila je implementaciju sustava za unos i ažuriranje informacija o gostima, uključujući njihove kontaktne podatke i preferencije.</w:t>
-      </w:r>
-    </w:p>
-    <w:p>
-      <w:r>
-        <w:t xml:space="preserve">S razvojem funkcionalnosti za sobe i goste, sljedeći korak bio je integracija </w:t>
+        <w:t xml:space="preserve">. Ova faza obuhvatila je implementaciju sustava za unos i ažuriranje informacija o gostima, uključujući njihove </w:t>
+      </w:r>
+      <w:r>
+        <w:t>osobne i službene identifikacijske podatke</w:t>
+      </w:r>
+      <w:r>
+        <w:t>.</w:t>
+      </w:r>
+    </w:p>
+    <w:p>
+      <w:r>
+        <w:t xml:space="preserve">S razvojem funkcionalnosti za sobe i goste, sljedeći korak bio je </w:t>
+      </w:r>
+      <w:r>
+        <w:t xml:space="preserve">kreiranje </w:t>
       </w:r>
       <w:r>
         <w:t>funkcionalnosti rezervacija</w:t>
@@ -5421,19 +5629,10 @@
     </w:p>
     <w:p/>
     <w:p>
-      <w:r>
-        <w:lastRenderedPageBreak/>
-        <w:t>Svaka faza razvoja testirana je kako bi se osigurala ispravnost i učinkovitost aplikacije. Ovaj strukturirani pristup omogućuje postupno dodavanje složenijih funkcionalnosti, čime se osigurava kvalitetno i funkcionalno r</w:t>
-      </w:r>
-      <w:r>
-        <w:t>ješenje za upravljanje hotelom.</w:t>
-      </w:r>
-    </w:p>
-    <w:p>
       <w:pPr>
         <w:pStyle w:val="Heading1"/>
       </w:pPr>
-      <w:bookmarkStart w:id="7" w:name="_Toc176203454"/>
+      <w:bookmarkStart w:id="7" w:name="_Toc176299294"/>
       <w:r>
         <w:lastRenderedPageBreak/>
         <w:t>ZAHTJEVI APLIKACIJE</w:t>
@@ -5444,7 +5643,7 @@
       <w:pPr>
         <w:pStyle w:val="Heading2"/>
       </w:pPr>
-      <w:bookmarkStart w:id="8" w:name="_Toc176203455"/>
+      <w:bookmarkStart w:id="8" w:name="_Toc176299295"/>
       <w:r>
         <w:t>Funkcionalni zahtjevi</w:t>
       </w:r>
@@ -5457,7 +5656,31 @@
         <w:jc w:val="left"/>
       </w:pPr>
       <w:r>
-        <w:t>U hotelskom poslovanju, funkcionalni zahtjevi su važni za učinkovito upravljanje hotelom i pružanje dobre usluge gostima. Ovi zahtjevi se mogu podijeliti u dvije glavne skupine:</w:t>
+        <w:t xml:space="preserve">Bitno je definirati funkcionalne zahtjeve kako bi se jasno </w:t>
+      </w:r>
+      <w:r>
+        <w:t xml:space="preserve">definiralo </w:t>
+      </w:r>
+      <w:r>
+        <w:t>što gosti očekuju od hotela i kako bi se osigurala visoka razina usluge. U hotelskom poslovanju, ovi zahtjevi pomažu u utvrđivanju standarda potrebnih za zadovoljavanje očekivanja gostiju. Funkcionalni zahtjevi</w:t>
+      </w:r>
+      <w:r>
+        <w:t>,</w:t>
+      </w:r>
+      <w:r>
+        <w:t xml:space="preserve"> </w:t>
+      </w:r>
+      <w:r>
+        <w:t xml:space="preserve">aplikacije za hotelsko poslovanje, </w:t>
+      </w:r>
+      <w:r>
+        <w:t xml:space="preserve">se mogu klasificirati </w:t>
+      </w:r>
+      <w:r>
+        <w:t>u dvije glavne skupine, ovisno na koji dio poslovanja hotela se fokusiraju</w:t>
+      </w:r>
+      <w:r>
+        <w:t>:</w:t>
       </w:r>
     </w:p>
     <w:p>
@@ -5468,7 +5691,7 @@
           <w:b w:val="0"/>
         </w:rPr>
       </w:pPr>
-      <w:bookmarkStart w:id="9" w:name="_Toc176203456"/>
+      <w:bookmarkStart w:id="9" w:name="_Toc176299296"/>
       <w:r>
         <w:rPr>
           <w:rStyle w:val="Strong"/>
@@ -5498,7 +5721,19 @@
         </w:numPr>
       </w:pPr>
       <w:r>
-        <w:t>Upravljanje sobama: Ova funkcionalnost omogućava unos i ažuriranje informacija o sobama, uključujući vrste soba, njihovu dostupnost i opremu. Pomaže u praćenju stanja soba i pripremi za goste, osiguravajući da svaka soba bude pravilno postavljena i spremna za korištenje.</w:t>
+        <w:rPr>
+          <w:b/>
+        </w:rPr>
+        <w:t xml:space="preserve">Upravljanje sobama: </w:t>
+      </w:r>
+      <w:r>
+        <w:t xml:space="preserve">Ova funkcionalnost omogućava unos i ažuriranje informacija o sobama, uključujući vrste soba, njihovu dostupnost i </w:t>
+      </w:r>
+      <w:r>
+        <w:t>dodatke</w:t>
+      </w:r>
+      <w:r>
+        <w:t>. Pomaže u praćenju stanja soba i pripremi za goste, osiguravajući da svaka soba bude pravilno postavljena i spremna za korištenje.</w:t>
       </w:r>
     </w:p>
     <w:p>
@@ -5522,14 +5757,10 @@
       <w:r>
         <w:rPr>
           <w:rStyle w:val="Strong"/>
-          <w:b w:val="0"/>
         </w:rPr>
         <w:t>Upravljanje tipovima soba</w:t>
       </w:r>
       <w:r>
-        <w:rPr>
-          <w:b/>
-        </w:rPr>
         <w:t>:</w:t>
       </w:r>
       <w:r>
@@ -5557,18 +5788,14 @@
       <w:r>
         <w:rPr>
           <w:rStyle w:val="Strong"/>
-          <w:b w:val="0"/>
         </w:rPr>
         <w:t>Upravljanje dodacima u sobama i dodatnim uslugama</w:t>
       </w:r>
       <w:r>
-        <w:rPr>
-          <w:b/>
-        </w:rPr>
-        <w:t>:</w:t>
-      </w:r>
-      <w:r>
-        <w:t xml:space="preserve"> Omogućava unos i ažuriranje informacija o dodatnim sadržajima u sobama, kao što su minibar, Wi-Fi, televizija, te dodatnim uslugama kao što su pranje rublja ili spa usluge. Pomaže u pružanju sveobuhvatne ponude usluga i dodataka koji povećavaju udobnost gostiju.</w:t>
+        <w:t xml:space="preserve">: </w:t>
+      </w:r>
+      <w:r>
+        <w:t>Omogućava unos i ažuriranje informacija o dodatnim sadržajima u sobama, kao što su minibar, Wi-Fi, televizija, te dodatnim uslugama kao što su pranje rublja ili spa usluge. Pomaže u pružanju sveobuhvatne ponude usluga i dodataka koji povećavaju udobnost gostiju.</w:t>
       </w:r>
     </w:p>
     <w:p>
@@ -5590,7 +5817,16 @@
         </w:numPr>
       </w:pPr>
       <w:r>
-        <w:t>Upravljanje katovima: Pruža mogućnost vođenja evidencije o različitim katovima u hotelu te povezivanje soba s određenim katovima. Ova funkcionalnost pomaže u boljoj organizaciji prostora i rasporedu soba, čime se poboljšava funkcionalnost hotela.</w:t>
+        <w:rPr>
+          <w:b/>
+        </w:rPr>
+        <w:t>Upravljanje katovima:</w:t>
+      </w:r>
+      <w:r>
+        <w:t xml:space="preserve"> Pruža mogućnost vođenja evidencije o različitim katovima u hotelu te povezivanje soba s određenim katovima. Ova funkcionalnost pomaže u boljoj organizaciji prostora i rasporedu soba</w:t>
+      </w:r>
+      <w:r>
+        <w:t>.</w:t>
       </w:r>
     </w:p>
     <w:p>
@@ -5617,18 +5853,72 @@
       <w:r>
         <w:rPr>
           <w:rStyle w:val="Strong"/>
-          <w:b w:val="0"/>
-        </w:rPr>
+        </w:rPr>
+        <w:lastRenderedPageBreak/>
         <w:t>Prilagodba cijena</w:t>
       </w:r>
       <w:r>
+        <w:t>:</w:t>
+      </w:r>
+      <w:r>
+        <w:t xml:space="preserve"> Omogućava prilagodbu cijena soba prema sezoni, praznicima i drugim faktorima. Pomaže u optimizaciji prihoda hotela i prilagodbi cjenovne politike u skladu s tržišnim uvjetima.</w:t>
+      </w:r>
+    </w:p>
+    <w:p>
+      <w:pPr>
+        <w:pStyle w:val="Heading3"/>
+      </w:pPr>
+      <w:bookmarkStart w:id="10" w:name="_Toc176299297"/>
+      <w:r>
+        <w:t>Rezervacije i poslovanje hotela</w:t>
+      </w:r>
+      <w:bookmarkEnd w:id="10"/>
+    </w:p>
+    <w:p>
+      <w:pPr>
+        <w:ind w:firstLine="360"/>
+      </w:pPr>
+      <w:r>
+        <w:t xml:space="preserve">Ova skupina funkcionalnih zahtjeva odnosi se na procese svakodnevnog poslovanja hotela, koji uključuju upravljanje gostima, kreiranje i praćenje rezervacija te osiguravanje </w:t>
+      </w:r>
+      <w:r>
+        <w:t>jednostavn</w:t>
+      </w:r>
+      <w:r>
+        <w:t xml:space="preserve">e prijave </w:t>
+      </w:r>
+      <w:r>
+        <w:t xml:space="preserve">i odjave gostiju. Učinkovito upravljanje ovim </w:t>
+      </w:r>
+      <w:r>
+        <w:t>operacijama</w:t>
+      </w:r>
+      <w:r>
+        <w:t xml:space="preserve"> poslovanja osigurava visoku kvalitetu usluge i</w:t>
+      </w:r>
+      <w:r>
+        <w:t xml:space="preserve"> na kraju i</w:t>
+      </w:r>
+      <w:r>
+        <w:t xml:space="preserve"> zadovoljstvo gostiju.</w:t>
+      </w:r>
+    </w:p>
+    <w:p>
+      <w:pPr>
+        <w:pStyle w:val="ListParagraph"/>
+        <w:numPr>
+          <w:ilvl w:val="0"/>
+          <w:numId w:val="16"/>
+        </w:numPr>
+      </w:pPr>
+      <w:r>
         <w:rPr>
           <w:b/>
         </w:rPr>
-        <w:t>:</w:t>
-      </w:r>
-      <w:r>
-        <w:t xml:space="preserve"> Omogućava prilagodbu cijena soba prema sezoni, praznicima i drugim faktorima. Pomaže u optimizaciji prihoda hotela i prilagodbi cjenovne politike u skladu s tržišnim uvjetima.</w:t>
+        <w:t>Upravljanje gostima</w:t>
+      </w:r>
+      <w:r>
+        <w:t xml:space="preserve"> - Ova funkcionalnost omogućuje unos i ažuriranje podataka o gostima. To uključuje i evidenciju o povijesti boravka gostiju, što pomaže u pružanju personalizirane usluge i poboljšanju iskustva gostiju tijekom njihovog boravka.</w:t>
       </w:r>
     </w:p>
     <w:p>
@@ -5643,42 +5933,6 @@
     </w:p>
     <w:p>
       <w:pPr>
-        <w:pStyle w:val="Heading3"/>
-      </w:pPr>
-      <w:bookmarkStart w:id="10" w:name="_Toc176203457"/>
-      <w:r>
-        <w:t>Rezervacije i poslovanje hotela</w:t>
-      </w:r>
-      <w:bookmarkEnd w:id="10"/>
-    </w:p>
-    <w:p>
-      <w:pPr>
-        <w:ind w:firstLine="360"/>
-      </w:pPr>
-      <w:r>
-        <w:t xml:space="preserve">Ova skupina funkcionalnih zahtjeva odnosi se na procese svakodnevnog poslovanja hotela, koji uključuju upravljanje gostima, kreiranje i praćenje rezervacija te osiguravanje </w:t>
-      </w:r>
-      <w:r>
-        <w:t>jednostavnog</w:t>
-      </w:r>
-      <w:r>
-        <w:t xml:space="preserve"> prijema i odjave gostiju. Učinkovito upravljanje ovim </w:t>
-      </w:r>
-      <w:r>
-        <w:t>operacijama</w:t>
-      </w:r>
-      <w:r>
-        <w:t xml:space="preserve"> poslovanja osigurava visoku kvalitetu usluge i</w:t>
-      </w:r>
-      <w:r>
-        <w:t xml:space="preserve"> na kraju i</w:t>
-      </w:r>
-      <w:r>
-        <w:t xml:space="preserve"> zadovoljstvo gostiju.</w:t>
-      </w:r>
-    </w:p>
-    <w:p>
-      <w:pPr>
         <w:pStyle w:val="ListParagraph"/>
         <w:numPr>
           <w:ilvl w:val="0"/>
@@ -5689,10 +5943,16 @@
         <w:rPr>
           <w:b/>
         </w:rPr>
-        <w:t>Upravljanje gostima</w:t>
-      </w:r>
-      <w:r>
-        <w:t xml:space="preserve"> - Ova funkcionalnost omogućuje unos i ažuriranje podataka o gostima, kao što su imena, kontakt informacije i specifične preferencije. To uključuje i evidenciju o povijesti boravka gostiju, što pomaže u pružanju personalizirane usluge i poboljšanju iskustva gostiju tijekom njihovog boravka.</w:t>
+        <w:t>Upravljanje rezervacijama</w:t>
+      </w:r>
+      <w:r>
+        <w:t xml:space="preserve"> - Ova funkcionalnost omogućuje kreiranje</w:t>
+      </w:r>
+      <w:r>
+        <w:t xml:space="preserve"> i </w:t>
+      </w:r>
+      <w:r>
+        <w:t>pregled rezervacija. Također uključuje praćenje statusa rezervacija, od inicijalne prijave do završetka boravka, čime se osigurava optimalna popunjenost soba i učinkovito planiranje hotelskih resursa.</w:t>
       </w:r>
     </w:p>
     <w:p>
@@ -5717,10 +5977,25 @@
         <w:rPr>
           <w:b/>
         </w:rPr>
-        <w:t>Upravljanje rezervacijama</w:t>
-      </w:r>
-      <w:r>
-        <w:t xml:space="preserve"> - Ova funkcionalnost omogućuje kreiranje, ažuriranje, pregled i otkazivanje rezervacija u skladu s potrebama gostiju. Također uključuje praćenje statusa rezervacija, od inicijalne prijave do završetka boravka, čime se osigurava optimalna popunjenost soba i učinkovito planiranje hotelskih resursa.</w:t>
+        <w:t>Identifikacija gostiju</w:t>
+      </w:r>
+      <w:r>
+        <w:t xml:space="preserve"> </w:t>
+      </w:r>
+      <w:r>
+        <w:t xml:space="preserve">– </w:t>
+      </w:r>
+      <w:r>
+        <w:t xml:space="preserve">Proces identifikacije gosta provodi se prilikom </w:t>
+      </w:r>
+      <w:r>
+        <w:rPr>
+          <w:i/>
+        </w:rPr>
+        <w:t>check-ina</w:t>
+      </w:r>
+      <w:r>
+        <w:t xml:space="preserve"> u hotel. Zaposlenik prikuplja osobne podatke gosta i unosi ih u sustav.</w:t>
       </w:r>
     </w:p>
     <w:p>
@@ -5744,34 +6019,7 @@
       <w:r>
         <w:rPr>
           <w:b/>
-        </w:rPr>
-        <w:t>Identifikacija gostiju</w:t>
-      </w:r>
-      <w:r>
-        <w:t xml:space="preserve"> - Ova funkcionalnost omogućuje kreiranje, ažuriranje, pregled i otkazivanje rezervacija u skladu s potrebama gostiju. Također uključuje praćenje statusa rezervacija, od inicijalne prijave do završetka boravka, čime se osigurava optimalna popunjenost soba i učinkovito planiranje hotelskih resursa.</w:t>
-      </w:r>
-    </w:p>
-    <w:p>
-      <w:pPr>
-        <w:pStyle w:val="ListParagraph"/>
-        <w:numPr>
-          <w:ilvl w:val="0"/>
-          <w:numId w:val="0"/>
-        </w:numPr>
-        <w:ind w:left="720"/>
-      </w:pPr>
-    </w:p>
-    <w:p>
-      <w:pPr>
-        <w:pStyle w:val="ListParagraph"/>
-        <w:numPr>
-          <w:ilvl w:val="0"/>
-          <w:numId w:val="16"/>
-        </w:numPr>
-      </w:pPr>
-      <w:r>
-        <w:rPr>
-          <w:b/>
+          <w:i/>
         </w:rPr>
         <w:t>Check-in / check-out</w:t>
       </w:r>
@@ -5909,11 +6157,16 @@
         <w:t xml:space="preserve"> </w:t>
       </w:r>
       <w:r>
-        <w:t>– Funkcionalnosti aplikacije za hotelski menadžment</w:t>
+        <w:t xml:space="preserve">– Funkcionalni zahtjevi </w:t>
+      </w:r>
+      <w:r>
+        <w:t xml:space="preserve"> aplikacije za </w:t>
       </w:r>
       <w:bookmarkEnd w:id="12"/>
-    </w:p>
-    <w:p/>
+      <w:r>
+        <w:t>upravljanje hotelskim poslovanjem</w:t>
+      </w:r>
+    </w:p>
     <w:p>
       <w:pPr>
         <w:pStyle w:val="Heading2"/>
@@ -5922,7 +6175,7 @@
           <w:numId w:val="17"/>
         </w:numPr>
       </w:pPr>
-      <w:bookmarkStart w:id="13" w:name="_Toc176203458"/>
+      <w:bookmarkStart w:id="13" w:name="_Toc176299298"/>
       <w:r>
         <w:t>Nefunkcionalni zahtjevi</w:t>
       </w:r>
@@ -5934,7 +6187,19 @@
         <w:ind w:firstLine="432"/>
       </w:pPr>
       <w:r>
-        <w:t>Nefunkcionalni zahtjevi osiguravaju da aplikacija radi pouzdano, sigurno i učinkovito, čak i u različitim uvjetima i s različitim uređajima. Iako nisu direktno povezani s funkcionalnostima aplikacije, ova ograničenja su ključna za kvalitetno korisničko iskustvo. Ograničenja koja se odnose na rad Hotel aplikacije</w:t>
+        <w:t xml:space="preserve">Nefunkcionalni zahtjevi osiguravaju da aplikacija radi pouzdano, sigurno i učinkovito, čak i u različitim uvjetima i s različitim uređajima. Iako nisu direktno povezani s funkcionalnostima aplikacije, ova ograničenja su </w:t>
+      </w:r>
+      <w:r>
+        <w:t>vrlo bitna</w:t>
+      </w:r>
+      <w:r>
+        <w:t xml:space="preserve"> za </w:t>
+      </w:r>
+      <w:r>
+        <w:t>dobro</w:t>
+      </w:r>
+      <w:r>
+        <w:t xml:space="preserve"> korisničko iskustvo. Ograničenja koja se odnose na rad Hotel aplikacije</w:t>
       </w:r>
       <w:r>
         <w:t xml:space="preserve"> :</w:t>
@@ -5956,7 +6221,13 @@
         <w:t>Sigurnost pristupa:</w:t>
       </w:r>
       <w:r>
-        <w:t xml:space="preserve"> Sigurnosne mjere, poput lozinki i enkripcije podataka, moraju spriječiti neovlašteni pristup podacima gostiju i rezervacija. Sesijski kolačići se koriste za autentifikaciju korisnika, s ograničenim trajanjem sesije kako bi se povećala sigurnost.</w:t>
+        <w:t xml:space="preserve"> </w:t>
+      </w:r>
+      <w:r>
+        <w:t xml:space="preserve">Aplikacija mora implementirati </w:t>
+      </w:r>
+      <w:r>
+        <w:t>sigurnosne mjere, kao što su autentifikacija korisnika putem lozinki i enkripcija podataka, kako bi se spriječio neovlašteni pristup osjetljivim informacijama o gostima i rezervacijama.</w:t>
       </w:r>
     </w:p>
     <w:p>
@@ -5975,7 +6246,10 @@
         <w:t>Prilagodljivost</w:t>
       </w:r>
       <w:r>
-        <w:t>: Aplikacija mora omogućiti lako dodavanje novih funkcija i prilagodbu postojećih bez većih promjena.</w:t>
+        <w:t xml:space="preserve">: </w:t>
+      </w:r>
+      <w:r>
+        <w:t>Sustav treba biti dizajniran tako da omogućava jednostavno dodavanje novih funkcionalnosti i prilagodbu postojećih bez potrebe za velikim promjenama u osnovnoj strukturi aplikacije.</w:t>
       </w:r>
     </w:p>
     <w:p>
@@ -5994,7 +6268,16 @@
         <w:t>Jednostavnost korištenja</w:t>
       </w:r>
       <w:r>
-        <w:t>: Korisničko sučelje mora biti jednostavno za razumijevanje i korištenje, čak i za korisnike s manje tehničkog znanja.</w:t>
+        <w:t xml:space="preserve">: </w:t>
+      </w:r>
+      <w:r>
+        <w:t xml:space="preserve">Korisničko sučelje mora biti intuitivno i lako razumljivo, tako da i korisnici s osnovnim znanjem </w:t>
+      </w:r>
+      <w:r>
+        <w:t xml:space="preserve">o računalima </w:t>
+      </w:r>
+      <w:r>
+        <w:t>mogu koristiti aplikaciju bez poteškoća.</w:t>
       </w:r>
     </w:p>
     <w:p>
@@ -6015,7 +6298,13 @@
         <w:t>Performanse aplikacije</w:t>
       </w:r>
       <w:r>
-        <w:t>: Aplikacija mora brzo i učinkovito izvršavati sve zadatke, bez obzira na količinu podataka, kako bi korisničko iskustvo bilo glatko i bez zastoja.</w:t>
+        <w:t xml:space="preserve">: </w:t>
+      </w:r>
+      <w:r>
+        <w:t>Aplikacija mora biti optimizirana za brzo i učinkovito izvođenje svih zadataka, neovisno o količini podataka, kako bi se osiguralo glatko i neprekidno korisničko iskustvo.</w:t>
+      </w:r>
+      <w:r>
+        <w:t xml:space="preserve"> </w:t>
       </w:r>
     </w:p>
     <w:p>
@@ -6023,7 +6312,7 @@
         <w:pStyle w:val="Heading1"/>
         <w:jc w:val="left"/>
       </w:pPr>
-      <w:bookmarkStart w:id="14" w:name="_Toc176203459"/>
+      <w:bookmarkStart w:id="14" w:name="_Toc176299299"/>
       <w:r>
         <w:lastRenderedPageBreak/>
         <w:t>MODELIRANJE SUSTAV</w:t>
@@ -6064,7 +6353,7 @@
       <w:pPr>
         <w:pStyle w:val="Heading2"/>
       </w:pPr>
-      <w:bookmarkStart w:id="15" w:name="_Toc176203460"/>
+      <w:bookmarkStart w:id="15" w:name="_Toc176299300"/>
       <w:r>
         <w:t>Model podataka</w:t>
       </w:r>
@@ -6830,7 +7119,7 @@
       <w:pPr>
         <w:pStyle w:val="Heading2"/>
       </w:pPr>
-      <w:bookmarkStart w:id="19" w:name="_Toc176203461"/>
+      <w:bookmarkStart w:id="19" w:name="_Toc176299301"/>
       <w:r>
         <w:rPr>
           <w:i/>
@@ -7061,7 +7350,7 @@
       <w:pPr>
         <w:pStyle w:val="Heading2"/>
       </w:pPr>
-      <w:bookmarkStart w:id="21" w:name="_Toc176203462"/>
+      <w:bookmarkStart w:id="21" w:name="_Toc176299302"/>
       <w:r>
         <w:rPr>
           <w:i/>
@@ -7520,7 +7809,7 @@
       <w:pPr>
         <w:pStyle w:val="Heading1"/>
       </w:pPr>
-      <w:bookmarkStart w:id="22" w:name="_Toc176203463"/>
+      <w:bookmarkStart w:id="22" w:name="_Toc176299303"/>
       <w:r>
         <w:lastRenderedPageBreak/>
         <w:t>DIZAJN SUSTAVA</w:t>
@@ -7531,7 +7820,7 @@
       <w:pPr>
         <w:pStyle w:val="Heading2"/>
       </w:pPr>
-      <w:bookmarkStart w:id="23" w:name="_Toc176203464"/>
+      <w:bookmarkStart w:id="23" w:name="_Toc176299304"/>
       <w:r>
         <w:t>Dizajn arhitekture sustava</w:t>
       </w:r>
@@ -7822,7 +8111,7 @@
       <w:pPr>
         <w:pStyle w:val="Heading2"/>
       </w:pPr>
-      <w:bookmarkStart w:id="26" w:name="_Toc176203465"/>
+      <w:bookmarkStart w:id="26" w:name="_Toc176299305"/>
       <w:r>
         <w:t>Struktura aplikacije i kod</w:t>
       </w:r>
@@ -9092,7 +9381,7 @@
       <w:pPr>
         <w:pStyle w:val="Heading2"/>
       </w:pPr>
-      <w:bookmarkStart w:id="35" w:name="_Toc176203466"/>
+      <w:bookmarkStart w:id="35" w:name="_Toc176299306"/>
       <w:r>
         <w:t>B</w:t>
       </w:r>
@@ -10148,7 +10437,7 @@
       <w:pPr>
         <w:pStyle w:val="Heading2"/>
       </w:pPr>
-      <w:bookmarkStart w:id="42" w:name="_Toc176203467"/>
+      <w:bookmarkStart w:id="42" w:name="_Toc176299307"/>
       <w:r>
         <w:lastRenderedPageBreak/>
         <w:t>Detaljni prikaz sučelja aplikacije</w:t>
@@ -11125,7 +11414,7 @@
       <w:pPr>
         <w:pStyle w:val="Heading1"/>
       </w:pPr>
-      <w:bookmarkStart w:id="51" w:name="_Toc176203468"/>
+      <w:bookmarkStart w:id="51" w:name="_Toc176299308"/>
       <w:r>
         <w:lastRenderedPageBreak/>
         <w:t>IMPLEMENTACIJA APLIKACIJE</w:t>
@@ -11136,7 +11425,7 @@
       <w:pPr>
         <w:pStyle w:val="Heading2"/>
       </w:pPr>
-      <w:bookmarkStart w:id="52" w:name="_Toc176203469"/>
+      <w:bookmarkStart w:id="52" w:name="_Toc176299309"/>
       <w:r>
         <w:t>Korištene tehnologije</w:t>
       </w:r>
@@ -11146,7 +11435,7 @@
       <w:pPr>
         <w:pStyle w:val="Heading3"/>
       </w:pPr>
-      <w:bookmarkStart w:id="53" w:name="_Toc176203470"/>
+      <w:bookmarkStart w:id="53" w:name="_Toc176299310"/>
       <w:r>
         <w:t>Windows Forms</w:t>
       </w:r>
@@ -11322,10 +11611,7 @@
         <w:ind w:firstLine="708"/>
       </w:pPr>
       <w:r>
-        <w:t>Windows Forms je korišten za izradu korisničkog sučelja aplikacije jer omogućava brzu i jednostavnu izradu sučelja uz minimalan napor. Fokus ovog projekta bio je na manipulaciji podacima i implementaciji poslovne logike, a ne na složenosti samog korisničkog sučelja. Windows Forms se pokazao kao idealan izbor zbog svoje jednostavnosti, kompatibilnosti i mogućnosti brze implementa</w:t>
-      </w:r>
-      <w:r>
-        <w:t>cije potrebnih funkcionalnosti.</w:t>
+        <w:t>Windows Forms je korišten za izradu korisničkog sučelja aplikacije jer omogućava brzu i jednostavnu izradu sučelja uz minimalan napor. Fokus ovog projekta bio je na manipulaciji podacima i implementaciji poslovne logike, a ne na složenosti samog korisničkog sučelja. Windows Forms se pokazao kao idealan izbor zbog svoje jednostavnosti, kompatibilnosti i mogućnosti brze implementacije potrebnih funkcionalnosti.</w:t>
       </w:r>
     </w:p>
     <w:p>
@@ -11351,7 +11637,7 @@
       <w:pPr>
         <w:pStyle w:val="Heading3"/>
       </w:pPr>
-      <w:bookmarkStart w:id="54" w:name="_Toc176203471"/>
+      <w:bookmarkStart w:id="54" w:name="_Toc176299311"/>
       <w:r>
         <w:t>.NET i C#</w:t>
       </w:r>
@@ -11362,10 +11648,7 @@
         <w:ind w:firstLine="708"/>
       </w:pPr>
       <w:r>
-        <w:t>.NET je razvojna platforma koju je razvila tvrtka Microsoft. To je skup alata i okvira koji pomažu programerima da kreiraju različite vrste aplikacija, kao što su desktop aplikacije, web stranice i mobilne aplikacije. Prvi put je predstavljen 2002. godine kao dio .NET Frameworka, a s vre</w:t>
-      </w:r>
-      <w:r>
-        <w:t>menom je proširen i unaprijeđen.</w:t>
+        <w:t>.NET je razvojna platforma koju je razvila tvrtka Microsoft. To je skup alata i okvira koji pomažu programerima da kreiraju različite vrste aplikacija, kao što su desktop aplikacije, web stranice i mobilne aplikacije. Prvi put je predstavljen 2002. godine kao dio .NET Frameworka, a s vremenom je proširen i unaprijeđen.</w:t>
       </w:r>
     </w:p>
     <w:p>
@@ -11506,15 +11789,12 @@
         <w:t>. Predstavljen je 2000. godine i dizajniran je za pružanje jednostavnog, sigurnog i visoko produktivnog programskog iskustva. C# je objektno orijentiran, statički tipiziran jezik.</w:t>
       </w:r>
       <w:r>
+        <w:t xml:space="preserve"> C# ima korijene u obitelji jezika C i vrlo je sličan drugim popularnim jezicima poput C++ i Jave.</w:t>
+      </w:r>
+      <w:r>
         <w:t xml:space="preserve"> </w:t>
       </w:r>
       <w:r>
-        <w:t>C# ima korijene u obitelji jezika C i vrlo je sličan drugim popularnim jezicima poput C++ i Jave.</w:t>
-      </w:r>
-      <w:r>
-        <w:t xml:space="preserve"> </w:t>
-      </w:r>
-      <w:r>
         <w:fldChar w:fldCharType="begin"/>
       </w:r>
       <w:r>
@@ -11535,10 +11815,7 @@
         <w:ind w:firstLine="708"/>
       </w:pPr>
       <w:r>
-        <w:t xml:space="preserve">C# je svestran jezik koji se koristi za razvoj različitih </w:t>
-      </w:r>
-      <w:r>
-        <w:t>vrsta aplikacija. To uključuje:</w:t>
+        <w:t>C# je svestran jezik koji se koristi za razvoj različitih vrsta aplikacija. To uključuje:</w:t>
       </w:r>
     </w:p>
     <w:p>
@@ -11690,7 +11967,7 @@
       <w:pPr>
         <w:pStyle w:val="Heading3"/>
       </w:pPr>
-      <w:bookmarkStart w:id="55" w:name="_Toc176203472"/>
+      <w:bookmarkStart w:id="55" w:name="_Toc176299312"/>
       <w:r>
         <w:t>Microsoft SQL Server</w:t>
       </w:r>
@@ -11871,7 +12148,7 @@
       <w:pPr>
         <w:pStyle w:val="Heading1"/>
       </w:pPr>
-      <w:bookmarkStart w:id="56" w:name="_Toc176203473"/>
+      <w:bookmarkStart w:id="56" w:name="_Toc176299313"/>
       <w:r>
         <w:lastRenderedPageBreak/>
         <w:t>ZAKLJUČAK</w:t>
@@ -11902,7 +12179,7 @@
       <w:pPr>
         <w:pStyle w:val="Prilog1"/>
       </w:pPr>
-      <w:bookmarkStart w:id="57" w:name="_Toc176203474"/>
+      <w:bookmarkStart w:id="57" w:name="_Toc176299314"/>
       <w:r>
         <w:lastRenderedPageBreak/>
         <w:t>LITERATURA</w:t>
@@ -11995,10 +12272,10 @@
           <w:color w:val="000000" w:themeColor="text1"/>
         </w:rPr>
       </w:pPr>
-      <w:bookmarkStart w:id="60" w:name="_Ref526806254"/>
-      <w:bookmarkStart w:id="61" w:name="_Ref536624473"/>
-      <w:bookmarkStart w:id="62" w:name="_Ref527059161"/>
-      <w:bookmarkStart w:id="63" w:name="_Ref175490935"/>
+      <w:bookmarkStart w:id="60" w:name="_Ref175490935"/>
+      <w:bookmarkStart w:id="61" w:name="_Ref526806254"/>
+      <w:bookmarkStart w:id="62" w:name="_Ref536624473"/>
+      <w:bookmarkStart w:id="63" w:name="_Ref527059161"/>
       <w:r>
         <w:rPr>
           <w:color w:val="000000" w:themeColor="text1"/>
@@ -12062,7 +12339,7 @@
         </w:rPr>
         <w:t>.2024</w:t>
       </w:r>
-      <w:bookmarkEnd w:id="63"/>
+      <w:bookmarkEnd w:id="60"/>
       <w:bookmarkEnd w:id="64"/>
     </w:p>
     <w:p>
@@ -12077,8 +12354,8 @@
         </w:rPr>
       </w:pPr>
       <w:bookmarkStart w:id="65" w:name="_Ref176205351"/>
-      <w:bookmarkEnd w:id="60"/>
       <w:bookmarkEnd w:id="61"/>
+      <w:bookmarkEnd w:id="62"/>
       <w:r>
         <w:rPr>
           <w:color w:val="000000" w:themeColor="text1"/>
@@ -12190,7 +12467,7 @@
         </w:rPr>
       </w:pPr>
       <w:bookmarkStart w:id="68" w:name="_Ref528701074"/>
-      <w:bookmarkEnd w:id="62"/>
+      <w:bookmarkEnd w:id="63"/>
       <w:bookmarkEnd w:id="66"/>
       <w:r>
         <w:rPr>
@@ -12401,9 +12678,7 @@
       <w:pPr>
         <w:pStyle w:val="Prilog1"/>
       </w:pPr>
-      <w:bookmarkStart w:id="74" w:name="_Toc176203475"/>
-      <w:bookmarkStart w:id="75" w:name="_GoBack"/>
-      <w:bookmarkEnd w:id="75"/>
+      <w:bookmarkStart w:id="74" w:name="_Toc176299315"/>
       <w:r>
         <w:lastRenderedPageBreak/>
         <w:t>PRILOZI</w:t>
@@ -12414,7 +12689,7 @@
       <w:pPr>
         <w:pStyle w:val="Prilog2"/>
       </w:pPr>
-      <w:bookmarkStart w:id="76" w:name="_Toc176203476"/>
+      <w:bookmarkStart w:id="75" w:name="_Toc176299316"/>
       <w:r>
         <w:t>Kazalo slika</w:t>
       </w:r>
@@ -12427,17 +12702,17 @@
       <w:r>
         <w:t xml:space="preserve"> i kodova</w:t>
       </w:r>
+      <w:bookmarkEnd w:id="75"/>
+    </w:p>
+    <w:p>
+      <w:pPr>
+        <w:pStyle w:val="Prilog3"/>
+      </w:pPr>
+      <w:bookmarkStart w:id="76" w:name="_Toc176299317"/>
+      <w:r>
+        <w:t>Kazalo slika</w:t>
+      </w:r>
       <w:bookmarkEnd w:id="76"/>
-    </w:p>
-    <w:p>
-      <w:pPr>
-        <w:pStyle w:val="Prilog3"/>
-      </w:pPr>
-      <w:bookmarkStart w:id="77" w:name="_Toc176203477"/>
-      <w:r>
-        <w:t>Kazalo slika</w:t>
-      </w:r>
-      <w:bookmarkEnd w:id="77"/>
     </w:p>
     <w:p>
       <w:pPr>
@@ -13977,11 +14252,11 @@
       <w:pPr>
         <w:pStyle w:val="Prilog3"/>
       </w:pPr>
-      <w:bookmarkStart w:id="78" w:name="_Toc176203478"/>
+      <w:bookmarkStart w:id="77" w:name="_Toc176299318"/>
       <w:r>
         <w:t>Kazalo tablica</w:t>
       </w:r>
-      <w:bookmarkEnd w:id="78"/>
+      <w:bookmarkEnd w:id="77"/>
     </w:p>
     <w:p>
       <w:pPr>
@@ -14321,14 +14596,14 @@
       <w:pPr>
         <w:pStyle w:val="Prilog3"/>
       </w:pPr>
-      <w:bookmarkStart w:id="79" w:name="_Toc176203479"/>
+      <w:bookmarkStart w:id="78" w:name="_Toc176299319"/>
       <w:r>
         <w:t xml:space="preserve">Kazalo </w:t>
       </w:r>
       <w:r>
         <w:t>kodova</w:t>
       </w:r>
-      <w:bookmarkEnd w:id="79"/>
+      <w:bookmarkEnd w:id="78"/>
     </w:p>
     <w:p>
       <w:pPr>
@@ -14908,11 +15183,11 @@
       <w:pPr>
         <w:pStyle w:val="Prilog2"/>
       </w:pPr>
-      <w:bookmarkStart w:id="80" w:name="_Toc176203480"/>
+      <w:bookmarkStart w:id="79" w:name="_Toc176299320"/>
       <w:r>
         <w:t>Popis oznaka i kratica</w:t>
       </w:r>
-      <w:bookmarkEnd w:id="80"/>
+      <w:bookmarkEnd w:id="79"/>
     </w:p>
     <w:p>
       <w:r>
@@ -14968,23 +15243,25 @@
       <w:pPr>
         <w:pStyle w:val="Prilog2"/>
       </w:pPr>
-      <w:bookmarkStart w:id="81" w:name="_Toc176203481"/>
+      <w:bookmarkStart w:id="80" w:name="_Toc176299321"/>
       <w:r>
         <w:t>Ostali prilozi i dokumentacija</w:t>
       </w:r>
+      <w:bookmarkEnd w:id="80"/>
+    </w:p>
+    <w:p>
+      <w:pPr>
+        <w:pStyle w:val="Prilog3"/>
+      </w:pPr>
+      <w:bookmarkStart w:id="81" w:name="_Toc176299322"/>
+      <w:r>
+        <w:t xml:space="preserve">Kazalo </w:t>
+      </w:r>
+      <w:r>
+        <w:t>profesorovih napomena</w:t>
+      </w:r>
+      <w:bookmarkStart w:id="82" w:name="_GoBack"/>
       <w:bookmarkEnd w:id="81"/>
-    </w:p>
-    <w:p>
-      <w:pPr>
-        <w:pStyle w:val="Prilog3"/>
-      </w:pPr>
-      <w:bookmarkStart w:id="82" w:name="_Toc176203482"/>
-      <w:r>
-        <w:t xml:space="preserve">Kazalo </w:t>
-      </w:r>
-      <w:r>
-        <w:t>profesorovih napomena</w:t>
-      </w:r>
       <w:bookmarkEnd w:id="82"/>
     </w:p>
     <w:p>
@@ -15366,7 +15643,7 @@
       <w:pPr>
         <w:pStyle w:val="Prilog3"/>
       </w:pPr>
-      <w:bookmarkStart w:id="83" w:name="_Toc176203483"/>
+      <w:bookmarkStart w:id="83" w:name="_Toc176299323"/>
       <w:r>
         <w:t>Upravljanje izmjenama</w:t>
       </w:r>
@@ -19672,7 +19949,7 @@
       <w:pPr>
         <w:pStyle w:val="Prilog1"/>
       </w:pPr>
-      <w:bookmarkStart w:id="84" w:name="_Toc176203484"/>
+      <w:bookmarkStart w:id="84" w:name="_Toc176299324"/>
       <w:r>
         <w:lastRenderedPageBreak/>
         <w:t>SAŽETAK/ABSTRACT I KLJUČNE RIJEČI/KEYWORDS</w:t>
@@ -20242,7 +20519,7 @@
       <w:rPr>
         <w:noProof/>
       </w:rPr>
-      <w:t>38</w:t>
+      <w:t>41</w:t>
     </w:r>
     <w:r>
       <w:rPr>
@@ -25889,7 +26166,7 @@
 </file>
 
 <file path=customXml/itemProps1.xml><?xml version="1.0" encoding="utf-8"?>
-<ds:datastoreItem xmlns:ds="http://schemas.openxmlformats.org/officeDocument/2006/customXml" ds:itemID="{9FEDC93E-DCE0-4E0F-96EE-B840EA5E1B7C}">
+<ds:datastoreItem xmlns:ds="http://schemas.openxmlformats.org/officeDocument/2006/customXml" ds:itemID="{A4514D9D-27F0-4568-BFF8-2603DB67CB0B}">
   <ds:schemaRefs>
     <ds:schemaRef ds:uri="http://schemas.openxmlformats.org/officeDocument/2006/bibliography"/>
   </ds:schemaRefs>

</xml_diff>

<commit_message>
izbrisane nepotrebne stvari nakraju
</commit_message>
<xml_diff>
--- a/HOTEL_Documents/HotelManagment_IvaPleic.docx
+++ b/HOTEL_Documents/HotelManagment_IvaPleic.docx
@@ -15238,4723 +15238,20 @@
         <w:t>Universal Windows Platform</w:t>
       </w:r>
     </w:p>
-    <w:p/>
-    <w:p>
-      <w:pPr>
-        <w:pStyle w:val="Prilog2"/>
-      </w:pPr>
-      <w:bookmarkStart w:id="80" w:name="_Toc176299321"/>
-      <w:r>
-        <w:t>Ostali prilozi i dokumentacija</w:t>
-      </w:r>
+    <w:p>
+      <w:bookmarkStart w:id="80" w:name="_GoBack"/>
       <w:bookmarkEnd w:id="80"/>
     </w:p>
     <w:p>
       <w:pPr>
-        <w:pStyle w:val="Prilog3"/>
-      </w:pPr>
-      <w:bookmarkStart w:id="81" w:name="_Toc176299322"/>
-      <w:r>
-        <w:t xml:space="preserve">Kazalo </w:t>
-      </w:r>
-      <w:r>
-        <w:t>profesorovih napomena</w:t>
-      </w:r>
-      <w:bookmarkStart w:id="82" w:name="_GoBack"/>
-      <w:bookmarkEnd w:id="81"/>
-      <w:bookmarkEnd w:id="82"/>
-    </w:p>
-    <w:p>
-      <w:pPr>
-        <w:pStyle w:val="TableofFigures"/>
-        <w:tabs>
-          <w:tab w:val="right" w:leader="dot" w:pos="9061"/>
-        </w:tabs>
-        <w:rPr>
-          <w:rFonts w:asciiTheme="minorHAnsi" w:eastAsiaTheme="minorEastAsia" w:hAnsiTheme="minorHAnsi" w:cstheme="minorBidi"/>
-          <w:noProof/>
-          <w:sz w:val="22"/>
-          <w:szCs w:val="22"/>
-          <w:lang w:val="en-US"/>
-        </w:rPr>
-      </w:pPr>
-      <w:r>
-        <w:fldChar w:fldCharType="begin"/>
-      </w:r>
-      <w:r>
-        <w:instrText xml:space="preserve"> TOC \h \z \c "prof" </w:instrText>
-      </w:r>
-      <w:r>
-        <w:fldChar w:fldCharType="separate"/>
-      </w:r>
-      <w:hyperlink w:anchor="_Toc161996533" w:history="1">
-        <w:r>
-          <w:rPr>
-            <w:rStyle w:val="Hyperlink"/>
-            <w:noProof/>
-          </w:rPr>
-          <w:t>prof 1 Ova stranica se PRINTA BEZ potpisa a onda se POTPIŠE PLAVOM bojom (tako da potpis bude samo u pdf-verziji)</w:t>
-        </w:r>
-        <w:r>
-          <w:rPr>
-            <w:noProof/>
-            <w:webHidden/>
-          </w:rPr>
-          <w:tab/>
-        </w:r>
-        <w:r>
-          <w:rPr>
-            <w:noProof/>
-            <w:webHidden/>
-          </w:rPr>
-          <w:fldChar w:fldCharType="begin"/>
-        </w:r>
-        <w:r>
-          <w:rPr>
-            <w:noProof/>
-            <w:webHidden/>
-          </w:rPr>
-          <w:instrText xml:space="preserve"> PAGEREF _Toc161996533 \h </w:instrText>
-        </w:r>
-        <w:r>
-          <w:rPr>
-            <w:noProof/>
-            <w:webHidden/>
-          </w:rPr>
-        </w:r>
-        <w:r>
-          <w:rPr>
-            <w:noProof/>
-            <w:webHidden/>
-          </w:rPr>
-          <w:fldChar w:fldCharType="separate"/>
-        </w:r>
-        <w:r>
-          <w:rPr>
-            <w:noProof/>
-            <w:webHidden/>
-          </w:rPr>
-          <w:t>1</w:t>
-        </w:r>
-        <w:r>
-          <w:rPr>
-            <w:noProof/>
-            <w:webHidden/>
-          </w:rPr>
-          <w:fldChar w:fldCharType="end"/>
-        </w:r>
-      </w:hyperlink>
-    </w:p>
-    <w:p>
-      <w:pPr>
-        <w:pStyle w:val="TableofFigures"/>
-        <w:tabs>
-          <w:tab w:val="right" w:leader="dot" w:pos="9061"/>
-        </w:tabs>
-        <w:rPr>
-          <w:rFonts w:asciiTheme="minorHAnsi" w:eastAsiaTheme="minorEastAsia" w:hAnsiTheme="minorHAnsi" w:cstheme="minorBidi"/>
-          <w:noProof/>
-          <w:sz w:val="22"/>
-          <w:szCs w:val="22"/>
-          <w:lang w:val="en-US"/>
-        </w:rPr>
-      </w:pPr>
-      <w:hyperlink w:anchor="_Toc161996534" w:history="1">
-        <w:r>
-          <w:rPr>
-            <w:rStyle w:val="Hyperlink"/>
-            <w:noProof/>
-          </w:rPr>
-          <w:t>prof 2 I ova stranica se PRINTA BEZ potpisa a onda se POTPIŠE PLAVOM bojom (tako da potpis bude samo u pdf-verziji)</w:t>
-        </w:r>
-        <w:r>
-          <w:rPr>
-            <w:noProof/>
-            <w:webHidden/>
-          </w:rPr>
-          <w:tab/>
-        </w:r>
-        <w:r>
-          <w:rPr>
-            <w:noProof/>
-            <w:webHidden/>
-          </w:rPr>
-          <w:fldChar w:fldCharType="begin"/>
-        </w:r>
-        <w:r>
-          <w:rPr>
-            <w:noProof/>
-            <w:webHidden/>
-          </w:rPr>
-          <w:instrText xml:space="preserve"> PAGEREF _Toc161996534 \h </w:instrText>
-        </w:r>
-        <w:r>
-          <w:rPr>
-            <w:noProof/>
-            <w:webHidden/>
-          </w:rPr>
-        </w:r>
-        <w:r>
-          <w:rPr>
-            <w:noProof/>
-            <w:webHidden/>
-          </w:rPr>
-          <w:fldChar w:fldCharType="separate"/>
-        </w:r>
-        <w:r>
-          <w:rPr>
-            <w:noProof/>
-            <w:webHidden/>
-          </w:rPr>
-          <w:t>2</w:t>
-        </w:r>
-        <w:r>
-          <w:rPr>
-            <w:noProof/>
-            <w:webHidden/>
-          </w:rPr>
-          <w:fldChar w:fldCharType="end"/>
-        </w:r>
-      </w:hyperlink>
-    </w:p>
-    <w:p>
-      <w:pPr>
-        <w:pStyle w:val="TableofFigures"/>
-        <w:tabs>
-          <w:tab w:val="right" w:leader="dot" w:pos="9061"/>
-        </w:tabs>
-        <w:rPr>
-          <w:rFonts w:asciiTheme="minorHAnsi" w:eastAsiaTheme="minorEastAsia" w:hAnsiTheme="minorHAnsi" w:cstheme="minorBidi"/>
-          <w:noProof/>
-          <w:sz w:val="22"/>
-          <w:szCs w:val="22"/>
-          <w:lang w:val="en-US"/>
-        </w:rPr>
-      </w:pPr>
-      <w:hyperlink w:anchor="_Toc161996535" w:history="1">
-        <w:r>
-          <w:rPr>
-            <w:rStyle w:val="Hyperlink"/>
-            <w:noProof/>
-          </w:rPr>
-          <w:t>prof 3 Žutom bojom označeni tekst treba uskladiti (ILI je 'završni' ILI je 'diplomski' i skinuti boju)</w:t>
-        </w:r>
-        <w:r>
-          <w:rPr>
-            <w:noProof/>
-            <w:webHidden/>
-          </w:rPr>
-          <w:tab/>
-        </w:r>
-        <w:r>
-          <w:rPr>
-            <w:noProof/>
-            <w:webHidden/>
-          </w:rPr>
-          <w:fldChar w:fldCharType="begin"/>
-        </w:r>
-        <w:r>
-          <w:rPr>
-            <w:noProof/>
-            <w:webHidden/>
-          </w:rPr>
-          <w:instrText xml:space="preserve"> PAGEREF _Toc161996535 \h </w:instrText>
-        </w:r>
-        <w:r>
-          <w:rPr>
-            <w:noProof/>
-            <w:webHidden/>
-          </w:rPr>
-        </w:r>
-        <w:r>
-          <w:rPr>
-            <w:noProof/>
-            <w:webHidden/>
-          </w:rPr>
-          <w:fldChar w:fldCharType="separate"/>
-        </w:r>
-        <w:r>
-          <w:rPr>
-            <w:noProof/>
-            <w:webHidden/>
-          </w:rPr>
-          <w:t>2</w:t>
-        </w:r>
-        <w:r>
-          <w:rPr>
-            <w:noProof/>
-            <w:webHidden/>
-          </w:rPr>
-          <w:fldChar w:fldCharType="end"/>
-        </w:r>
-      </w:hyperlink>
-    </w:p>
-    <w:p>
-      <w:pPr>
-        <w:pStyle w:val="TableofFigures"/>
-        <w:tabs>
-          <w:tab w:val="right" w:leader="dot" w:pos="9061"/>
-        </w:tabs>
-        <w:rPr>
-          <w:rFonts w:asciiTheme="minorHAnsi" w:eastAsiaTheme="minorEastAsia" w:hAnsiTheme="minorHAnsi" w:cstheme="minorBidi"/>
-          <w:noProof/>
-          <w:sz w:val="22"/>
-          <w:szCs w:val="22"/>
-          <w:lang w:val="en-US"/>
-        </w:rPr>
-      </w:pPr>
-      <w:hyperlink w:anchor="_Toc161996536" w:history="1">
-        <w:r>
-          <w:rPr>
-            <w:rStyle w:val="Hyperlink"/>
-            <w:noProof/>
-          </w:rPr>
-          <w:t>prof 4 Komentar koji se odnosi na gornji paragraf, sliku, tablicu i sl.</w:t>
-        </w:r>
-        <w:r>
-          <w:rPr>
-            <w:noProof/>
-            <w:webHidden/>
-          </w:rPr>
-          <w:tab/>
-        </w:r>
-        <w:r>
-          <w:rPr>
-            <w:noProof/>
-            <w:webHidden/>
-          </w:rPr>
-          <w:fldChar w:fldCharType="begin"/>
-        </w:r>
-        <w:r>
-          <w:rPr>
-            <w:noProof/>
-            <w:webHidden/>
-          </w:rPr>
-          <w:instrText xml:space="preserve"> PAGEREF _Toc161996536 \h </w:instrText>
-        </w:r>
-        <w:r>
-          <w:rPr>
-            <w:noProof/>
-            <w:webHidden/>
-          </w:rPr>
-        </w:r>
-        <w:r>
-          <w:rPr>
-            <w:noProof/>
-            <w:webHidden/>
-          </w:rPr>
-          <w:fldChar w:fldCharType="separate"/>
-        </w:r>
-        <w:r>
-          <w:rPr>
-            <w:noProof/>
-            <w:webHidden/>
-          </w:rPr>
-          <w:t>23</w:t>
-        </w:r>
-        <w:r>
-          <w:rPr>
-            <w:noProof/>
-            <w:webHidden/>
-          </w:rPr>
-          <w:fldChar w:fldCharType="end"/>
-        </w:r>
-      </w:hyperlink>
-    </w:p>
-    <w:p>
-      <w:pPr>
-        <w:pStyle w:val="TableofFigures"/>
-        <w:tabs>
-          <w:tab w:val="right" w:leader="dot" w:pos="9061"/>
-        </w:tabs>
-        <w:rPr>
-          <w:rFonts w:asciiTheme="minorHAnsi" w:eastAsiaTheme="minorEastAsia" w:hAnsiTheme="minorHAnsi" w:cstheme="minorBidi"/>
-          <w:noProof/>
-          <w:sz w:val="22"/>
-          <w:szCs w:val="22"/>
-          <w:lang w:val="en-US"/>
-        </w:rPr>
-      </w:pPr>
-      <w:hyperlink w:anchor="_Toc161996537" w:history="1">
-        <w:r>
-          <w:rPr>
-            <w:rStyle w:val="Hyperlink"/>
-            <w:strike/>
-            <w:noProof/>
-          </w:rPr>
-          <w:t>prof 5 Komentar profesorov koji je student riješio</w:t>
-        </w:r>
-        <w:r>
-          <w:rPr>
-            <w:noProof/>
-            <w:webHidden/>
-          </w:rPr>
-          <w:tab/>
-        </w:r>
-        <w:r>
-          <w:rPr>
-            <w:noProof/>
-            <w:webHidden/>
-          </w:rPr>
-          <w:fldChar w:fldCharType="begin"/>
-        </w:r>
-        <w:r>
-          <w:rPr>
-            <w:noProof/>
-            <w:webHidden/>
-          </w:rPr>
-          <w:instrText xml:space="preserve"> PAGEREF _Toc161996537 \h </w:instrText>
-        </w:r>
-        <w:r>
-          <w:rPr>
-            <w:noProof/>
-            <w:webHidden/>
-          </w:rPr>
-        </w:r>
-        <w:r>
-          <w:rPr>
-            <w:noProof/>
-            <w:webHidden/>
-          </w:rPr>
-          <w:fldChar w:fldCharType="separate"/>
-        </w:r>
-        <w:r>
-          <w:rPr>
-            <w:noProof/>
-            <w:webHidden/>
-          </w:rPr>
-          <w:t>23</w:t>
-        </w:r>
-        <w:r>
-          <w:rPr>
-            <w:noProof/>
-            <w:webHidden/>
-          </w:rPr>
-          <w:fldChar w:fldCharType="end"/>
-        </w:r>
-      </w:hyperlink>
-    </w:p>
-    <w:p>
-      <w:r>
-        <w:fldChar w:fldCharType="end"/>
-      </w:r>
-    </w:p>
-    <w:p>
-      <w:pPr>
-        <w:pStyle w:val="Prilog3"/>
-      </w:pPr>
-      <w:bookmarkStart w:id="83" w:name="_Toc176299323"/>
-      <w:r>
-        <w:t>Upravljanje izmjenama</w:t>
-      </w:r>
-      <w:bookmarkEnd w:id="83"/>
-    </w:p>
-    <w:tbl>
-      <w:tblPr>
-        <w:tblW w:w="9648" w:type="dxa"/>
-        <w:tblLayout w:type="fixed"/>
-        <w:tblLook w:val="0000" w:firstRow="0" w:lastRow="0" w:firstColumn="0" w:lastColumn="0" w:noHBand="0" w:noVBand="0"/>
-      </w:tblPr>
-      <w:tblGrid>
-        <w:gridCol w:w="1242"/>
-        <w:gridCol w:w="1418"/>
-        <w:gridCol w:w="1565"/>
-        <w:gridCol w:w="1643"/>
-        <w:gridCol w:w="3780"/>
-      </w:tblGrid>
-      <w:tr>
-        <w:trPr>
-          <w:cantSplit/>
-        </w:trPr>
-        <w:tc>
-          <w:tcPr>
-            <w:tcW w:w="1242" w:type="dxa"/>
-            <w:tcBorders>
-              <w:bottom w:val="double" w:sz="6" w:space="0" w:color="auto"/>
-              <w:right w:val="single" w:sz="6" w:space="0" w:color="000000"/>
-            </w:tcBorders>
-          </w:tcPr>
-          <w:p>
-            <w:pPr>
-              <w:spacing w:after="0" w:line="240" w:lineRule="auto"/>
-              <w:jc w:val="center"/>
-              <w:rPr>
-                <w:sz w:val="20"/>
-                <w:lang w:val="de-DE"/>
-              </w:rPr>
-            </w:pPr>
-            <w:r>
-              <w:rPr>
-                <w:sz w:val="20"/>
-                <w:lang w:val="de-DE"/>
-              </w:rPr>
-              <w:t>OZNAKA</w:t>
-            </w:r>
-          </w:p>
-          <w:p>
-            <w:pPr>
-              <w:spacing w:after="0" w:line="240" w:lineRule="auto"/>
-              <w:jc w:val="center"/>
-              <w:rPr>
-                <w:sz w:val="20"/>
-                <w:lang w:val="de-DE"/>
-              </w:rPr>
-            </w:pPr>
-            <w:r>
-              <w:rPr>
-                <w:sz w:val="20"/>
-                <w:lang w:val="de-DE"/>
-              </w:rPr>
-              <w:t>VERZIJE</w:t>
-            </w:r>
-          </w:p>
-        </w:tc>
-        <w:tc>
-          <w:tcPr>
-            <w:tcW w:w="1418" w:type="dxa"/>
-            <w:tcBorders>
-              <w:left w:val="single" w:sz="6" w:space="0" w:color="000000"/>
-              <w:bottom w:val="double" w:sz="6" w:space="0" w:color="auto"/>
-              <w:right w:val="single" w:sz="6" w:space="0" w:color="000000"/>
-            </w:tcBorders>
-          </w:tcPr>
-          <w:p>
-            <w:pPr>
-              <w:spacing w:after="0" w:line="240" w:lineRule="auto"/>
-              <w:jc w:val="center"/>
-              <w:rPr>
-                <w:sz w:val="20"/>
-                <w:lang w:val="de-DE"/>
-              </w:rPr>
-            </w:pPr>
-            <w:r>
-              <w:rPr>
-                <w:sz w:val="20"/>
-                <w:lang w:val="de-DE"/>
-              </w:rPr>
-              <w:t>DATUM</w:t>
-            </w:r>
-          </w:p>
-        </w:tc>
-        <w:tc>
-          <w:tcPr>
-            <w:tcW w:w="1565" w:type="dxa"/>
-            <w:tcBorders>
-              <w:left w:val="single" w:sz="6" w:space="0" w:color="000000"/>
-              <w:bottom w:val="double" w:sz="6" w:space="0" w:color="auto"/>
-              <w:right w:val="single" w:sz="6" w:space="0" w:color="000000"/>
-            </w:tcBorders>
-          </w:tcPr>
-          <w:p>
-            <w:pPr>
-              <w:spacing w:after="0" w:line="240" w:lineRule="auto"/>
-              <w:jc w:val="center"/>
-              <w:rPr>
-                <w:sz w:val="20"/>
-                <w:lang w:val="de-DE"/>
-              </w:rPr>
-            </w:pPr>
-            <w:r>
-              <w:rPr>
-                <w:sz w:val="20"/>
-                <w:lang w:val="de-DE"/>
-              </w:rPr>
-              <w:t>PRIPREMIO</w:t>
-            </w:r>
-          </w:p>
-        </w:tc>
-        <w:tc>
-          <w:tcPr>
-            <w:tcW w:w="1643" w:type="dxa"/>
-            <w:tcBorders>
-              <w:left w:val="single" w:sz="6" w:space="0" w:color="000000"/>
-              <w:bottom w:val="double" w:sz="6" w:space="0" w:color="auto"/>
-              <w:right w:val="single" w:sz="6" w:space="0" w:color="000000"/>
-            </w:tcBorders>
-          </w:tcPr>
-          <w:p>
-            <w:pPr>
-              <w:spacing w:after="0" w:line="240" w:lineRule="auto"/>
-              <w:jc w:val="center"/>
-              <w:rPr>
-                <w:sz w:val="20"/>
-                <w:lang w:val="de-DE"/>
-              </w:rPr>
-            </w:pPr>
-            <w:r>
-              <w:rPr>
-                <w:sz w:val="20"/>
-                <w:lang w:val="de-DE"/>
-              </w:rPr>
-              <w:t>ODOBRIO</w:t>
-            </w:r>
-          </w:p>
-          <w:p>
-            <w:pPr>
-              <w:spacing w:after="0" w:line="240" w:lineRule="auto"/>
-              <w:jc w:val="center"/>
-              <w:rPr>
-                <w:sz w:val="20"/>
-                <w:lang w:val="de-DE"/>
-              </w:rPr>
-            </w:pPr>
-          </w:p>
-        </w:tc>
-        <w:tc>
-          <w:tcPr>
-            <w:tcW w:w="3780" w:type="dxa"/>
-            <w:tcBorders>
-              <w:left w:val="single" w:sz="6" w:space="0" w:color="000000"/>
-              <w:bottom w:val="double" w:sz="6" w:space="0" w:color="auto"/>
-            </w:tcBorders>
-          </w:tcPr>
-          <w:p>
-            <w:pPr>
-              <w:tabs>
-                <w:tab w:val="left" w:pos="5097"/>
-              </w:tabs>
-              <w:spacing w:after="0" w:line="240" w:lineRule="auto"/>
-              <w:ind w:right="72"/>
-              <w:jc w:val="center"/>
-              <w:rPr>
-                <w:sz w:val="20"/>
-                <w:lang w:val="de-DE"/>
-              </w:rPr>
-            </w:pPr>
-            <w:r>
-              <w:rPr>
-                <w:sz w:val="20"/>
-                <w:lang w:val="de-DE"/>
-              </w:rPr>
-              <w:t>KRATKI OPIS IZMJENA</w:t>
-            </w:r>
-          </w:p>
-        </w:tc>
-      </w:tr>
-      <w:tr>
-        <w:trPr>
-          <w:cantSplit/>
-        </w:trPr>
-        <w:tc>
-          <w:tcPr>
-            <w:tcW w:w="1242" w:type="dxa"/>
-            <w:tcBorders>
-              <w:right w:val="single" w:sz="6" w:space="0" w:color="000000"/>
-            </w:tcBorders>
-          </w:tcPr>
-          <w:p>
-            <w:pPr>
-              <w:spacing w:line="240" w:lineRule="auto"/>
-              <w:jc w:val="center"/>
-              <w:rPr>
-                <w:sz w:val="20"/>
-                <w:lang w:val="de-DE"/>
-              </w:rPr>
-            </w:pPr>
-            <w:r>
-              <w:rPr>
-                <w:sz w:val="20"/>
-                <w:lang w:val="de-DE"/>
-              </w:rPr>
-              <w:lastRenderedPageBreak/>
-              <w:t>7.3</w:t>
-            </w:r>
-          </w:p>
-        </w:tc>
-        <w:tc>
-          <w:tcPr>
-            <w:tcW w:w="1418" w:type="dxa"/>
-            <w:tcBorders>
-              <w:left w:val="single" w:sz="6" w:space="0" w:color="000000"/>
-              <w:right w:val="single" w:sz="6" w:space="0" w:color="000000"/>
-            </w:tcBorders>
-          </w:tcPr>
-          <w:p>
-            <w:pPr>
-              <w:spacing w:line="240" w:lineRule="auto"/>
-              <w:jc w:val="center"/>
-              <w:rPr>
-                <w:sz w:val="20"/>
-                <w:lang w:val="de-DE"/>
-              </w:rPr>
-            </w:pPr>
-            <w:r>
-              <w:rPr>
-                <w:sz w:val="20"/>
-                <w:lang w:val="de-DE"/>
-              </w:rPr>
-              <w:t>202</w:t>
-            </w:r>
-            <w:r>
-              <w:rPr>
-                <w:sz w:val="20"/>
-                <w:lang w:val="de-DE"/>
-              </w:rPr>
-              <w:t>4</w:t>
-            </w:r>
-            <w:r>
-              <w:rPr>
-                <w:sz w:val="20"/>
-                <w:lang w:val="de-DE"/>
-              </w:rPr>
-              <w:t>-0</w:t>
-            </w:r>
-            <w:r>
-              <w:rPr>
-                <w:sz w:val="20"/>
-                <w:lang w:val="de-DE"/>
-              </w:rPr>
-              <w:t>3</w:t>
-            </w:r>
-            <w:r>
-              <w:rPr>
-                <w:sz w:val="20"/>
-                <w:lang w:val="de-DE"/>
-              </w:rPr>
-              <w:t>-2</w:t>
-            </w:r>
-            <w:r>
-              <w:rPr>
-                <w:sz w:val="20"/>
-                <w:lang w:val="de-DE"/>
-              </w:rPr>
-              <w:t>2</w:t>
-            </w:r>
-          </w:p>
-        </w:tc>
-        <w:tc>
-          <w:tcPr>
-            <w:tcW w:w="1565" w:type="dxa"/>
-            <w:tcBorders>
-              <w:left w:val="single" w:sz="6" w:space="0" w:color="000000"/>
-              <w:right w:val="single" w:sz="6" w:space="0" w:color="000000"/>
-            </w:tcBorders>
-          </w:tcPr>
-          <w:p>
-            <w:pPr>
-              <w:spacing w:line="240" w:lineRule="auto"/>
-              <w:jc w:val="center"/>
-              <w:rPr>
-                <w:sz w:val="20"/>
-                <w:lang w:val="de-DE"/>
-              </w:rPr>
-            </w:pPr>
-            <w:r>
-              <w:rPr>
-                <w:sz w:val="20"/>
-                <w:lang w:val="de-DE"/>
-              </w:rPr>
-              <w:t>Stipe Čelar</w:t>
-            </w:r>
-          </w:p>
-        </w:tc>
-        <w:tc>
-          <w:tcPr>
-            <w:tcW w:w="1643" w:type="dxa"/>
-            <w:tcBorders>
-              <w:left w:val="single" w:sz="6" w:space="0" w:color="000000"/>
-              <w:right w:val="single" w:sz="6" w:space="0" w:color="000000"/>
-            </w:tcBorders>
-          </w:tcPr>
-          <w:p>
-            <w:pPr>
-              <w:spacing w:line="240" w:lineRule="auto"/>
-              <w:jc w:val="center"/>
-              <w:rPr>
-                <w:sz w:val="20"/>
-                <w:lang w:val="de-DE"/>
-              </w:rPr>
-            </w:pPr>
-            <w:r>
-              <w:rPr>
-                <w:sz w:val="20"/>
-                <w:lang w:val="de-DE"/>
-              </w:rPr>
-              <w:t>Stipe Čelar</w:t>
-            </w:r>
-          </w:p>
-        </w:tc>
-        <w:tc>
-          <w:tcPr>
-            <w:tcW w:w="3780" w:type="dxa"/>
-            <w:tcBorders>
-              <w:left w:val="single" w:sz="6" w:space="0" w:color="000000"/>
-            </w:tcBorders>
-          </w:tcPr>
-          <w:p>
-            <w:pPr>
-              <w:spacing w:line="240" w:lineRule="auto"/>
-              <w:jc w:val="left"/>
-              <w:rPr>
-                <w:sz w:val="20"/>
-                <w:lang w:val="pl-PL"/>
-              </w:rPr>
-            </w:pPr>
-            <w:r>
-              <w:rPr>
-                <w:sz w:val="20"/>
-                <w:lang w:val="pl-PL"/>
-              </w:rPr>
-              <w:t>Razine</w:t>
-            </w:r>
-            <w:r>
-              <w:rPr>
-                <w:sz w:val="20"/>
-                <w:lang w:val="pl-PL"/>
-              </w:rPr>
-              <w:t xml:space="preserve"> studijâ </w:t>
-            </w:r>
-            <w:r>
-              <w:rPr>
-                <w:sz w:val="20"/>
-                <w:lang w:val="pl-PL"/>
-              </w:rPr>
-              <w:t xml:space="preserve">na </w:t>
-            </w:r>
-            <w:r>
-              <w:rPr>
-                <w:sz w:val="20"/>
-                <w:lang w:val="pl-PL"/>
-              </w:rPr>
-              <w:t xml:space="preserve">obrascu ZADATAK </w:t>
-            </w:r>
-            <w:r>
-              <w:rPr>
-                <w:sz w:val="20"/>
-                <w:lang w:val="pl-PL"/>
-              </w:rPr>
-              <w:t>usklađen</w:t>
-            </w:r>
-            <w:r>
-              <w:rPr>
-                <w:sz w:val="20"/>
-                <w:lang w:val="pl-PL"/>
-              </w:rPr>
-              <w:t>e</w:t>
-            </w:r>
-            <w:r>
-              <w:rPr>
-                <w:sz w:val="20"/>
-                <w:lang w:val="pl-PL"/>
-              </w:rPr>
-              <w:t xml:space="preserve"> s novim ZVOZD-om</w:t>
-            </w:r>
-            <w:r>
-              <w:rPr>
-                <w:sz w:val="20"/>
-                <w:lang w:val="pl-PL"/>
-              </w:rPr>
-              <w:t xml:space="preserve"> (</w:t>
-            </w:r>
-            <w:r>
-              <w:rPr>
-                <w:sz w:val="20"/>
-                <w:lang w:val="pl-PL"/>
-              </w:rPr>
-              <w:t>‘sveučilišni prijediplomski’ i sveučilišni diplomski’)</w:t>
-            </w:r>
-            <w:r>
-              <w:rPr>
-                <w:sz w:val="20"/>
-                <w:lang w:val="pl-PL"/>
-              </w:rPr>
-              <w:t>.</w:t>
-            </w:r>
-          </w:p>
-          <w:p>
-            <w:pPr>
-              <w:spacing w:line="240" w:lineRule="auto"/>
-              <w:jc w:val="left"/>
-              <w:rPr>
-                <w:sz w:val="20"/>
-                <w:lang w:val="pl-PL"/>
-              </w:rPr>
-            </w:pPr>
-            <w:r>
-              <w:rPr>
-                <w:sz w:val="20"/>
-                <w:lang w:val="pl-PL"/>
-              </w:rPr>
-              <w:t>Iz galerije stilova o</w:t>
-            </w:r>
-            <w:r>
-              <w:rPr>
-                <w:sz w:val="20"/>
-                <w:lang w:val="pl-PL"/>
-              </w:rPr>
-              <w:t>brisani</w:t>
-            </w:r>
-            <w:r>
-              <w:rPr>
-                <w:sz w:val="20"/>
-                <w:lang w:val="pl-PL"/>
-              </w:rPr>
-              <w:t xml:space="preserve"> nepotrebni stilovi</w:t>
-            </w:r>
-          </w:p>
-          <w:p>
-            <w:pPr>
-              <w:spacing w:line="240" w:lineRule="auto"/>
-              <w:jc w:val="left"/>
-              <w:rPr>
-                <w:sz w:val="20"/>
-                <w:lang w:val="pl-PL"/>
-              </w:rPr>
-            </w:pPr>
-            <w:r>
-              <w:rPr>
-                <w:sz w:val="20"/>
-                <w:lang w:val="pl-PL"/>
-              </w:rPr>
-              <w:t>Pojašnjen</w:t>
-            </w:r>
-            <w:r>
-              <w:rPr>
-                <w:sz w:val="20"/>
-                <w:lang w:val="pl-PL"/>
-              </w:rPr>
-              <w:t xml:space="preserve"> način pisanja poglavja UVOD.</w:t>
-            </w:r>
-          </w:p>
-          <w:p>
-            <w:pPr>
-              <w:spacing w:line="240" w:lineRule="auto"/>
-              <w:jc w:val="left"/>
-              <w:rPr>
-                <w:sz w:val="20"/>
-                <w:lang w:val="pl-PL"/>
-              </w:rPr>
-            </w:pPr>
-            <w:r>
-              <w:rPr>
-                <w:sz w:val="20"/>
-                <w:lang w:val="pl-PL"/>
-              </w:rPr>
-              <w:t>Isključeno potpisivanje elektroničke verzije rada.</w:t>
-            </w:r>
-          </w:p>
-          <w:p>
-            <w:pPr>
-              <w:spacing w:line="240" w:lineRule="auto"/>
-              <w:jc w:val="left"/>
-              <w:rPr>
-                <w:sz w:val="20"/>
-                <w:lang w:val="pl-PL"/>
-              </w:rPr>
-            </w:pPr>
-            <w:r>
-              <w:rPr>
-                <w:sz w:val="20"/>
-                <w:lang w:val="pl-PL"/>
-              </w:rPr>
-              <w:t xml:space="preserve">Isključen </w:t>
-            </w:r>
-            <w:r>
-              <w:rPr>
-                <w:sz w:val="20"/>
-                <w:lang w:val="pl-PL"/>
-              </w:rPr>
-              <w:t>dio koji je tražio dostavljanje materijala na CD-u.</w:t>
-            </w:r>
-          </w:p>
-        </w:tc>
-      </w:tr>
-      <w:tr>
-        <w:trPr>
-          <w:cantSplit/>
-        </w:trPr>
-        <w:tc>
-          <w:tcPr>
-            <w:tcW w:w="1242" w:type="dxa"/>
-            <w:tcBorders>
-              <w:right w:val="single" w:sz="6" w:space="0" w:color="000000"/>
-            </w:tcBorders>
-          </w:tcPr>
-          <w:p>
-            <w:pPr>
-              <w:spacing w:line="240" w:lineRule="auto"/>
-              <w:jc w:val="center"/>
-              <w:rPr>
-                <w:sz w:val="20"/>
-                <w:lang w:val="de-DE"/>
-              </w:rPr>
-            </w:pPr>
-            <w:r>
-              <w:rPr>
-                <w:sz w:val="20"/>
-                <w:lang w:val="de-DE"/>
-              </w:rPr>
-              <w:t>7.2</w:t>
-            </w:r>
-          </w:p>
-        </w:tc>
-        <w:tc>
-          <w:tcPr>
-            <w:tcW w:w="1418" w:type="dxa"/>
-            <w:tcBorders>
-              <w:left w:val="single" w:sz="6" w:space="0" w:color="000000"/>
-              <w:right w:val="single" w:sz="6" w:space="0" w:color="000000"/>
-            </w:tcBorders>
-          </w:tcPr>
-          <w:p>
-            <w:pPr>
-              <w:spacing w:line="240" w:lineRule="auto"/>
-              <w:jc w:val="center"/>
-              <w:rPr>
-                <w:sz w:val="20"/>
-                <w:lang w:val="de-DE"/>
-              </w:rPr>
-            </w:pPr>
-            <w:r>
-              <w:rPr>
-                <w:sz w:val="20"/>
-                <w:lang w:val="de-DE"/>
-              </w:rPr>
-              <w:t>2023-03-01</w:t>
-            </w:r>
-          </w:p>
-        </w:tc>
-        <w:tc>
-          <w:tcPr>
-            <w:tcW w:w="1565" w:type="dxa"/>
-            <w:tcBorders>
-              <w:left w:val="single" w:sz="6" w:space="0" w:color="000000"/>
-              <w:right w:val="single" w:sz="6" w:space="0" w:color="000000"/>
-            </w:tcBorders>
-          </w:tcPr>
-          <w:p>
-            <w:pPr>
-              <w:spacing w:line="240" w:lineRule="auto"/>
-              <w:jc w:val="center"/>
-              <w:rPr>
-                <w:sz w:val="20"/>
-                <w:lang w:val="de-DE"/>
-              </w:rPr>
-            </w:pPr>
-            <w:r>
-              <w:rPr>
-                <w:sz w:val="20"/>
-                <w:lang w:val="de-DE"/>
-              </w:rPr>
-              <w:t>Stipe Čelar</w:t>
-            </w:r>
-          </w:p>
-        </w:tc>
-        <w:tc>
-          <w:tcPr>
-            <w:tcW w:w="1643" w:type="dxa"/>
-            <w:tcBorders>
-              <w:left w:val="single" w:sz="6" w:space="0" w:color="000000"/>
-              <w:right w:val="single" w:sz="6" w:space="0" w:color="000000"/>
-            </w:tcBorders>
-          </w:tcPr>
-          <w:p>
-            <w:pPr>
-              <w:spacing w:line="240" w:lineRule="auto"/>
-              <w:jc w:val="center"/>
-              <w:rPr>
-                <w:sz w:val="20"/>
-                <w:lang w:val="de-DE"/>
-              </w:rPr>
-            </w:pPr>
-            <w:r>
-              <w:rPr>
-                <w:sz w:val="20"/>
-                <w:lang w:val="de-DE"/>
-              </w:rPr>
-              <w:t>Stipe Čelar</w:t>
-            </w:r>
-          </w:p>
-        </w:tc>
-        <w:tc>
-          <w:tcPr>
-            <w:tcW w:w="3780" w:type="dxa"/>
-            <w:tcBorders>
-              <w:left w:val="single" w:sz="6" w:space="0" w:color="000000"/>
-            </w:tcBorders>
-          </w:tcPr>
-          <w:p>
-            <w:pPr>
-              <w:spacing w:line="240" w:lineRule="auto"/>
-              <w:jc w:val="left"/>
-              <w:rPr>
-                <w:sz w:val="20"/>
-                <w:lang w:val="pl-PL"/>
-              </w:rPr>
-            </w:pPr>
-            <w:r>
-              <w:rPr>
-                <w:sz w:val="20"/>
-                <w:lang w:val="pl-PL"/>
-              </w:rPr>
-              <w:t>Stari logo Sveučilišta je zamijenjen novim</w:t>
-            </w:r>
-          </w:p>
-        </w:tc>
-      </w:tr>
-      <w:tr>
-        <w:trPr>
-          <w:cantSplit/>
-        </w:trPr>
-        <w:tc>
-          <w:tcPr>
-            <w:tcW w:w="1242" w:type="dxa"/>
-            <w:tcBorders>
-              <w:right w:val="single" w:sz="6" w:space="0" w:color="000000"/>
-            </w:tcBorders>
-          </w:tcPr>
-          <w:p>
-            <w:pPr>
-              <w:spacing w:line="240" w:lineRule="auto"/>
-              <w:jc w:val="center"/>
-              <w:rPr>
-                <w:sz w:val="20"/>
-                <w:lang w:val="de-DE"/>
-              </w:rPr>
-            </w:pPr>
-            <w:r>
-              <w:rPr>
-                <w:sz w:val="20"/>
-                <w:lang w:val="de-DE"/>
-              </w:rPr>
-              <w:t>7.1</w:t>
-            </w:r>
-          </w:p>
-        </w:tc>
-        <w:tc>
-          <w:tcPr>
-            <w:tcW w:w="1418" w:type="dxa"/>
-            <w:tcBorders>
-              <w:left w:val="single" w:sz="6" w:space="0" w:color="000000"/>
-              <w:right w:val="single" w:sz="6" w:space="0" w:color="000000"/>
-            </w:tcBorders>
-          </w:tcPr>
-          <w:p>
-            <w:pPr>
-              <w:spacing w:line="240" w:lineRule="auto"/>
-              <w:jc w:val="center"/>
-              <w:rPr>
-                <w:sz w:val="20"/>
-                <w:lang w:val="de-DE"/>
-              </w:rPr>
-            </w:pPr>
-            <w:r>
-              <w:rPr>
-                <w:sz w:val="20"/>
-                <w:lang w:val="de-DE"/>
-              </w:rPr>
-              <w:t>2022-08-20</w:t>
-            </w:r>
-          </w:p>
-        </w:tc>
-        <w:tc>
-          <w:tcPr>
-            <w:tcW w:w="1565" w:type="dxa"/>
-            <w:tcBorders>
-              <w:left w:val="single" w:sz="6" w:space="0" w:color="000000"/>
-              <w:right w:val="single" w:sz="6" w:space="0" w:color="000000"/>
-            </w:tcBorders>
-          </w:tcPr>
-          <w:p>
-            <w:pPr>
-              <w:spacing w:line="240" w:lineRule="auto"/>
-              <w:jc w:val="center"/>
-              <w:rPr>
-                <w:sz w:val="20"/>
-                <w:lang w:val="de-DE"/>
-              </w:rPr>
-            </w:pPr>
-            <w:r>
-              <w:rPr>
-                <w:sz w:val="20"/>
-                <w:lang w:val="de-DE"/>
-              </w:rPr>
-              <w:t>Stipe Čelar</w:t>
-            </w:r>
-          </w:p>
-        </w:tc>
-        <w:tc>
-          <w:tcPr>
-            <w:tcW w:w="1643" w:type="dxa"/>
-            <w:tcBorders>
-              <w:left w:val="single" w:sz="6" w:space="0" w:color="000000"/>
-              <w:right w:val="single" w:sz="6" w:space="0" w:color="000000"/>
-            </w:tcBorders>
-          </w:tcPr>
-          <w:p>
-            <w:pPr>
-              <w:spacing w:line="240" w:lineRule="auto"/>
-              <w:jc w:val="center"/>
-              <w:rPr>
-                <w:sz w:val="20"/>
-                <w:lang w:val="de-DE"/>
-              </w:rPr>
-            </w:pPr>
-            <w:r>
-              <w:rPr>
-                <w:sz w:val="20"/>
-                <w:lang w:val="de-DE"/>
-              </w:rPr>
-              <w:t>Stipe Čelar</w:t>
-            </w:r>
-          </w:p>
-        </w:tc>
-        <w:tc>
-          <w:tcPr>
-            <w:tcW w:w="3780" w:type="dxa"/>
-            <w:tcBorders>
-              <w:left w:val="single" w:sz="6" w:space="0" w:color="000000"/>
-            </w:tcBorders>
-          </w:tcPr>
-          <w:p>
-            <w:pPr>
-              <w:spacing w:line="240" w:lineRule="auto"/>
-              <w:jc w:val="left"/>
-              <w:rPr>
-                <w:sz w:val="20"/>
-                <w:lang w:val="pl-PL"/>
-              </w:rPr>
-            </w:pPr>
-            <w:r>
-              <w:rPr>
-                <w:sz w:val="20"/>
-                <w:lang w:val="pl-PL"/>
-              </w:rPr>
-              <w:t>U IZJAVI su naglašene riječi u ženskom i muškom rodu (</w:t>
-            </w:r>
-            <w:r>
-              <w:rPr>
-                <w:sz w:val="20"/>
-                <w:highlight w:val="yellow"/>
-                <w:lang w:val="pl-PL"/>
-              </w:rPr>
-              <w:t>žutom bojom</w:t>
-            </w:r>
-            <w:r>
-              <w:rPr>
-                <w:sz w:val="20"/>
-                <w:lang w:val="pl-PL"/>
-              </w:rPr>
-              <w:t>) – potrebno je odabrati odgovarajući;</w:t>
-            </w:r>
-            <w:r>
-              <w:rPr>
-                <w:sz w:val="20"/>
-                <w:lang w:val="pl-PL"/>
-              </w:rPr>
-              <w:br/>
-              <w:t>U naslovnici i ZADATKU su naglašene riječi ZAVRŠNI i DIPLOMSKI (</w:t>
-            </w:r>
-            <w:r>
-              <w:rPr>
-                <w:sz w:val="20"/>
-                <w:highlight w:val="yellow"/>
-                <w:lang w:val="pl-PL"/>
-              </w:rPr>
-              <w:t>žutom bojom</w:t>
-            </w:r>
-            <w:r>
-              <w:rPr>
-                <w:sz w:val="20"/>
-                <w:lang w:val="pl-PL"/>
-              </w:rPr>
-              <w:t>) – potrebno je eventualno odabrati odgovarajuću</w:t>
-            </w:r>
-            <w:r>
-              <w:rPr>
-                <w:sz w:val="20"/>
-                <w:lang w:val="pl-PL"/>
-              </w:rPr>
-              <w:br/>
-              <w:t xml:space="preserve">Istaknute su napomene za pisanje </w:t>
-            </w:r>
-            <w:r>
-              <w:rPr>
-                <w:i/>
-                <w:sz w:val="20"/>
-                <w:lang w:val="pl-PL"/>
-              </w:rPr>
-              <w:t>sažetka</w:t>
-            </w:r>
-            <w:r>
-              <w:rPr>
-                <w:sz w:val="20"/>
-                <w:lang w:val="pl-PL"/>
-              </w:rPr>
-              <w:t xml:space="preserve"> i </w:t>
-            </w:r>
-            <w:r>
-              <w:rPr>
-                <w:i/>
-                <w:sz w:val="20"/>
-                <w:lang w:val="pl-PL"/>
-              </w:rPr>
-              <w:t>ključnih riječi</w:t>
-            </w:r>
-          </w:p>
-        </w:tc>
-      </w:tr>
-      <w:tr>
-        <w:trPr>
-          <w:cantSplit/>
-        </w:trPr>
-        <w:tc>
-          <w:tcPr>
-            <w:tcW w:w="1242" w:type="dxa"/>
-            <w:tcBorders>
-              <w:right w:val="single" w:sz="6" w:space="0" w:color="000000"/>
-            </w:tcBorders>
-          </w:tcPr>
-          <w:p>
-            <w:pPr>
-              <w:spacing w:line="240" w:lineRule="auto"/>
-              <w:jc w:val="center"/>
-              <w:rPr>
-                <w:sz w:val="20"/>
-                <w:lang w:val="de-DE"/>
-              </w:rPr>
-            </w:pPr>
-            <w:r>
-              <w:rPr>
-                <w:sz w:val="20"/>
-                <w:lang w:val="de-DE"/>
-              </w:rPr>
-              <w:t>7.0</w:t>
-            </w:r>
-          </w:p>
-        </w:tc>
-        <w:tc>
-          <w:tcPr>
-            <w:tcW w:w="1418" w:type="dxa"/>
-            <w:tcBorders>
-              <w:left w:val="single" w:sz="6" w:space="0" w:color="000000"/>
-              <w:right w:val="single" w:sz="6" w:space="0" w:color="000000"/>
-            </w:tcBorders>
-          </w:tcPr>
-          <w:p>
-            <w:pPr>
-              <w:spacing w:line="240" w:lineRule="auto"/>
-              <w:jc w:val="center"/>
-              <w:rPr>
-                <w:sz w:val="20"/>
-                <w:lang w:val="de-DE"/>
-              </w:rPr>
-            </w:pPr>
-            <w:r>
-              <w:rPr>
-                <w:sz w:val="20"/>
-                <w:lang w:val="de-DE"/>
-              </w:rPr>
-              <w:t>2022-03-18</w:t>
-            </w:r>
-          </w:p>
-        </w:tc>
-        <w:tc>
-          <w:tcPr>
-            <w:tcW w:w="1565" w:type="dxa"/>
-            <w:tcBorders>
-              <w:left w:val="single" w:sz="6" w:space="0" w:color="000000"/>
-              <w:right w:val="single" w:sz="6" w:space="0" w:color="000000"/>
-            </w:tcBorders>
-          </w:tcPr>
-          <w:p>
-            <w:pPr>
-              <w:spacing w:line="240" w:lineRule="auto"/>
-              <w:jc w:val="center"/>
-              <w:rPr>
-                <w:sz w:val="20"/>
-                <w:lang w:val="de-DE"/>
-              </w:rPr>
-            </w:pPr>
-            <w:r>
-              <w:rPr>
-                <w:sz w:val="20"/>
-                <w:lang w:val="de-DE"/>
-              </w:rPr>
-              <w:t>Stipe Čelar</w:t>
-            </w:r>
-          </w:p>
-        </w:tc>
-        <w:tc>
-          <w:tcPr>
-            <w:tcW w:w="1643" w:type="dxa"/>
-            <w:tcBorders>
-              <w:left w:val="single" w:sz="6" w:space="0" w:color="000000"/>
-              <w:right w:val="single" w:sz="6" w:space="0" w:color="000000"/>
-            </w:tcBorders>
-          </w:tcPr>
-          <w:p>
-            <w:pPr>
-              <w:spacing w:line="240" w:lineRule="auto"/>
-              <w:jc w:val="center"/>
-              <w:rPr>
-                <w:sz w:val="20"/>
-                <w:lang w:val="de-DE"/>
-              </w:rPr>
-            </w:pPr>
-            <w:r>
-              <w:rPr>
-                <w:sz w:val="20"/>
-                <w:lang w:val="de-DE"/>
-              </w:rPr>
-              <w:t>Stipe Čelar</w:t>
-            </w:r>
-          </w:p>
-        </w:tc>
-        <w:tc>
-          <w:tcPr>
-            <w:tcW w:w="3780" w:type="dxa"/>
-            <w:tcBorders>
-              <w:left w:val="single" w:sz="6" w:space="0" w:color="000000"/>
-            </w:tcBorders>
-          </w:tcPr>
-          <w:p>
-            <w:pPr>
-              <w:spacing w:line="240" w:lineRule="auto"/>
-              <w:jc w:val="left"/>
-              <w:rPr>
-                <w:sz w:val="20"/>
-                <w:lang w:val="pl-PL"/>
-              </w:rPr>
-            </w:pPr>
-            <w:r>
-              <w:rPr>
-                <w:sz w:val="20"/>
-                <w:lang w:val="pl-PL"/>
-              </w:rPr>
-              <w:t>Numeriranje počinje tek od poglavlja UVOD;</w:t>
-            </w:r>
-            <w:r>
-              <w:rPr>
-                <w:sz w:val="20"/>
-                <w:lang w:val="pl-PL"/>
-              </w:rPr>
-              <w:br/>
-              <w:t>U IZJAVI su naglašene riječi ZAVRŠNI i  DIPLOMSKI (</w:t>
-            </w:r>
-            <w:r>
-              <w:rPr>
-                <w:sz w:val="20"/>
-                <w:highlight w:val="yellow"/>
-                <w:lang w:val="pl-PL"/>
-              </w:rPr>
-              <w:t>žutom bojom</w:t>
-            </w:r>
-            <w:r>
-              <w:rPr>
-                <w:sz w:val="20"/>
-                <w:lang w:val="pl-PL"/>
-              </w:rPr>
-              <w:t>) – potrebno je odabrati odgovarajuću</w:t>
-            </w:r>
-          </w:p>
-        </w:tc>
-      </w:tr>
-      <w:tr>
-        <w:trPr>
-          <w:cantSplit/>
-        </w:trPr>
-        <w:tc>
-          <w:tcPr>
-            <w:tcW w:w="1242" w:type="dxa"/>
-            <w:tcBorders>
-              <w:right w:val="single" w:sz="6" w:space="0" w:color="000000"/>
-            </w:tcBorders>
-          </w:tcPr>
-          <w:p>
-            <w:pPr>
-              <w:spacing w:line="240" w:lineRule="auto"/>
-              <w:jc w:val="center"/>
-              <w:rPr>
-                <w:sz w:val="20"/>
-                <w:lang w:val="de-DE"/>
-              </w:rPr>
-            </w:pPr>
-            <w:r>
-              <w:rPr>
-                <w:sz w:val="20"/>
-                <w:lang w:val="de-DE"/>
-              </w:rPr>
-              <w:t>6.9</w:t>
-            </w:r>
-          </w:p>
-        </w:tc>
-        <w:tc>
-          <w:tcPr>
-            <w:tcW w:w="1418" w:type="dxa"/>
-            <w:tcBorders>
-              <w:left w:val="single" w:sz="6" w:space="0" w:color="000000"/>
-              <w:right w:val="single" w:sz="6" w:space="0" w:color="000000"/>
-            </w:tcBorders>
-          </w:tcPr>
-          <w:p>
-            <w:pPr>
-              <w:spacing w:line="240" w:lineRule="auto"/>
-              <w:jc w:val="center"/>
-              <w:rPr>
-                <w:sz w:val="20"/>
-                <w:lang w:val="de-DE"/>
-              </w:rPr>
-            </w:pPr>
-            <w:r>
-              <w:rPr>
-                <w:sz w:val="20"/>
-                <w:lang w:val="de-DE"/>
-              </w:rPr>
-              <w:t>2021-06-23</w:t>
-            </w:r>
-          </w:p>
-        </w:tc>
-        <w:tc>
-          <w:tcPr>
-            <w:tcW w:w="1565" w:type="dxa"/>
-            <w:tcBorders>
-              <w:left w:val="single" w:sz="6" w:space="0" w:color="000000"/>
-              <w:right w:val="single" w:sz="6" w:space="0" w:color="000000"/>
-            </w:tcBorders>
-          </w:tcPr>
-          <w:p>
-            <w:pPr>
-              <w:spacing w:line="240" w:lineRule="auto"/>
-              <w:jc w:val="center"/>
-              <w:rPr>
-                <w:sz w:val="20"/>
-                <w:lang w:val="de-DE"/>
-              </w:rPr>
-            </w:pPr>
-            <w:r>
-              <w:rPr>
-                <w:sz w:val="20"/>
-                <w:lang w:val="de-DE"/>
-              </w:rPr>
-              <w:t>Stipe Čelar</w:t>
-            </w:r>
-          </w:p>
-        </w:tc>
-        <w:tc>
-          <w:tcPr>
-            <w:tcW w:w="1643" w:type="dxa"/>
-            <w:tcBorders>
-              <w:left w:val="single" w:sz="6" w:space="0" w:color="000000"/>
-              <w:right w:val="single" w:sz="6" w:space="0" w:color="000000"/>
-            </w:tcBorders>
-          </w:tcPr>
-          <w:p>
-            <w:pPr>
-              <w:spacing w:line="240" w:lineRule="auto"/>
-              <w:jc w:val="center"/>
-              <w:rPr>
-                <w:sz w:val="20"/>
-                <w:lang w:val="de-DE"/>
-              </w:rPr>
-            </w:pPr>
-            <w:r>
-              <w:rPr>
-                <w:sz w:val="20"/>
-                <w:lang w:val="de-DE"/>
-              </w:rPr>
-              <w:t>Stipe Čelar</w:t>
-            </w:r>
-          </w:p>
-        </w:tc>
-        <w:tc>
-          <w:tcPr>
-            <w:tcW w:w="3780" w:type="dxa"/>
-            <w:tcBorders>
-              <w:left w:val="single" w:sz="6" w:space="0" w:color="000000"/>
-            </w:tcBorders>
-          </w:tcPr>
-          <w:p>
-            <w:pPr>
-              <w:spacing w:line="240" w:lineRule="auto"/>
-              <w:jc w:val="left"/>
-              <w:rPr>
-                <w:sz w:val="20"/>
-                <w:lang w:val="pl-PL"/>
-              </w:rPr>
-            </w:pPr>
-            <w:r>
-              <w:rPr>
-                <w:sz w:val="20"/>
-                <w:lang w:val="pl-PL"/>
-              </w:rPr>
-              <w:t>Dodano poglavlje ZAKLJUČAK (razina 1); poglavlja ‘Upravljanje izmjenama’ i ‘Kazalo profeosorvih napomena’ stavljeni kao potpoglavlja u ‘Ostale priloge i dokumentaciju’</w:t>
-            </w:r>
-          </w:p>
-        </w:tc>
-      </w:tr>
-      <w:tr>
-        <w:trPr>
-          <w:cantSplit/>
-        </w:trPr>
-        <w:tc>
-          <w:tcPr>
-            <w:tcW w:w="1242" w:type="dxa"/>
-            <w:tcBorders>
-              <w:right w:val="single" w:sz="6" w:space="0" w:color="000000"/>
-            </w:tcBorders>
-          </w:tcPr>
-          <w:p>
-            <w:pPr>
-              <w:spacing w:line="240" w:lineRule="auto"/>
-              <w:jc w:val="center"/>
-              <w:rPr>
-                <w:sz w:val="20"/>
-                <w:lang w:val="de-DE"/>
-              </w:rPr>
-            </w:pPr>
-            <w:r>
-              <w:rPr>
-                <w:sz w:val="20"/>
-                <w:lang w:val="de-DE"/>
-              </w:rPr>
-              <w:t>6.8</w:t>
-            </w:r>
-          </w:p>
-        </w:tc>
-        <w:tc>
-          <w:tcPr>
-            <w:tcW w:w="1418" w:type="dxa"/>
-            <w:tcBorders>
-              <w:left w:val="single" w:sz="6" w:space="0" w:color="000000"/>
-              <w:right w:val="single" w:sz="6" w:space="0" w:color="000000"/>
-            </w:tcBorders>
-          </w:tcPr>
-          <w:p>
-            <w:pPr>
-              <w:spacing w:line="240" w:lineRule="auto"/>
-              <w:jc w:val="center"/>
-              <w:rPr>
-                <w:sz w:val="20"/>
-                <w:lang w:val="de-DE"/>
-              </w:rPr>
-            </w:pPr>
-            <w:r>
-              <w:rPr>
-                <w:sz w:val="20"/>
-                <w:lang w:val="de-DE"/>
-              </w:rPr>
-              <w:t>2020-07-27</w:t>
-            </w:r>
-          </w:p>
-        </w:tc>
-        <w:tc>
-          <w:tcPr>
-            <w:tcW w:w="1565" w:type="dxa"/>
-            <w:tcBorders>
-              <w:left w:val="single" w:sz="6" w:space="0" w:color="000000"/>
-              <w:right w:val="single" w:sz="6" w:space="0" w:color="000000"/>
-            </w:tcBorders>
-          </w:tcPr>
-          <w:p>
-            <w:pPr>
-              <w:spacing w:line="240" w:lineRule="auto"/>
-              <w:jc w:val="center"/>
-              <w:rPr>
-                <w:sz w:val="20"/>
-                <w:lang w:val="de-DE"/>
-              </w:rPr>
-            </w:pPr>
-            <w:r>
-              <w:rPr>
-                <w:sz w:val="20"/>
-                <w:lang w:val="de-DE"/>
-              </w:rPr>
-              <w:t>Stipe Čelar</w:t>
-            </w:r>
-          </w:p>
-        </w:tc>
-        <w:tc>
-          <w:tcPr>
-            <w:tcW w:w="1643" w:type="dxa"/>
-            <w:tcBorders>
-              <w:left w:val="single" w:sz="6" w:space="0" w:color="000000"/>
-              <w:right w:val="single" w:sz="6" w:space="0" w:color="000000"/>
-            </w:tcBorders>
-          </w:tcPr>
-          <w:p>
-            <w:pPr>
-              <w:spacing w:line="240" w:lineRule="auto"/>
-              <w:jc w:val="center"/>
-              <w:rPr>
-                <w:sz w:val="20"/>
-                <w:lang w:val="de-DE"/>
-              </w:rPr>
-            </w:pPr>
-            <w:r>
-              <w:rPr>
-                <w:sz w:val="20"/>
-                <w:lang w:val="de-DE"/>
-              </w:rPr>
-              <w:t>Stipe Čelar</w:t>
-            </w:r>
-          </w:p>
-        </w:tc>
-        <w:tc>
-          <w:tcPr>
-            <w:tcW w:w="3780" w:type="dxa"/>
-            <w:tcBorders>
-              <w:left w:val="single" w:sz="6" w:space="0" w:color="000000"/>
-            </w:tcBorders>
-          </w:tcPr>
-          <w:p>
-            <w:pPr>
-              <w:spacing w:line="240" w:lineRule="auto"/>
-              <w:jc w:val="left"/>
-              <w:rPr>
-                <w:sz w:val="20"/>
-                <w:lang w:val="pl-PL"/>
-              </w:rPr>
-            </w:pPr>
-            <w:r>
-              <w:rPr>
-                <w:sz w:val="20"/>
-                <w:lang w:val="pl-PL"/>
-              </w:rPr>
-              <w:t>Uključene napomene za printanje sa i bez potpisa na ZADATKU i IZJAVI</w:t>
-            </w:r>
-          </w:p>
-        </w:tc>
-      </w:tr>
-      <w:tr>
-        <w:trPr>
-          <w:cantSplit/>
-        </w:trPr>
-        <w:tc>
-          <w:tcPr>
-            <w:tcW w:w="1242" w:type="dxa"/>
-            <w:tcBorders>
-              <w:right w:val="single" w:sz="6" w:space="0" w:color="000000"/>
-            </w:tcBorders>
-          </w:tcPr>
-          <w:p>
-            <w:pPr>
-              <w:spacing w:line="240" w:lineRule="auto"/>
-              <w:jc w:val="center"/>
-              <w:rPr>
-                <w:sz w:val="20"/>
-                <w:lang w:val="de-DE"/>
-              </w:rPr>
-            </w:pPr>
-            <w:r>
-              <w:rPr>
-                <w:sz w:val="20"/>
-                <w:lang w:val="de-DE"/>
-              </w:rPr>
-              <w:t>6.7</w:t>
-            </w:r>
-          </w:p>
-        </w:tc>
-        <w:tc>
-          <w:tcPr>
-            <w:tcW w:w="1418" w:type="dxa"/>
-            <w:tcBorders>
-              <w:left w:val="single" w:sz="6" w:space="0" w:color="000000"/>
-              <w:right w:val="single" w:sz="6" w:space="0" w:color="000000"/>
-            </w:tcBorders>
-          </w:tcPr>
-          <w:p>
-            <w:pPr>
-              <w:spacing w:line="240" w:lineRule="auto"/>
-              <w:jc w:val="center"/>
-              <w:rPr>
-                <w:sz w:val="20"/>
-                <w:lang w:val="de-DE"/>
-              </w:rPr>
-            </w:pPr>
-            <w:r>
-              <w:rPr>
-                <w:sz w:val="20"/>
-                <w:lang w:val="de-DE"/>
-              </w:rPr>
-              <w:t>2020-05-11</w:t>
-            </w:r>
-          </w:p>
-        </w:tc>
-        <w:tc>
-          <w:tcPr>
-            <w:tcW w:w="1565" w:type="dxa"/>
-            <w:tcBorders>
-              <w:left w:val="single" w:sz="6" w:space="0" w:color="000000"/>
-              <w:right w:val="single" w:sz="6" w:space="0" w:color="000000"/>
-            </w:tcBorders>
-          </w:tcPr>
-          <w:p>
-            <w:pPr>
-              <w:spacing w:line="240" w:lineRule="auto"/>
-              <w:jc w:val="center"/>
-              <w:rPr>
-                <w:sz w:val="20"/>
-                <w:lang w:val="de-DE"/>
-              </w:rPr>
-            </w:pPr>
-            <w:r>
-              <w:rPr>
-                <w:sz w:val="20"/>
-                <w:lang w:val="de-DE"/>
-              </w:rPr>
-              <w:t>Stipe Čelar</w:t>
-            </w:r>
-          </w:p>
-        </w:tc>
-        <w:tc>
-          <w:tcPr>
-            <w:tcW w:w="1643" w:type="dxa"/>
-            <w:tcBorders>
-              <w:left w:val="single" w:sz="6" w:space="0" w:color="000000"/>
-              <w:right w:val="single" w:sz="6" w:space="0" w:color="000000"/>
-            </w:tcBorders>
-          </w:tcPr>
-          <w:p>
-            <w:pPr>
-              <w:spacing w:line="240" w:lineRule="auto"/>
-              <w:jc w:val="center"/>
-              <w:rPr>
-                <w:sz w:val="20"/>
-                <w:lang w:val="de-DE"/>
-              </w:rPr>
-            </w:pPr>
-            <w:r>
-              <w:rPr>
-                <w:sz w:val="20"/>
-                <w:lang w:val="de-DE"/>
-              </w:rPr>
-              <w:t>Stipe Čelar</w:t>
-            </w:r>
-          </w:p>
-        </w:tc>
-        <w:tc>
-          <w:tcPr>
-            <w:tcW w:w="3780" w:type="dxa"/>
-            <w:tcBorders>
-              <w:left w:val="single" w:sz="6" w:space="0" w:color="000000"/>
-            </w:tcBorders>
-          </w:tcPr>
-          <w:p>
-            <w:pPr>
-              <w:spacing w:line="240" w:lineRule="auto"/>
-              <w:jc w:val="left"/>
-              <w:rPr>
-                <w:sz w:val="20"/>
-                <w:lang w:val="pl-PL"/>
-              </w:rPr>
-            </w:pPr>
-            <w:r>
-              <w:rPr>
-                <w:sz w:val="20"/>
-                <w:lang w:val="pl-PL"/>
-              </w:rPr>
-              <w:t>Korigirano poravnanje na naslovnici i prof. zvanja</w:t>
-            </w:r>
-          </w:p>
-        </w:tc>
-      </w:tr>
-      <w:tr>
-        <w:trPr>
-          <w:cantSplit/>
-        </w:trPr>
-        <w:tc>
-          <w:tcPr>
-            <w:tcW w:w="1242" w:type="dxa"/>
-            <w:tcBorders>
-              <w:right w:val="single" w:sz="6" w:space="0" w:color="000000"/>
-            </w:tcBorders>
-          </w:tcPr>
-          <w:p>
-            <w:pPr>
-              <w:spacing w:line="240" w:lineRule="auto"/>
-              <w:jc w:val="center"/>
-              <w:rPr>
-                <w:sz w:val="20"/>
-                <w:lang w:val="de-DE"/>
-              </w:rPr>
-            </w:pPr>
-            <w:r>
-              <w:rPr>
-                <w:sz w:val="20"/>
-                <w:lang w:val="de-DE"/>
-              </w:rPr>
-              <w:t>6.6</w:t>
-            </w:r>
-          </w:p>
-        </w:tc>
-        <w:tc>
-          <w:tcPr>
-            <w:tcW w:w="1418" w:type="dxa"/>
-            <w:tcBorders>
-              <w:left w:val="single" w:sz="6" w:space="0" w:color="000000"/>
-              <w:right w:val="single" w:sz="6" w:space="0" w:color="000000"/>
-            </w:tcBorders>
-          </w:tcPr>
-          <w:p>
-            <w:pPr>
-              <w:spacing w:line="240" w:lineRule="auto"/>
-              <w:jc w:val="center"/>
-              <w:rPr>
-                <w:sz w:val="20"/>
-                <w:lang w:val="de-DE"/>
-              </w:rPr>
-            </w:pPr>
-            <w:r>
-              <w:rPr>
-                <w:sz w:val="20"/>
-                <w:lang w:val="de-DE"/>
-              </w:rPr>
-              <w:t>2020-01-27</w:t>
-            </w:r>
-          </w:p>
-        </w:tc>
-        <w:tc>
-          <w:tcPr>
-            <w:tcW w:w="1565" w:type="dxa"/>
-            <w:tcBorders>
-              <w:left w:val="single" w:sz="6" w:space="0" w:color="000000"/>
-              <w:right w:val="single" w:sz="6" w:space="0" w:color="000000"/>
-            </w:tcBorders>
-          </w:tcPr>
-          <w:p>
-            <w:pPr>
-              <w:spacing w:line="240" w:lineRule="auto"/>
-              <w:jc w:val="center"/>
-              <w:rPr>
-                <w:sz w:val="20"/>
-                <w:lang w:val="de-DE"/>
-              </w:rPr>
-            </w:pPr>
-            <w:r>
-              <w:rPr>
-                <w:sz w:val="20"/>
-                <w:lang w:val="de-DE"/>
-              </w:rPr>
-              <w:t>Stipe Čelar</w:t>
-            </w:r>
-          </w:p>
-        </w:tc>
-        <w:tc>
-          <w:tcPr>
-            <w:tcW w:w="1643" w:type="dxa"/>
-            <w:tcBorders>
-              <w:left w:val="single" w:sz="6" w:space="0" w:color="000000"/>
-              <w:right w:val="single" w:sz="6" w:space="0" w:color="000000"/>
-            </w:tcBorders>
-          </w:tcPr>
-          <w:p>
-            <w:pPr>
-              <w:spacing w:line="240" w:lineRule="auto"/>
-              <w:jc w:val="center"/>
-              <w:rPr>
-                <w:sz w:val="20"/>
-                <w:lang w:val="de-DE"/>
-              </w:rPr>
-            </w:pPr>
-            <w:r>
-              <w:rPr>
-                <w:sz w:val="20"/>
-                <w:lang w:val="de-DE"/>
-              </w:rPr>
-              <w:t>Stipe Čelar</w:t>
-            </w:r>
-          </w:p>
-        </w:tc>
-        <w:tc>
-          <w:tcPr>
-            <w:tcW w:w="3780" w:type="dxa"/>
-            <w:tcBorders>
-              <w:left w:val="single" w:sz="6" w:space="0" w:color="000000"/>
-            </w:tcBorders>
-          </w:tcPr>
-          <w:p>
-            <w:pPr>
-              <w:spacing w:line="240" w:lineRule="auto"/>
-              <w:jc w:val="left"/>
-              <w:rPr>
-                <w:sz w:val="20"/>
-                <w:lang w:val="pl-PL"/>
-              </w:rPr>
-            </w:pPr>
-            <w:r>
-              <w:rPr>
-                <w:sz w:val="20"/>
-                <w:lang w:val="pl-PL"/>
-              </w:rPr>
-              <w:t>Napravljena zasebna hijerarhija oznaka za literaturu, priloge i sažetak – bez brojeva</w:t>
-            </w:r>
-          </w:p>
-        </w:tc>
-      </w:tr>
-      <w:tr>
-        <w:trPr>
-          <w:cantSplit/>
-        </w:trPr>
-        <w:tc>
-          <w:tcPr>
-            <w:tcW w:w="1242" w:type="dxa"/>
-            <w:tcBorders>
-              <w:right w:val="single" w:sz="6" w:space="0" w:color="000000"/>
-            </w:tcBorders>
-          </w:tcPr>
-          <w:p>
-            <w:pPr>
-              <w:spacing w:line="240" w:lineRule="auto"/>
-              <w:jc w:val="center"/>
-              <w:rPr>
-                <w:sz w:val="20"/>
-                <w:lang w:val="de-DE"/>
-              </w:rPr>
-            </w:pPr>
-            <w:r>
-              <w:rPr>
-                <w:sz w:val="20"/>
-                <w:lang w:val="de-DE"/>
-              </w:rPr>
-              <w:t>6.57</w:t>
-            </w:r>
-          </w:p>
-        </w:tc>
-        <w:tc>
-          <w:tcPr>
-            <w:tcW w:w="1418" w:type="dxa"/>
-            <w:tcBorders>
-              <w:left w:val="single" w:sz="6" w:space="0" w:color="000000"/>
-              <w:right w:val="single" w:sz="6" w:space="0" w:color="000000"/>
-            </w:tcBorders>
-          </w:tcPr>
-          <w:p>
-            <w:pPr>
-              <w:spacing w:line="240" w:lineRule="auto"/>
-              <w:jc w:val="center"/>
-              <w:rPr>
-                <w:sz w:val="20"/>
-                <w:lang w:val="de-DE"/>
-              </w:rPr>
-            </w:pPr>
-            <w:r>
-              <w:rPr>
-                <w:sz w:val="20"/>
-                <w:lang w:val="de-DE"/>
-              </w:rPr>
-              <w:t>2019-01-16</w:t>
-            </w:r>
-          </w:p>
-        </w:tc>
-        <w:tc>
-          <w:tcPr>
-            <w:tcW w:w="1565" w:type="dxa"/>
-            <w:tcBorders>
-              <w:left w:val="single" w:sz="6" w:space="0" w:color="000000"/>
-              <w:right w:val="single" w:sz="6" w:space="0" w:color="000000"/>
-            </w:tcBorders>
-          </w:tcPr>
-          <w:p>
-            <w:pPr>
-              <w:spacing w:line="240" w:lineRule="auto"/>
-              <w:jc w:val="center"/>
-              <w:rPr>
-                <w:sz w:val="20"/>
-                <w:lang w:val="de-DE"/>
-              </w:rPr>
-            </w:pPr>
-            <w:r>
-              <w:rPr>
-                <w:sz w:val="20"/>
-                <w:lang w:val="de-DE"/>
-              </w:rPr>
-              <w:t>Stipe Čelar</w:t>
-            </w:r>
-          </w:p>
-        </w:tc>
-        <w:tc>
-          <w:tcPr>
-            <w:tcW w:w="1643" w:type="dxa"/>
-            <w:tcBorders>
-              <w:left w:val="single" w:sz="6" w:space="0" w:color="000000"/>
-              <w:right w:val="single" w:sz="6" w:space="0" w:color="000000"/>
-            </w:tcBorders>
-          </w:tcPr>
-          <w:p>
-            <w:pPr>
-              <w:spacing w:line="240" w:lineRule="auto"/>
-              <w:jc w:val="center"/>
-              <w:rPr>
-                <w:sz w:val="20"/>
-                <w:lang w:val="de-DE"/>
-              </w:rPr>
-            </w:pPr>
-            <w:r>
-              <w:rPr>
-                <w:sz w:val="20"/>
-                <w:lang w:val="de-DE"/>
-              </w:rPr>
-              <w:t>Stipe Čelar</w:t>
-            </w:r>
-          </w:p>
-        </w:tc>
-        <w:tc>
-          <w:tcPr>
-            <w:tcW w:w="3780" w:type="dxa"/>
-            <w:tcBorders>
-              <w:left w:val="single" w:sz="6" w:space="0" w:color="000000"/>
-            </w:tcBorders>
-          </w:tcPr>
-          <w:p>
-            <w:pPr>
-              <w:spacing w:line="240" w:lineRule="auto"/>
-              <w:jc w:val="left"/>
-              <w:rPr>
-                <w:sz w:val="20"/>
-                <w:lang w:val="pl-PL"/>
-              </w:rPr>
-            </w:pPr>
-            <w:r>
-              <w:rPr>
-                <w:sz w:val="20"/>
-                <w:lang w:val="pl-PL"/>
-              </w:rPr>
-              <w:t>Napomene za ručno upisane informacije na CD-u</w:t>
-            </w:r>
-          </w:p>
-          <w:p>
-            <w:pPr>
-              <w:spacing w:line="240" w:lineRule="auto"/>
-              <w:jc w:val="left"/>
-              <w:rPr>
-                <w:sz w:val="20"/>
-                <w:lang w:val="pl-PL"/>
-              </w:rPr>
-            </w:pPr>
-            <w:r>
-              <w:rPr>
-                <w:sz w:val="20"/>
-                <w:lang w:val="pl-PL"/>
-              </w:rPr>
-              <w:t>Dodao poglavlje o profesorovim komentarima</w:t>
-            </w:r>
-          </w:p>
-        </w:tc>
-      </w:tr>
-      <w:tr>
-        <w:trPr>
-          <w:cantSplit/>
-        </w:trPr>
-        <w:tc>
-          <w:tcPr>
-            <w:tcW w:w="1242" w:type="dxa"/>
-            <w:tcBorders>
-              <w:right w:val="single" w:sz="6" w:space="0" w:color="000000"/>
-            </w:tcBorders>
-          </w:tcPr>
-          <w:p>
-            <w:pPr>
-              <w:spacing w:line="240" w:lineRule="auto"/>
-              <w:jc w:val="center"/>
-              <w:rPr>
-                <w:sz w:val="20"/>
-                <w:lang w:val="de-DE"/>
-              </w:rPr>
-            </w:pPr>
-            <w:r>
-              <w:rPr>
-                <w:sz w:val="20"/>
-                <w:lang w:val="de-DE"/>
-              </w:rPr>
-              <w:lastRenderedPageBreak/>
-              <w:t>6.56</w:t>
-            </w:r>
-          </w:p>
-        </w:tc>
-        <w:tc>
-          <w:tcPr>
-            <w:tcW w:w="1418" w:type="dxa"/>
-            <w:tcBorders>
-              <w:left w:val="single" w:sz="6" w:space="0" w:color="000000"/>
-              <w:right w:val="single" w:sz="6" w:space="0" w:color="000000"/>
-            </w:tcBorders>
-          </w:tcPr>
-          <w:p>
-            <w:pPr>
-              <w:spacing w:line="240" w:lineRule="auto"/>
-              <w:jc w:val="center"/>
-              <w:rPr>
-                <w:sz w:val="20"/>
-                <w:lang w:val="de-DE"/>
-              </w:rPr>
-            </w:pPr>
-            <w:r>
-              <w:rPr>
-                <w:sz w:val="20"/>
-                <w:lang w:val="de-DE"/>
-              </w:rPr>
-              <w:t>2018-02-20</w:t>
-            </w:r>
-          </w:p>
-        </w:tc>
-        <w:tc>
-          <w:tcPr>
-            <w:tcW w:w="1565" w:type="dxa"/>
-            <w:tcBorders>
-              <w:left w:val="single" w:sz="6" w:space="0" w:color="000000"/>
-              <w:right w:val="single" w:sz="6" w:space="0" w:color="000000"/>
-            </w:tcBorders>
-          </w:tcPr>
-          <w:p>
-            <w:pPr>
-              <w:spacing w:line="240" w:lineRule="auto"/>
-              <w:jc w:val="center"/>
-              <w:rPr>
-                <w:sz w:val="20"/>
-                <w:lang w:val="de-DE"/>
-              </w:rPr>
-            </w:pPr>
-            <w:r>
-              <w:rPr>
-                <w:sz w:val="20"/>
-                <w:lang w:val="de-DE"/>
-              </w:rPr>
-              <w:t>Stipe Čelar</w:t>
-            </w:r>
-          </w:p>
-        </w:tc>
-        <w:tc>
-          <w:tcPr>
-            <w:tcW w:w="1643" w:type="dxa"/>
-            <w:tcBorders>
-              <w:left w:val="single" w:sz="6" w:space="0" w:color="000000"/>
-              <w:right w:val="single" w:sz="6" w:space="0" w:color="000000"/>
-            </w:tcBorders>
-          </w:tcPr>
-          <w:p>
-            <w:pPr>
-              <w:spacing w:line="240" w:lineRule="auto"/>
-              <w:jc w:val="center"/>
-              <w:rPr>
-                <w:sz w:val="20"/>
-                <w:lang w:val="de-DE"/>
-              </w:rPr>
-            </w:pPr>
-            <w:r>
-              <w:rPr>
-                <w:sz w:val="20"/>
-                <w:lang w:val="de-DE"/>
-              </w:rPr>
-              <w:t>Stipe Čelar</w:t>
-            </w:r>
-          </w:p>
-        </w:tc>
-        <w:tc>
-          <w:tcPr>
-            <w:tcW w:w="3780" w:type="dxa"/>
-            <w:tcBorders>
-              <w:left w:val="single" w:sz="6" w:space="0" w:color="000000"/>
-            </w:tcBorders>
-          </w:tcPr>
-          <w:p>
-            <w:pPr>
-              <w:spacing w:line="240" w:lineRule="auto"/>
-              <w:jc w:val="left"/>
-              <w:rPr>
-                <w:sz w:val="20"/>
-                <w:lang w:val="pl-PL"/>
-              </w:rPr>
-            </w:pPr>
-            <w:r>
-              <w:rPr>
-                <w:sz w:val="20"/>
-                <w:lang w:val="pl-PL"/>
-              </w:rPr>
-              <w:t>Stavljena IZJAVA student/ice o samostalnom radu;</w:t>
-            </w:r>
-            <w:r>
-              <w:rPr>
-                <w:sz w:val="20"/>
-                <w:lang w:val="pl-PL"/>
-              </w:rPr>
-              <w:br/>
-              <w:t xml:space="preserve">odvajanje ključnih riječi </w:t>
-            </w:r>
-            <w:r>
-              <w:rPr>
-                <w:b/>
-                <w:sz w:val="20"/>
-                <w:lang w:val="pl-PL"/>
-              </w:rPr>
-              <w:t xml:space="preserve">zarezom </w:t>
-            </w:r>
-            <w:r>
-              <w:rPr>
-                <w:sz w:val="20"/>
-                <w:lang w:val="pl-PL"/>
-              </w:rPr>
-              <w:t xml:space="preserve">(,) umjesto </w:t>
-            </w:r>
-            <w:r>
-              <w:rPr>
-                <w:b/>
-                <w:sz w:val="20"/>
-                <w:lang w:val="pl-PL"/>
-              </w:rPr>
-              <w:t>točka-zarez</w:t>
-            </w:r>
-            <w:r>
-              <w:rPr>
-                <w:b/>
-                <w:sz w:val="20"/>
-                <w:lang w:val="pl-PL"/>
-              </w:rPr>
-              <w:t>om</w:t>
-            </w:r>
-            <w:r>
-              <w:rPr>
-                <w:sz w:val="20"/>
-                <w:lang w:val="pl-PL"/>
-              </w:rPr>
-              <w:t xml:space="preserve"> (;)</w:t>
-            </w:r>
-            <w:r>
-              <w:rPr>
-                <w:sz w:val="20"/>
-                <w:lang w:val="pl-PL"/>
-              </w:rPr>
-              <w:br/>
-              <w:t xml:space="preserve">uključen je naslov radnje na engleskom na stranici s </w:t>
-            </w:r>
-            <w:r>
-              <w:rPr>
-                <w:b/>
-                <w:sz w:val="20"/>
-                <w:lang w:val="pl-PL"/>
-              </w:rPr>
-              <w:t>abstractom</w:t>
-            </w:r>
-          </w:p>
-        </w:tc>
-      </w:tr>
-      <w:tr>
-        <w:trPr>
-          <w:cantSplit/>
-        </w:trPr>
-        <w:tc>
-          <w:tcPr>
-            <w:tcW w:w="1242" w:type="dxa"/>
-            <w:tcBorders>
-              <w:right w:val="single" w:sz="6" w:space="0" w:color="000000"/>
-            </w:tcBorders>
-          </w:tcPr>
-          <w:p>
-            <w:pPr>
-              <w:spacing w:line="240" w:lineRule="auto"/>
-              <w:jc w:val="center"/>
-              <w:rPr>
-                <w:sz w:val="20"/>
-                <w:lang w:val="de-DE"/>
-              </w:rPr>
-            </w:pPr>
-            <w:r>
-              <w:rPr>
-                <w:sz w:val="20"/>
-                <w:lang w:val="de-DE"/>
-              </w:rPr>
-              <w:t>6.55</w:t>
-            </w:r>
-          </w:p>
-        </w:tc>
-        <w:tc>
-          <w:tcPr>
-            <w:tcW w:w="1418" w:type="dxa"/>
-            <w:tcBorders>
-              <w:left w:val="single" w:sz="6" w:space="0" w:color="000000"/>
-              <w:right w:val="single" w:sz="6" w:space="0" w:color="000000"/>
-            </w:tcBorders>
-          </w:tcPr>
-          <w:p>
-            <w:pPr>
-              <w:spacing w:line="240" w:lineRule="auto"/>
-              <w:jc w:val="center"/>
-              <w:rPr>
-                <w:sz w:val="20"/>
-                <w:lang w:val="de-DE"/>
-              </w:rPr>
-            </w:pPr>
-            <w:r>
-              <w:rPr>
-                <w:sz w:val="20"/>
-                <w:lang w:val="de-DE"/>
-              </w:rPr>
-              <w:t>2015-03-05</w:t>
-            </w:r>
-          </w:p>
-        </w:tc>
-        <w:tc>
-          <w:tcPr>
-            <w:tcW w:w="1565" w:type="dxa"/>
-            <w:tcBorders>
-              <w:left w:val="single" w:sz="6" w:space="0" w:color="000000"/>
-              <w:right w:val="single" w:sz="6" w:space="0" w:color="000000"/>
-            </w:tcBorders>
-          </w:tcPr>
-          <w:p>
-            <w:pPr>
-              <w:spacing w:line="240" w:lineRule="auto"/>
-              <w:jc w:val="center"/>
-              <w:rPr>
-                <w:sz w:val="20"/>
-                <w:lang w:val="de-DE"/>
-              </w:rPr>
-            </w:pPr>
-            <w:r>
-              <w:rPr>
-                <w:sz w:val="20"/>
-                <w:lang w:val="de-DE"/>
-              </w:rPr>
-              <w:t>Stipe Čelar</w:t>
-            </w:r>
-          </w:p>
-        </w:tc>
-        <w:tc>
-          <w:tcPr>
-            <w:tcW w:w="1643" w:type="dxa"/>
-            <w:tcBorders>
-              <w:left w:val="single" w:sz="6" w:space="0" w:color="000000"/>
-              <w:right w:val="single" w:sz="6" w:space="0" w:color="000000"/>
-            </w:tcBorders>
-          </w:tcPr>
-          <w:p>
-            <w:pPr>
-              <w:spacing w:line="240" w:lineRule="auto"/>
-              <w:jc w:val="center"/>
-              <w:rPr>
-                <w:sz w:val="20"/>
-                <w:lang w:val="de-DE"/>
-              </w:rPr>
-            </w:pPr>
-            <w:r>
-              <w:rPr>
-                <w:sz w:val="20"/>
-                <w:lang w:val="de-DE"/>
-              </w:rPr>
-              <w:t>Stipe Čelar</w:t>
-            </w:r>
-          </w:p>
-        </w:tc>
-        <w:tc>
-          <w:tcPr>
-            <w:tcW w:w="3780" w:type="dxa"/>
-            <w:tcBorders>
-              <w:left w:val="single" w:sz="6" w:space="0" w:color="000000"/>
-            </w:tcBorders>
-          </w:tcPr>
-          <w:p>
-            <w:pPr>
-              <w:spacing w:line="240" w:lineRule="auto"/>
-              <w:jc w:val="left"/>
-              <w:rPr>
-                <w:sz w:val="20"/>
-                <w:lang w:val="pl-PL"/>
-              </w:rPr>
-            </w:pPr>
-            <w:r>
-              <w:rPr>
-                <w:sz w:val="20"/>
-                <w:lang w:val="pl-PL"/>
-              </w:rPr>
-              <w:t>Stavljena adresa popisa diplomiranih studenata po mentorima i studijima</w:t>
-            </w:r>
-          </w:p>
-        </w:tc>
-      </w:tr>
-      <w:tr>
-        <w:trPr>
-          <w:cantSplit/>
-        </w:trPr>
-        <w:tc>
-          <w:tcPr>
-            <w:tcW w:w="1242" w:type="dxa"/>
-            <w:tcBorders>
-              <w:right w:val="single" w:sz="6" w:space="0" w:color="000000"/>
-            </w:tcBorders>
-          </w:tcPr>
-          <w:p>
-            <w:pPr>
-              <w:spacing w:line="240" w:lineRule="auto"/>
-              <w:jc w:val="center"/>
-              <w:rPr>
-                <w:sz w:val="20"/>
-                <w:lang w:val="de-DE"/>
-              </w:rPr>
-            </w:pPr>
-            <w:r>
-              <w:rPr>
-                <w:sz w:val="20"/>
-                <w:lang w:val="de-DE"/>
-              </w:rPr>
-              <w:t>6.54</w:t>
-            </w:r>
-          </w:p>
-        </w:tc>
-        <w:tc>
-          <w:tcPr>
-            <w:tcW w:w="1418" w:type="dxa"/>
-            <w:tcBorders>
-              <w:left w:val="single" w:sz="6" w:space="0" w:color="000000"/>
-              <w:right w:val="single" w:sz="6" w:space="0" w:color="000000"/>
-            </w:tcBorders>
-          </w:tcPr>
-          <w:p>
-            <w:pPr>
-              <w:spacing w:line="240" w:lineRule="auto"/>
-              <w:jc w:val="center"/>
-              <w:rPr>
-                <w:sz w:val="20"/>
-                <w:lang w:val="de-DE"/>
-              </w:rPr>
-            </w:pPr>
-            <w:r>
-              <w:rPr>
-                <w:sz w:val="20"/>
-                <w:lang w:val="de-DE"/>
-              </w:rPr>
-              <w:t>2014-10-07</w:t>
-            </w:r>
-          </w:p>
-        </w:tc>
-        <w:tc>
-          <w:tcPr>
-            <w:tcW w:w="1565" w:type="dxa"/>
-            <w:tcBorders>
-              <w:left w:val="single" w:sz="6" w:space="0" w:color="000000"/>
-              <w:right w:val="single" w:sz="6" w:space="0" w:color="000000"/>
-            </w:tcBorders>
-          </w:tcPr>
-          <w:p>
-            <w:pPr>
-              <w:spacing w:line="240" w:lineRule="auto"/>
-              <w:jc w:val="center"/>
-              <w:rPr>
-                <w:sz w:val="20"/>
-                <w:lang w:val="de-DE"/>
-              </w:rPr>
-            </w:pPr>
-            <w:r>
-              <w:rPr>
-                <w:sz w:val="20"/>
-                <w:lang w:val="de-DE"/>
-              </w:rPr>
-              <w:t>Stipe Čelar</w:t>
-            </w:r>
-          </w:p>
-        </w:tc>
-        <w:tc>
-          <w:tcPr>
-            <w:tcW w:w="1643" w:type="dxa"/>
-            <w:tcBorders>
-              <w:left w:val="single" w:sz="6" w:space="0" w:color="000000"/>
-              <w:right w:val="single" w:sz="6" w:space="0" w:color="000000"/>
-            </w:tcBorders>
-          </w:tcPr>
-          <w:p>
-            <w:pPr>
-              <w:spacing w:line="240" w:lineRule="auto"/>
-              <w:jc w:val="center"/>
-              <w:rPr>
-                <w:sz w:val="20"/>
-                <w:lang w:val="de-DE"/>
-              </w:rPr>
-            </w:pPr>
-            <w:r>
-              <w:rPr>
-                <w:sz w:val="20"/>
-                <w:lang w:val="de-DE"/>
-              </w:rPr>
-              <w:t>Stipe Čelar</w:t>
-            </w:r>
-          </w:p>
-        </w:tc>
-        <w:tc>
-          <w:tcPr>
-            <w:tcW w:w="3780" w:type="dxa"/>
-            <w:tcBorders>
-              <w:left w:val="single" w:sz="6" w:space="0" w:color="000000"/>
-            </w:tcBorders>
-          </w:tcPr>
-          <w:p>
-            <w:pPr>
-              <w:spacing w:line="240" w:lineRule="auto"/>
-              <w:jc w:val="left"/>
-              <w:rPr>
-                <w:sz w:val="20"/>
-                <w:lang w:val="pl-PL"/>
-              </w:rPr>
-            </w:pPr>
-            <w:r>
-              <w:rPr>
-                <w:sz w:val="20"/>
-                <w:lang w:val="pl-PL"/>
-              </w:rPr>
-              <w:t>Na početak ubačena naslovnica, omot CD-a i ZADATAK</w:t>
-            </w:r>
-          </w:p>
-        </w:tc>
-      </w:tr>
-      <w:tr>
-        <w:trPr>
-          <w:cantSplit/>
-        </w:trPr>
-        <w:tc>
-          <w:tcPr>
-            <w:tcW w:w="1242" w:type="dxa"/>
-            <w:tcBorders>
-              <w:right w:val="single" w:sz="6" w:space="0" w:color="000000"/>
-            </w:tcBorders>
-          </w:tcPr>
-          <w:p>
-            <w:pPr>
-              <w:spacing w:line="240" w:lineRule="auto"/>
-              <w:jc w:val="center"/>
-              <w:rPr>
-                <w:sz w:val="20"/>
-                <w:lang w:val="de-DE"/>
-              </w:rPr>
-            </w:pPr>
-            <w:r>
-              <w:rPr>
-                <w:sz w:val="20"/>
-                <w:lang w:val="de-DE"/>
-              </w:rPr>
-              <w:t>6.53</w:t>
-            </w:r>
-          </w:p>
-        </w:tc>
-        <w:tc>
-          <w:tcPr>
-            <w:tcW w:w="1418" w:type="dxa"/>
-            <w:tcBorders>
-              <w:left w:val="single" w:sz="6" w:space="0" w:color="000000"/>
-              <w:right w:val="single" w:sz="6" w:space="0" w:color="000000"/>
-            </w:tcBorders>
-          </w:tcPr>
-          <w:p>
-            <w:pPr>
-              <w:spacing w:line="240" w:lineRule="auto"/>
-              <w:jc w:val="center"/>
-              <w:rPr>
-                <w:sz w:val="20"/>
-                <w:lang w:val="de-DE"/>
-              </w:rPr>
-            </w:pPr>
-            <w:r>
-              <w:rPr>
-                <w:sz w:val="20"/>
-                <w:lang w:val="de-DE"/>
-              </w:rPr>
-              <w:t>2014-09-19</w:t>
-            </w:r>
-          </w:p>
-        </w:tc>
-        <w:tc>
-          <w:tcPr>
-            <w:tcW w:w="1565" w:type="dxa"/>
-            <w:tcBorders>
-              <w:left w:val="single" w:sz="6" w:space="0" w:color="000000"/>
-              <w:right w:val="single" w:sz="6" w:space="0" w:color="000000"/>
-            </w:tcBorders>
-          </w:tcPr>
-          <w:p>
-            <w:pPr>
-              <w:spacing w:line="240" w:lineRule="auto"/>
-              <w:jc w:val="center"/>
-              <w:rPr>
-                <w:sz w:val="20"/>
-                <w:lang w:val="de-DE"/>
-              </w:rPr>
-            </w:pPr>
-            <w:r>
-              <w:rPr>
-                <w:sz w:val="20"/>
-                <w:lang w:val="de-DE"/>
-              </w:rPr>
-              <w:t>Stipe Čelar</w:t>
-            </w:r>
-          </w:p>
-        </w:tc>
-        <w:tc>
-          <w:tcPr>
-            <w:tcW w:w="1643" w:type="dxa"/>
-            <w:tcBorders>
-              <w:left w:val="single" w:sz="6" w:space="0" w:color="000000"/>
-              <w:right w:val="single" w:sz="6" w:space="0" w:color="000000"/>
-            </w:tcBorders>
-          </w:tcPr>
-          <w:p>
-            <w:pPr>
-              <w:spacing w:line="240" w:lineRule="auto"/>
-              <w:jc w:val="center"/>
-              <w:rPr>
-                <w:sz w:val="20"/>
-                <w:lang w:val="de-DE"/>
-              </w:rPr>
-            </w:pPr>
-            <w:r>
-              <w:rPr>
-                <w:sz w:val="20"/>
-                <w:lang w:val="de-DE"/>
-              </w:rPr>
-              <w:t>Stipe Čelar</w:t>
-            </w:r>
-          </w:p>
-        </w:tc>
-        <w:tc>
-          <w:tcPr>
-            <w:tcW w:w="3780" w:type="dxa"/>
-            <w:tcBorders>
-              <w:left w:val="single" w:sz="6" w:space="0" w:color="000000"/>
-            </w:tcBorders>
-          </w:tcPr>
-          <w:p>
-            <w:pPr>
-              <w:spacing w:line="240" w:lineRule="auto"/>
-              <w:jc w:val="left"/>
-              <w:rPr>
-                <w:sz w:val="20"/>
-                <w:lang w:val="pl-PL"/>
-              </w:rPr>
-            </w:pPr>
-            <w:r>
-              <w:rPr>
-                <w:sz w:val="20"/>
-                <w:lang w:val="pl-PL"/>
-              </w:rPr>
-              <w:t>SAŽETAK je stavljen iza PRILOGA</w:t>
-            </w:r>
-          </w:p>
-        </w:tc>
-      </w:tr>
-      <w:tr>
-        <w:trPr>
-          <w:cantSplit/>
-        </w:trPr>
-        <w:tc>
-          <w:tcPr>
-            <w:tcW w:w="1242" w:type="dxa"/>
-            <w:tcBorders>
-              <w:right w:val="single" w:sz="6" w:space="0" w:color="000000"/>
-            </w:tcBorders>
-          </w:tcPr>
-          <w:p>
-            <w:pPr>
-              <w:spacing w:line="240" w:lineRule="auto"/>
-              <w:jc w:val="center"/>
-              <w:rPr>
-                <w:sz w:val="20"/>
-                <w:lang w:val="de-DE"/>
-              </w:rPr>
-            </w:pPr>
-            <w:r>
-              <w:rPr>
-                <w:sz w:val="20"/>
-                <w:lang w:val="de-DE"/>
-              </w:rPr>
-              <w:t>6.52</w:t>
-            </w:r>
-          </w:p>
-        </w:tc>
-        <w:tc>
-          <w:tcPr>
-            <w:tcW w:w="1418" w:type="dxa"/>
-            <w:tcBorders>
-              <w:left w:val="single" w:sz="6" w:space="0" w:color="000000"/>
-              <w:right w:val="single" w:sz="6" w:space="0" w:color="000000"/>
-            </w:tcBorders>
-          </w:tcPr>
-          <w:p>
-            <w:pPr>
-              <w:spacing w:line="240" w:lineRule="auto"/>
-              <w:jc w:val="center"/>
-              <w:rPr>
-                <w:sz w:val="20"/>
-                <w:lang w:val="de-DE"/>
-              </w:rPr>
-            </w:pPr>
-            <w:r>
-              <w:rPr>
-                <w:sz w:val="20"/>
-                <w:lang w:val="de-DE"/>
-              </w:rPr>
-              <w:t>2013-11-29</w:t>
-            </w:r>
-          </w:p>
-        </w:tc>
-        <w:tc>
-          <w:tcPr>
-            <w:tcW w:w="1565" w:type="dxa"/>
-            <w:tcBorders>
-              <w:left w:val="single" w:sz="6" w:space="0" w:color="000000"/>
-              <w:right w:val="single" w:sz="6" w:space="0" w:color="000000"/>
-            </w:tcBorders>
-          </w:tcPr>
-          <w:p>
-            <w:pPr>
-              <w:spacing w:line="240" w:lineRule="auto"/>
-              <w:jc w:val="center"/>
-              <w:rPr>
-                <w:sz w:val="20"/>
-                <w:lang w:val="de-DE"/>
-              </w:rPr>
-            </w:pPr>
-            <w:r>
-              <w:rPr>
-                <w:sz w:val="20"/>
-                <w:lang w:val="de-DE"/>
-              </w:rPr>
-              <w:t>Stipe Čelar</w:t>
-            </w:r>
-          </w:p>
-        </w:tc>
-        <w:tc>
-          <w:tcPr>
-            <w:tcW w:w="1643" w:type="dxa"/>
-            <w:tcBorders>
-              <w:left w:val="single" w:sz="6" w:space="0" w:color="000000"/>
-              <w:right w:val="single" w:sz="6" w:space="0" w:color="000000"/>
-            </w:tcBorders>
-          </w:tcPr>
-          <w:p>
-            <w:pPr>
-              <w:spacing w:line="240" w:lineRule="auto"/>
-              <w:jc w:val="center"/>
-              <w:rPr>
-                <w:sz w:val="20"/>
-                <w:lang w:val="de-DE"/>
-              </w:rPr>
-            </w:pPr>
-            <w:r>
-              <w:rPr>
-                <w:sz w:val="20"/>
-                <w:lang w:val="de-DE"/>
-              </w:rPr>
-              <w:t>Stipe Čelar</w:t>
-            </w:r>
-          </w:p>
-        </w:tc>
-        <w:tc>
-          <w:tcPr>
-            <w:tcW w:w="3780" w:type="dxa"/>
-            <w:tcBorders>
-              <w:left w:val="single" w:sz="6" w:space="0" w:color="000000"/>
-            </w:tcBorders>
-          </w:tcPr>
-          <w:p>
-            <w:pPr>
-              <w:spacing w:line="240" w:lineRule="auto"/>
-              <w:jc w:val="left"/>
-              <w:rPr>
-                <w:sz w:val="20"/>
-                <w:lang w:val="pl-PL"/>
-              </w:rPr>
-            </w:pPr>
-            <w:r>
-              <w:rPr>
-                <w:sz w:val="20"/>
-                <w:lang w:val="pl-PL"/>
-              </w:rPr>
-              <w:t xml:space="preserve">Manje dopune - </w:t>
-            </w:r>
-          </w:p>
-        </w:tc>
-      </w:tr>
-      <w:tr>
-        <w:trPr>
-          <w:cantSplit/>
-        </w:trPr>
-        <w:tc>
-          <w:tcPr>
-            <w:tcW w:w="1242" w:type="dxa"/>
-            <w:tcBorders>
-              <w:right w:val="single" w:sz="6" w:space="0" w:color="000000"/>
-            </w:tcBorders>
-          </w:tcPr>
-          <w:p>
-            <w:pPr>
-              <w:spacing w:line="240" w:lineRule="auto"/>
-              <w:jc w:val="center"/>
-              <w:rPr>
-                <w:sz w:val="20"/>
-                <w:lang w:val="de-DE"/>
-              </w:rPr>
-            </w:pPr>
-            <w:r>
-              <w:rPr>
-                <w:sz w:val="20"/>
-                <w:lang w:val="de-DE"/>
-              </w:rPr>
-              <w:t>6.51</w:t>
-            </w:r>
-          </w:p>
-        </w:tc>
-        <w:tc>
-          <w:tcPr>
-            <w:tcW w:w="1418" w:type="dxa"/>
-            <w:tcBorders>
-              <w:left w:val="single" w:sz="6" w:space="0" w:color="000000"/>
-              <w:right w:val="single" w:sz="6" w:space="0" w:color="000000"/>
-            </w:tcBorders>
-          </w:tcPr>
-          <w:p>
-            <w:pPr>
-              <w:spacing w:line="240" w:lineRule="auto"/>
-              <w:jc w:val="center"/>
-              <w:rPr>
-                <w:sz w:val="20"/>
-                <w:lang w:val="de-DE"/>
-              </w:rPr>
-            </w:pPr>
-            <w:r>
-              <w:rPr>
-                <w:sz w:val="20"/>
-                <w:lang w:val="de-DE"/>
-              </w:rPr>
-              <w:t>2013-07-17</w:t>
-            </w:r>
-          </w:p>
-        </w:tc>
-        <w:tc>
-          <w:tcPr>
-            <w:tcW w:w="1565" w:type="dxa"/>
-            <w:tcBorders>
-              <w:left w:val="single" w:sz="6" w:space="0" w:color="000000"/>
-              <w:right w:val="single" w:sz="6" w:space="0" w:color="000000"/>
-            </w:tcBorders>
-          </w:tcPr>
-          <w:p>
-            <w:pPr>
-              <w:spacing w:line="240" w:lineRule="auto"/>
-              <w:jc w:val="center"/>
-              <w:rPr>
-                <w:sz w:val="20"/>
-                <w:lang w:val="de-DE"/>
-              </w:rPr>
-            </w:pPr>
-            <w:r>
-              <w:rPr>
-                <w:sz w:val="20"/>
-                <w:lang w:val="de-DE"/>
-              </w:rPr>
-              <w:t>Stipe Čelar</w:t>
-            </w:r>
-          </w:p>
-        </w:tc>
-        <w:tc>
-          <w:tcPr>
-            <w:tcW w:w="1643" w:type="dxa"/>
-            <w:tcBorders>
-              <w:left w:val="single" w:sz="6" w:space="0" w:color="000000"/>
-              <w:right w:val="single" w:sz="6" w:space="0" w:color="000000"/>
-            </w:tcBorders>
-          </w:tcPr>
-          <w:p>
-            <w:pPr>
-              <w:spacing w:line="240" w:lineRule="auto"/>
-              <w:jc w:val="center"/>
-              <w:rPr>
-                <w:sz w:val="20"/>
-                <w:lang w:val="de-DE"/>
-              </w:rPr>
-            </w:pPr>
-            <w:r>
-              <w:rPr>
-                <w:sz w:val="20"/>
-                <w:lang w:val="de-DE"/>
-              </w:rPr>
-              <w:t>Stipe Čelar</w:t>
-            </w:r>
-          </w:p>
-        </w:tc>
-        <w:tc>
-          <w:tcPr>
-            <w:tcW w:w="3780" w:type="dxa"/>
-            <w:tcBorders>
-              <w:left w:val="single" w:sz="6" w:space="0" w:color="000000"/>
-            </w:tcBorders>
-          </w:tcPr>
-          <w:p>
-            <w:pPr>
-              <w:spacing w:line="240" w:lineRule="auto"/>
-              <w:jc w:val="left"/>
-              <w:rPr>
-                <w:sz w:val="20"/>
-                <w:lang w:val="pl-PL"/>
-              </w:rPr>
-            </w:pPr>
-            <w:r>
-              <w:rPr>
-                <w:sz w:val="20"/>
-                <w:lang w:val="pl-PL"/>
-              </w:rPr>
-              <w:t>Nazivi DIP i ZAV mijenjani u brojčane oznake studijskih osmjerenja (120, 250,...)</w:t>
-            </w:r>
-          </w:p>
-        </w:tc>
-      </w:tr>
-      <w:tr>
-        <w:trPr>
-          <w:cantSplit/>
-        </w:trPr>
-        <w:tc>
-          <w:tcPr>
-            <w:tcW w:w="1242" w:type="dxa"/>
-            <w:tcBorders>
-              <w:right w:val="single" w:sz="6" w:space="0" w:color="000000"/>
-            </w:tcBorders>
-          </w:tcPr>
-          <w:p>
-            <w:pPr>
-              <w:spacing w:line="240" w:lineRule="auto"/>
-              <w:jc w:val="center"/>
-              <w:rPr>
-                <w:sz w:val="20"/>
-                <w:lang w:val="de-DE"/>
-              </w:rPr>
-            </w:pPr>
-            <w:r>
-              <w:rPr>
-                <w:sz w:val="20"/>
-                <w:lang w:val="de-DE"/>
-              </w:rPr>
-              <w:t>6.5</w:t>
-            </w:r>
-          </w:p>
-        </w:tc>
-        <w:tc>
-          <w:tcPr>
-            <w:tcW w:w="1418" w:type="dxa"/>
-            <w:tcBorders>
-              <w:left w:val="single" w:sz="6" w:space="0" w:color="000000"/>
-              <w:right w:val="single" w:sz="6" w:space="0" w:color="000000"/>
-            </w:tcBorders>
-          </w:tcPr>
-          <w:p>
-            <w:pPr>
-              <w:spacing w:line="240" w:lineRule="auto"/>
-              <w:jc w:val="center"/>
-              <w:rPr>
-                <w:sz w:val="20"/>
-                <w:lang w:val="de-DE"/>
-              </w:rPr>
-            </w:pPr>
-            <w:r>
-              <w:rPr>
-                <w:sz w:val="20"/>
-                <w:lang w:val="de-DE"/>
-              </w:rPr>
-              <w:t>2013-04-17</w:t>
-            </w:r>
-          </w:p>
-        </w:tc>
-        <w:tc>
-          <w:tcPr>
-            <w:tcW w:w="1565" w:type="dxa"/>
-            <w:tcBorders>
-              <w:left w:val="single" w:sz="6" w:space="0" w:color="000000"/>
-              <w:right w:val="single" w:sz="6" w:space="0" w:color="000000"/>
-            </w:tcBorders>
-          </w:tcPr>
-          <w:p>
-            <w:pPr>
-              <w:spacing w:line="240" w:lineRule="auto"/>
-              <w:jc w:val="center"/>
-              <w:rPr>
-                <w:sz w:val="20"/>
-                <w:lang w:val="de-DE"/>
-              </w:rPr>
-            </w:pPr>
-            <w:r>
-              <w:rPr>
-                <w:sz w:val="20"/>
-                <w:lang w:val="de-DE"/>
-              </w:rPr>
-              <w:t>Stipe Čelar</w:t>
-            </w:r>
-          </w:p>
-        </w:tc>
-        <w:tc>
-          <w:tcPr>
-            <w:tcW w:w="1643" w:type="dxa"/>
-            <w:tcBorders>
-              <w:left w:val="single" w:sz="6" w:space="0" w:color="000000"/>
-              <w:right w:val="single" w:sz="6" w:space="0" w:color="000000"/>
-            </w:tcBorders>
-          </w:tcPr>
-          <w:p>
-            <w:pPr>
-              <w:spacing w:line="240" w:lineRule="auto"/>
-              <w:jc w:val="center"/>
-              <w:rPr>
-                <w:sz w:val="20"/>
-                <w:lang w:val="de-DE"/>
-              </w:rPr>
-            </w:pPr>
-            <w:r>
-              <w:rPr>
-                <w:sz w:val="20"/>
-                <w:lang w:val="de-DE"/>
-              </w:rPr>
-              <w:t>Stipe Čelar</w:t>
-            </w:r>
-          </w:p>
-        </w:tc>
-        <w:tc>
-          <w:tcPr>
-            <w:tcW w:w="3780" w:type="dxa"/>
-            <w:tcBorders>
-              <w:left w:val="single" w:sz="6" w:space="0" w:color="000000"/>
-            </w:tcBorders>
-          </w:tcPr>
-          <w:p>
-            <w:pPr>
-              <w:spacing w:line="240" w:lineRule="auto"/>
-              <w:jc w:val="left"/>
-              <w:rPr>
-                <w:sz w:val="20"/>
-                <w:lang w:val="pl-PL"/>
-              </w:rPr>
-            </w:pPr>
-            <w:r>
-              <w:rPr>
-                <w:sz w:val="20"/>
-                <w:lang w:val="pl-PL"/>
-              </w:rPr>
-              <w:t>Napravljen indent kod naslova</w:t>
-            </w:r>
-          </w:p>
-          <w:p>
-            <w:pPr>
-              <w:spacing w:line="240" w:lineRule="auto"/>
-              <w:jc w:val="left"/>
-              <w:rPr>
-                <w:sz w:val="20"/>
-                <w:lang w:val="pl-PL"/>
-              </w:rPr>
-            </w:pPr>
-            <w:r>
-              <w:rPr>
-                <w:sz w:val="20"/>
-                <w:lang w:val="pl-PL"/>
-              </w:rPr>
-              <w:t>Sažetak i ključne riječi prebačeni s početka na kraj radnje</w:t>
-            </w:r>
-          </w:p>
-        </w:tc>
-      </w:tr>
-      <w:tr>
-        <w:trPr>
-          <w:cantSplit/>
-        </w:trPr>
-        <w:tc>
-          <w:tcPr>
-            <w:tcW w:w="1242" w:type="dxa"/>
-            <w:tcBorders>
-              <w:right w:val="single" w:sz="6" w:space="0" w:color="000000"/>
-            </w:tcBorders>
-          </w:tcPr>
-          <w:p>
-            <w:pPr>
-              <w:spacing w:line="240" w:lineRule="auto"/>
-              <w:jc w:val="center"/>
-              <w:rPr>
-                <w:sz w:val="20"/>
-                <w:lang w:val="de-DE"/>
-              </w:rPr>
-            </w:pPr>
-            <w:r>
-              <w:rPr>
-                <w:sz w:val="20"/>
-                <w:lang w:val="de-DE"/>
-              </w:rPr>
-              <w:t>6.4</w:t>
-            </w:r>
-          </w:p>
-        </w:tc>
-        <w:tc>
-          <w:tcPr>
-            <w:tcW w:w="1418" w:type="dxa"/>
-            <w:tcBorders>
-              <w:left w:val="single" w:sz="6" w:space="0" w:color="000000"/>
-              <w:right w:val="single" w:sz="6" w:space="0" w:color="000000"/>
-            </w:tcBorders>
-          </w:tcPr>
-          <w:p>
-            <w:pPr>
-              <w:spacing w:line="240" w:lineRule="auto"/>
-              <w:jc w:val="center"/>
-              <w:rPr>
-                <w:sz w:val="20"/>
-                <w:lang w:val="de-DE"/>
-              </w:rPr>
-            </w:pPr>
-            <w:r>
-              <w:rPr>
-                <w:sz w:val="20"/>
-                <w:lang w:val="de-DE"/>
-              </w:rPr>
-              <w:t>2012-10-10</w:t>
-            </w:r>
-          </w:p>
-        </w:tc>
-        <w:tc>
-          <w:tcPr>
-            <w:tcW w:w="1565" w:type="dxa"/>
-            <w:tcBorders>
-              <w:left w:val="single" w:sz="6" w:space="0" w:color="000000"/>
-              <w:right w:val="single" w:sz="6" w:space="0" w:color="000000"/>
-            </w:tcBorders>
-          </w:tcPr>
-          <w:p>
-            <w:pPr>
-              <w:spacing w:line="240" w:lineRule="auto"/>
-              <w:jc w:val="center"/>
-              <w:rPr>
-                <w:sz w:val="20"/>
-                <w:lang w:val="de-DE"/>
-              </w:rPr>
-            </w:pPr>
-            <w:r>
-              <w:rPr>
-                <w:sz w:val="20"/>
-                <w:lang w:val="de-DE"/>
-              </w:rPr>
-              <w:t>Stipe Čelar</w:t>
-            </w:r>
-          </w:p>
-        </w:tc>
-        <w:tc>
-          <w:tcPr>
-            <w:tcW w:w="1643" w:type="dxa"/>
-            <w:tcBorders>
-              <w:left w:val="single" w:sz="6" w:space="0" w:color="000000"/>
-              <w:right w:val="single" w:sz="6" w:space="0" w:color="000000"/>
-            </w:tcBorders>
-          </w:tcPr>
-          <w:p>
-            <w:pPr>
-              <w:spacing w:line="240" w:lineRule="auto"/>
-              <w:jc w:val="center"/>
-              <w:rPr>
-                <w:sz w:val="20"/>
-                <w:lang w:val="de-DE"/>
-              </w:rPr>
-            </w:pPr>
-            <w:r>
-              <w:rPr>
-                <w:sz w:val="20"/>
-                <w:lang w:val="de-DE"/>
-              </w:rPr>
-              <w:t>Stipe Čelar</w:t>
-            </w:r>
-          </w:p>
-        </w:tc>
-        <w:tc>
-          <w:tcPr>
-            <w:tcW w:w="3780" w:type="dxa"/>
-            <w:tcBorders>
-              <w:left w:val="single" w:sz="6" w:space="0" w:color="000000"/>
-            </w:tcBorders>
-          </w:tcPr>
-          <w:p>
-            <w:pPr>
-              <w:spacing w:line="240" w:lineRule="auto"/>
-              <w:jc w:val="left"/>
-              <w:rPr>
-                <w:sz w:val="20"/>
-                <w:lang w:val="pl-PL"/>
-              </w:rPr>
-            </w:pPr>
-            <w:r>
-              <w:rPr>
-                <w:i/>
-                <w:sz w:val="20"/>
-                <w:lang w:val="pl-PL"/>
-              </w:rPr>
-              <w:t>Pojašnjenje</w:t>
-            </w:r>
-            <w:r>
-              <w:rPr>
-                <w:i/>
-                <w:sz w:val="20"/>
-                <w:lang w:val="pl-PL"/>
-              </w:rPr>
-              <w:t xml:space="preserve"> ranije manje jasnih detalja.</w:t>
-            </w:r>
-          </w:p>
-        </w:tc>
-      </w:tr>
-      <w:tr>
-        <w:trPr>
-          <w:cantSplit/>
-        </w:trPr>
-        <w:tc>
-          <w:tcPr>
-            <w:tcW w:w="1242" w:type="dxa"/>
-            <w:tcBorders>
-              <w:right w:val="single" w:sz="6" w:space="0" w:color="000000"/>
-            </w:tcBorders>
-          </w:tcPr>
-          <w:p>
-            <w:pPr>
-              <w:spacing w:line="240" w:lineRule="auto"/>
-              <w:jc w:val="center"/>
-              <w:rPr>
-                <w:sz w:val="20"/>
-                <w:lang w:val="de-DE"/>
-              </w:rPr>
-            </w:pPr>
-            <w:r>
-              <w:rPr>
-                <w:sz w:val="20"/>
-                <w:lang w:val="de-DE"/>
-              </w:rPr>
-              <w:t>6.3</w:t>
-            </w:r>
-          </w:p>
-        </w:tc>
-        <w:tc>
-          <w:tcPr>
-            <w:tcW w:w="1418" w:type="dxa"/>
-            <w:tcBorders>
-              <w:left w:val="single" w:sz="6" w:space="0" w:color="000000"/>
-              <w:right w:val="single" w:sz="6" w:space="0" w:color="000000"/>
-            </w:tcBorders>
-          </w:tcPr>
-          <w:p>
-            <w:pPr>
-              <w:spacing w:line="240" w:lineRule="auto"/>
-              <w:jc w:val="center"/>
-              <w:rPr>
-                <w:sz w:val="16"/>
-              </w:rPr>
-            </w:pPr>
-            <w:r>
-              <w:rPr>
-                <w:sz w:val="16"/>
-              </w:rPr>
-              <w:t>201</w:t>
-            </w:r>
-            <w:r>
-              <w:rPr>
-                <w:sz w:val="16"/>
-              </w:rPr>
-              <w:t>2</w:t>
-            </w:r>
-            <w:r>
-              <w:rPr>
-                <w:sz w:val="16"/>
-              </w:rPr>
-              <w:t>-03-05</w:t>
-            </w:r>
-          </w:p>
-        </w:tc>
-        <w:tc>
-          <w:tcPr>
-            <w:tcW w:w="1565" w:type="dxa"/>
-            <w:tcBorders>
-              <w:left w:val="single" w:sz="6" w:space="0" w:color="000000"/>
-              <w:right w:val="single" w:sz="6" w:space="0" w:color="000000"/>
-            </w:tcBorders>
-          </w:tcPr>
-          <w:p>
-            <w:pPr>
-              <w:spacing w:line="240" w:lineRule="auto"/>
-              <w:jc w:val="center"/>
-              <w:rPr>
-                <w:sz w:val="20"/>
-                <w:lang w:val="de-DE"/>
-              </w:rPr>
-            </w:pPr>
-            <w:r>
-              <w:rPr>
-                <w:sz w:val="20"/>
-                <w:lang w:val="de-DE"/>
-              </w:rPr>
-              <w:t>Stipe Čelar</w:t>
-            </w:r>
-          </w:p>
-        </w:tc>
-        <w:tc>
-          <w:tcPr>
-            <w:tcW w:w="1643" w:type="dxa"/>
-            <w:tcBorders>
-              <w:left w:val="single" w:sz="6" w:space="0" w:color="000000"/>
-              <w:right w:val="single" w:sz="6" w:space="0" w:color="000000"/>
-            </w:tcBorders>
-          </w:tcPr>
-          <w:p>
-            <w:pPr>
-              <w:spacing w:line="240" w:lineRule="auto"/>
-              <w:jc w:val="center"/>
-              <w:rPr>
-                <w:sz w:val="20"/>
-                <w:lang w:val="de-DE"/>
-              </w:rPr>
-            </w:pPr>
-            <w:r>
-              <w:rPr>
-                <w:sz w:val="20"/>
-                <w:lang w:val="de-DE"/>
-              </w:rPr>
-              <w:t>Stipe Čelar</w:t>
-            </w:r>
-          </w:p>
-        </w:tc>
-        <w:tc>
-          <w:tcPr>
-            <w:tcW w:w="3780" w:type="dxa"/>
-            <w:tcBorders>
-              <w:left w:val="single" w:sz="6" w:space="0" w:color="000000"/>
-            </w:tcBorders>
-          </w:tcPr>
-          <w:p>
-            <w:pPr>
-              <w:spacing w:line="240" w:lineRule="auto"/>
-              <w:jc w:val="left"/>
-              <w:rPr>
-                <w:sz w:val="20"/>
-                <w:lang w:val="pl-PL"/>
-              </w:rPr>
-            </w:pPr>
-            <w:r>
-              <w:rPr>
-                <w:i/>
-                <w:sz w:val="20"/>
-                <w:lang w:val="pl-PL"/>
-              </w:rPr>
-              <w:t>Pojašnjenje</w:t>
-            </w:r>
-            <w:r>
-              <w:rPr>
-                <w:i/>
-                <w:sz w:val="20"/>
-                <w:lang w:val="pl-PL"/>
-              </w:rPr>
-              <w:t xml:space="preserve"> ranije manje jasnih detalja.</w:t>
-            </w:r>
-          </w:p>
-        </w:tc>
-      </w:tr>
-      <w:tr>
-        <w:trPr>
-          <w:cantSplit/>
-        </w:trPr>
-        <w:tc>
-          <w:tcPr>
-            <w:tcW w:w="1242" w:type="dxa"/>
-            <w:tcBorders>
-              <w:right w:val="single" w:sz="6" w:space="0" w:color="000000"/>
-            </w:tcBorders>
-          </w:tcPr>
-          <w:p>
-            <w:pPr>
-              <w:spacing w:line="240" w:lineRule="auto"/>
-              <w:jc w:val="center"/>
-              <w:rPr>
-                <w:sz w:val="20"/>
-                <w:lang w:val="pl-PL"/>
-              </w:rPr>
-            </w:pPr>
-            <w:r>
-              <w:rPr>
-                <w:sz w:val="20"/>
-                <w:lang w:val="pl-PL"/>
-              </w:rPr>
-              <w:t>6.2</w:t>
-            </w:r>
-          </w:p>
-        </w:tc>
-        <w:tc>
-          <w:tcPr>
-            <w:tcW w:w="1418" w:type="dxa"/>
-            <w:tcBorders>
-              <w:left w:val="single" w:sz="6" w:space="0" w:color="000000"/>
-              <w:right w:val="single" w:sz="6" w:space="0" w:color="000000"/>
-            </w:tcBorders>
-          </w:tcPr>
-          <w:p>
-            <w:pPr>
-              <w:spacing w:line="240" w:lineRule="auto"/>
-              <w:jc w:val="center"/>
-              <w:rPr>
-                <w:sz w:val="16"/>
-              </w:rPr>
-            </w:pPr>
-            <w:r>
-              <w:rPr>
-                <w:sz w:val="16"/>
-              </w:rPr>
-              <w:t>2011-10-04</w:t>
-            </w:r>
-          </w:p>
-        </w:tc>
-        <w:tc>
-          <w:tcPr>
-            <w:tcW w:w="1565" w:type="dxa"/>
-            <w:tcBorders>
-              <w:left w:val="single" w:sz="6" w:space="0" w:color="000000"/>
-              <w:right w:val="single" w:sz="6" w:space="0" w:color="000000"/>
-            </w:tcBorders>
-          </w:tcPr>
-          <w:p>
-            <w:pPr>
-              <w:spacing w:line="240" w:lineRule="auto"/>
-              <w:jc w:val="center"/>
-              <w:rPr>
-                <w:sz w:val="20"/>
-                <w:lang w:val="de-DE"/>
-              </w:rPr>
-            </w:pPr>
-            <w:r>
-              <w:rPr>
-                <w:sz w:val="20"/>
-                <w:lang w:val="de-DE"/>
-              </w:rPr>
-              <w:t>Stipe Čelar</w:t>
-            </w:r>
-          </w:p>
-        </w:tc>
-        <w:tc>
-          <w:tcPr>
-            <w:tcW w:w="1643" w:type="dxa"/>
-            <w:tcBorders>
-              <w:left w:val="single" w:sz="6" w:space="0" w:color="000000"/>
-              <w:right w:val="single" w:sz="6" w:space="0" w:color="000000"/>
-            </w:tcBorders>
-          </w:tcPr>
-          <w:p>
-            <w:pPr>
-              <w:spacing w:line="240" w:lineRule="auto"/>
-              <w:jc w:val="center"/>
-              <w:rPr>
-                <w:sz w:val="20"/>
-                <w:lang w:val="de-DE"/>
-              </w:rPr>
-            </w:pPr>
-            <w:r>
-              <w:rPr>
-                <w:sz w:val="20"/>
-                <w:lang w:val="de-DE"/>
-              </w:rPr>
-              <w:t>Stipe Čelar</w:t>
-            </w:r>
-          </w:p>
-        </w:tc>
-        <w:tc>
-          <w:tcPr>
-            <w:tcW w:w="3780" w:type="dxa"/>
-            <w:tcBorders>
-              <w:left w:val="single" w:sz="6" w:space="0" w:color="000000"/>
-            </w:tcBorders>
-          </w:tcPr>
-          <w:p>
-            <w:pPr>
-              <w:spacing w:line="240" w:lineRule="auto"/>
-              <w:jc w:val="left"/>
-              <w:rPr>
-                <w:i/>
-                <w:sz w:val="20"/>
-                <w:lang w:val="pl-PL"/>
-              </w:rPr>
-            </w:pPr>
-            <w:r>
-              <w:rPr>
-                <w:i/>
-                <w:sz w:val="20"/>
-                <w:lang w:val="pl-PL"/>
-              </w:rPr>
-              <w:t>Upute za literaturu – automatsko numeriranje</w:t>
-            </w:r>
-          </w:p>
-        </w:tc>
-      </w:tr>
-      <w:tr>
-        <w:trPr>
-          <w:cantSplit/>
-        </w:trPr>
-        <w:tc>
-          <w:tcPr>
-            <w:tcW w:w="1242" w:type="dxa"/>
-            <w:tcBorders>
-              <w:right w:val="single" w:sz="6" w:space="0" w:color="000000"/>
-            </w:tcBorders>
-          </w:tcPr>
-          <w:p>
-            <w:pPr>
-              <w:spacing w:line="240" w:lineRule="auto"/>
-              <w:jc w:val="center"/>
-              <w:rPr>
-                <w:sz w:val="20"/>
-                <w:lang w:val="pl-PL"/>
-              </w:rPr>
-            </w:pPr>
-            <w:r>
-              <w:rPr>
-                <w:sz w:val="20"/>
-                <w:lang w:val="pl-PL"/>
-              </w:rPr>
-              <w:t>6.1</w:t>
-            </w:r>
-          </w:p>
-        </w:tc>
-        <w:tc>
-          <w:tcPr>
-            <w:tcW w:w="1418" w:type="dxa"/>
-            <w:tcBorders>
-              <w:left w:val="single" w:sz="6" w:space="0" w:color="000000"/>
-              <w:right w:val="single" w:sz="6" w:space="0" w:color="000000"/>
-            </w:tcBorders>
-          </w:tcPr>
-          <w:p>
-            <w:pPr>
-              <w:spacing w:line="240" w:lineRule="auto"/>
-              <w:jc w:val="center"/>
-              <w:rPr>
-                <w:sz w:val="16"/>
-              </w:rPr>
-            </w:pPr>
-            <w:r>
-              <w:rPr>
-                <w:sz w:val="16"/>
-              </w:rPr>
-              <w:t>2011-03-10</w:t>
-            </w:r>
-          </w:p>
-        </w:tc>
-        <w:tc>
-          <w:tcPr>
-            <w:tcW w:w="1565" w:type="dxa"/>
-            <w:tcBorders>
-              <w:left w:val="single" w:sz="6" w:space="0" w:color="000000"/>
-              <w:right w:val="single" w:sz="6" w:space="0" w:color="000000"/>
-            </w:tcBorders>
-          </w:tcPr>
-          <w:p>
-            <w:pPr>
-              <w:spacing w:line="240" w:lineRule="auto"/>
-              <w:jc w:val="center"/>
-              <w:rPr>
-                <w:sz w:val="20"/>
-                <w:lang w:val="de-DE"/>
-              </w:rPr>
-            </w:pPr>
-            <w:r>
-              <w:rPr>
-                <w:sz w:val="20"/>
-                <w:lang w:val="de-DE"/>
-              </w:rPr>
-              <w:t>Stipe Čelar</w:t>
-            </w:r>
-          </w:p>
-        </w:tc>
-        <w:tc>
-          <w:tcPr>
-            <w:tcW w:w="1643" w:type="dxa"/>
-            <w:tcBorders>
-              <w:left w:val="single" w:sz="6" w:space="0" w:color="000000"/>
-              <w:right w:val="single" w:sz="6" w:space="0" w:color="000000"/>
-            </w:tcBorders>
-          </w:tcPr>
-          <w:p>
-            <w:pPr>
-              <w:spacing w:line="240" w:lineRule="auto"/>
-              <w:jc w:val="center"/>
-              <w:rPr>
-                <w:sz w:val="20"/>
-                <w:lang w:val="de-DE"/>
-              </w:rPr>
-            </w:pPr>
-            <w:r>
-              <w:rPr>
-                <w:sz w:val="20"/>
-                <w:lang w:val="de-DE"/>
-              </w:rPr>
-              <w:t>Stipe Čelar</w:t>
-            </w:r>
-          </w:p>
-        </w:tc>
-        <w:tc>
-          <w:tcPr>
-            <w:tcW w:w="3780" w:type="dxa"/>
-            <w:tcBorders>
-              <w:left w:val="single" w:sz="6" w:space="0" w:color="000000"/>
-            </w:tcBorders>
-          </w:tcPr>
-          <w:p>
-            <w:pPr>
-              <w:spacing w:line="240" w:lineRule="auto"/>
-              <w:jc w:val="left"/>
-              <w:rPr>
-                <w:i/>
-                <w:sz w:val="20"/>
-                <w:lang w:val="pl-PL"/>
-              </w:rPr>
-            </w:pPr>
-            <w:r>
-              <w:rPr>
-                <w:i/>
-                <w:sz w:val="20"/>
-                <w:lang w:val="pl-PL"/>
-              </w:rPr>
-              <w:t>Manje izmjene.</w:t>
-            </w:r>
-          </w:p>
-        </w:tc>
-      </w:tr>
-      <w:tr>
-        <w:trPr>
-          <w:cantSplit/>
-        </w:trPr>
-        <w:tc>
-          <w:tcPr>
-            <w:tcW w:w="1242" w:type="dxa"/>
-            <w:tcBorders>
-              <w:right w:val="single" w:sz="6" w:space="0" w:color="000000"/>
-            </w:tcBorders>
-          </w:tcPr>
-          <w:p>
-            <w:pPr>
-              <w:spacing w:line="240" w:lineRule="auto"/>
-              <w:jc w:val="center"/>
-              <w:rPr>
-                <w:sz w:val="20"/>
-                <w:lang w:val="pl-PL"/>
-              </w:rPr>
-            </w:pPr>
-            <w:r>
-              <w:rPr>
-                <w:sz w:val="20"/>
-                <w:lang w:val="pl-PL"/>
-              </w:rPr>
-              <w:t>6</w:t>
-            </w:r>
-          </w:p>
-        </w:tc>
-        <w:tc>
-          <w:tcPr>
-            <w:tcW w:w="1418" w:type="dxa"/>
-            <w:tcBorders>
-              <w:left w:val="single" w:sz="6" w:space="0" w:color="000000"/>
-              <w:right w:val="single" w:sz="6" w:space="0" w:color="000000"/>
-            </w:tcBorders>
-          </w:tcPr>
-          <w:p>
-            <w:pPr>
-              <w:spacing w:line="240" w:lineRule="auto"/>
-              <w:jc w:val="center"/>
-              <w:rPr>
-                <w:sz w:val="16"/>
-              </w:rPr>
-            </w:pPr>
-            <w:r>
-              <w:rPr>
-                <w:sz w:val="16"/>
-              </w:rPr>
-              <w:t>2010-10-04</w:t>
-            </w:r>
-          </w:p>
-        </w:tc>
-        <w:tc>
-          <w:tcPr>
-            <w:tcW w:w="1565" w:type="dxa"/>
-            <w:tcBorders>
-              <w:left w:val="single" w:sz="6" w:space="0" w:color="000000"/>
-              <w:right w:val="single" w:sz="6" w:space="0" w:color="000000"/>
-            </w:tcBorders>
-          </w:tcPr>
-          <w:p>
-            <w:pPr>
-              <w:spacing w:line="240" w:lineRule="auto"/>
-              <w:jc w:val="center"/>
-              <w:rPr>
-                <w:sz w:val="20"/>
-                <w:lang w:val="de-DE"/>
-              </w:rPr>
-            </w:pPr>
-            <w:r>
-              <w:rPr>
-                <w:sz w:val="20"/>
-                <w:lang w:val="de-DE"/>
-              </w:rPr>
-              <w:t>Stipe Čelar</w:t>
-            </w:r>
-          </w:p>
-        </w:tc>
-        <w:tc>
-          <w:tcPr>
-            <w:tcW w:w="1643" w:type="dxa"/>
-            <w:tcBorders>
-              <w:left w:val="single" w:sz="6" w:space="0" w:color="000000"/>
-              <w:right w:val="single" w:sz="6" w:space="0" w:color="000000"/>
-            </w:tcBorders>
-          </w:tcPr>
-          <w:p>
-            <w:pPr>
-              <w:spacing w:line="240" w:lineRule="auto"/>
-              <w:jc w:val="center"/>
-              <w:rPr>
-                <w:sz w:val="20"/>
-                <w:lang w:val="de-DE"/>
-              </w:rPr>
-            </w:pPr>
-            <w:r>
-              <w:rPr>
-                <w:sz w:val="20"/>
-                <w:lang w:val="de-DE"/>
-              </w:rPr>
-              <w:t>Stipe Čelar</w:t>
-            </w:r>
-          </w:p>
-        </w:tc>
-        <w:tc>
-          <w:tcPr>
-            <w:tcW w:w="3780" w:type="dxa"/>
-            <w:tcBorders>
-              <w:left w:val="single" w:sz="6" w:space="0" w:color="000000"/>
-            </w:tcBorders>
-          </w:tcPr>
-          <w:p>
-            <w:pPr>
-              <w:spacing w:line="240" w:lineRule="auto"/>
-              <w:jc w:val="left"/>
-              <w:rPr>
-                <w:i/>
-                <w:sz w:val="20"/>
-                <w:lang w:val="pl-PL"/>
-              </w:rPr>
-            </w:pPr>
-            <w:r>
-              <w:rPr>
-                <w:i/>
-                <w:sz w:val="20"/>
-                <w:lang w:val="pl-PL"/>
-              </w:rPr>
-              <w:t>Unos radnje u bazu podataka (IRB) i pdf-print radnje sa zadatkom</w:t>
-            </w:r>
-          </w:p>
-        </w:tc>
-      </w:tr>
-      <w:tr>
-        <w:trPr>
-          <w:cantSplit/>
-        </w:trPr>
-        <w:tc>
-          <w:tcPr>
-            <w:tcW w:w="1242" w:type="dxa"/>
-            <w:tcBorders>
-              <w:right w:val="single" w:sz="6" w:space="0" w:color="000000"/>
-            </w:tcBorders>
-          </w:tcPr>
-          <w:p>
-            <w:pPr>
-              <w:spacing w:line="240" w:lineRule="auto"/>
-              <w:jc w:val="center"/>
-              <w:rPr>
-                <w:sz w:val="20"/>
-                <w:lang w:val="pl-PL"/>
-              </w:rPr>
-            </w:pPr>
-            <w:r>
-              <w:rPr>
-                <w:sz w:val="20"/>
-                <w:lang w:val="pl-PL"/>
-              </w:rPr>
-              <w:t>5</w:t>
-            </w:r>
-          </w:p>
-        </w:tc>
-        <w:tc>
-          <w:tcPr>
-            <w:tcW w:w="1418" w:type="dxa"/>
-            <w:tcBorders>
-              <w:left w:val="single" w:sz="6" w:space="0" w:color="000000"/>
-              <w:right w:val="single" w:sz="6" w:space="0" w:color="000000"/>
-            </w:tcBorders>
-          </w:tcPr>
-          <w:p>
-            <w:pPr>
-              <w:spacing w:line="240" w:lineRule="auto"/>
-              <w:jc w:val="center"/>
-              <w:rPr>
-                <w:sz w:val="16"/>
-              </w:rPr>
-            </w:pPr>
-            <w:r>
-              <w:rPr>
-                <w:sz w:val="16"/>
-              </w:rPr>
-              <w:t>2010-09-13</w:t>
-            </w:r>
-          </w:p>
-        </w:tc>
-        <w:tc>
-          <w:tcPr>
-            <w:tcW w:w="1565" w:type="dxa"/>
-            <w:tcBorders>
-              <w:left w:val="single" w:sz="6" w:space="0" w:color="000000"/>
-              <w:right w:val="single" w:sz="6" w:space="0" w:color="000000"/>
-            </w:tcBorders>
-          </w:tcPr>
-          <w:p>
-            <w:pPr>
-              <w:spacing w:line="240" w:lineRule="auto"/>
-              <w:jc w:val="center"/>
-              <w:rPr>
-                <w:sz w:val="20"/>
-                <w:lang w:val="de-DE"/>
-              </w:rPr>
-            </w:pPr>
-            <w:r>
-              <w:rPr>
-                <w:sz w:val="20"/>
-                <w:lang w:val="de-DE"/>
-              </w:rPr>
-              <w:t>Stipe Čelar</w:t>
-            </w:r>
-          </w:p>
-        </w:tc>
-        <w:tc>
-          <w:tcPr>
-            <w:tcW w:w="1643" w:type="dxa"/>
-            <w:tcBorders>
-              <w:left w:val="single" w:sz="6" w:space="0" w:color="000000"/>
-              <w:right w:val="single" w:sz="6" w:space="0" w:color="000000"/>
-            </w:tcBorders>
-          </w:tcPr>
-          <w:p>
-            <w:pPr>
-              <w:spacing w:line="240" w:lineRule="auto"/>
-              <w:jc w:val="center"/>
-              <w:rPr>
-                <w:sz w:val="20"/>
-                <w:lang w:val="de-DE"/>
-              </w:rPr>
-            </w:pPr>
-            <w:r>
-              <w:rPr>
-                <w:sz w:val="20"/>
-                <w:lang w:val="de-DE"/>
-              </w:rPr>
-              <w:t>Stipe Čelar</w:t>
-            </w:r>
-          </w:p>
-        </w:tc>
-        <w:tc>
-          <w:tcPr>
-            <w:tcW w:w="3780" w:type="dxa"/>
-            <w:tcBorders>
-              <w:left w:val="single" w:sz="6" w:space="0" w:color="000000"/>
-            </w:tcBorders>
-          </w:tcPr>
-          <w:p>
-            <w:pPr>
-              <w:spacing w:line="240" w:lineRule="auto"/>
-              <w:jc w:val="left"/>
-              <w:rPr>
-                <w:i/>
-                <w:sz w:val="20"/>
-                <w:lang w:val="pl-PL"/>
-              </w:rPr>
-            </w:pPr>
-            <w:r>
-              <w:rPr>
-                <w:i/>
-                <w:sz w:val="20"/>
-                <w:lang w:val="pl-PL"/>
-              </w:rPr>
-              <w:t>Literatura: s interneta i zadnji pristup</w:t>
-            </w:r>
-          </w:p>
-        </w:tc>
-      </w:tr>
-      <w:tr>
-        <w:trPr>
-          <w:cantSplit/>
-        </w:trPr>
-        <w:tc>
-          <w:tcPr>
-            <w:tcW w:w="1242" w:type="dxa"/>
-            <w:tcBorders>
-              <w:right w:val="single" w:sz="6" w:space="0" w:color="000000"/>
-            </w:tcBorders>
-          </w:tcPr>
-          <w:p>
-            <w:pPr>
-              <w:spacing w:line="240" w:lineRule="auto"/>
-              <w:jc w:val="center"/>
-              <w:rPr>
-                <w:sz w:val="20"/>
-                <w:lang w:val="pl-PL"/>
-              </w:rPr>
-            </w:pPr>
-            <w:r>
-              <w:rPr>
-                <w:sz w:val="20"/>
-                <w:lang w:val="pl-PL"/>
-              </w:rPr>
-              <w:t>4</w:t>
-            </w:r>
-          </w:p>
-        </w:tc>
-        <w:tc>
-          <w:tcPr>
-            <w:tcW w:w="1418" w:type="dxa"/>
-            <w:tcBorders>
-              <w:left w:val="single" w:sz="6" w:space="0" w:color="000000"/>
-              <w:right w:val="single" w:sz="6" w:space="0" w:color="000000"/>
-            </w:tcBorders>
-          </w:tcPr>
-          <w:p>
-            <w:pPr>
-              <w:spacing w:line="240" w:lineRule="auto"/>
-              <w:jc w:val="center"/>
-              <w:rPr>
-                <w:sz w:val="16"/>
-              </w:rPr>
-            </w:pPr>
-            <w:r>
-              <w:rPr>
-                <w:sz w:val="16"/>
-              </w:rPr>
-              <w:t>2010-08-25</w:t>
-            </w:r>
-          </w:p>
-        </w:tc>
-        <w:tc>
-          <w:tcPr>
-            <w:tcW w:w="1565" w:type="dxa"/>
-            <w:tcBorders>
-              <w:left w:val="single" w:sz="6" w:space="0" w:color="000000"/>
-              <w:right w:val="single" w:sz="6" w:space="0" w:color="000000"/>
-            </w:tcBorders>
-          </w:tcPr>
-          <w:p>
-            <w:pPr>
-              <w:spacing w:line="240" w:lineRule="auto"/>
-              <w:jc w:val="center"/>
-              <w:rPr>
-                <w:sz w:val="20"/>
-                <w:lang w:val="de-DE"/>
-              </w:rPr>
-            </w:pPr>
-            <w:r>
-              <w:rPr>
-                <w:sz w:val="20"/>
-                <w:lang w:val="de-DE"/>
-              </w:rPr>
-              <w:t>Stipe Čelar</w:t>
-            </w:r>
-          </w:p>
-        </w:tc>
-        <w:tc>
-          <w:tcPr>
-            <w:tcW w:w="1643" w:type="dxa"/>
-            <w:tcBorders>
-              <w:left w:val="single" w:sz="6" w:space="0" w:color="000000"/>
-              <w:right w:val="single" w:sz="6" w:space="0" w:color="000000"/>
-            </w:tcBorders>
-          </w:tcPr>
-          <w:p>
-            <w:pPr>
-              <w:spacing w:line="240" w:lineRule="auto"/>
-              <w:jc w:val="center"/>
-              <w:rPr>
-                <w:sz w:val="20"/>
-                <w:lang w:val="de-DE"/>
-              </w:rPr>
-            </w:pPr>
-            <w:r>
-              <w:rPr>
-                <w:sz w:val="20"/>
-                <w:lang w:val="de-DE"/>
-              </w:rPr>
-              <w:t>Stipe Čelar</w:t>
-            </w:r>
-          </w:p>
-        </w:tc>
-        <w:tc>
-          <w:tcPr>
-            <w:tcW w:w="3780" w:type="dxa"/>
-            <w:tcBorders>
-              <w:left w:val="single" w:sz="6" w:space="0" w:color="000000"/>
-            </w:tcBorders>
-          </w:tcPr>
-          <w:p>
-            <w:pPr>
-              <w:spacing w:line="240" w:lineRule="auto"/>
-              <w:jc w:val="left"/>
-              <w:rPr>
-                <w:i/>
-                <w:sz w:val="20"/>
-                <w:lang w:val="pl-PL"/>
-              </w:rPr>
-            </w:pPr>
-            <w:r>
-              <w:rPr>
-                <w:i/>
-                <w:sz w:val="20"/>
-                <w:lang w:val="pl-PL"/>
-              </w:rPr>
-              <w:t>Primjer završetka uvodnog poglavlja i upute za prezentaciju</w:t>
-            </w:r>
-          </w:p>
-        </w:tc>
-      </w:tr>
-      <w:tr>
-        <w:trPr>
-          <w:cantSplit/>
-        </w:trPr>
-        <w:tc>
-          <w:tcPr>
-            <w:tcW w:w="1242" w:type="dxa"/>
-            <w:tcBorders>
-              <w:right w:val="single" w:sz="6" w:space="0" w:color="000000"/>
-            </w:tcBorders>
-          </w:tcPr>
-          <w:p>
-            <w:pPr>
-              <w:spacing w:line="240" w:lineRule="auto"/>
-              <w:jc w:val="center"/>
-              <w:rPr>
-                <w:sz w:val="20"/>
-                <w:lang w:val="pl-PL"/>
-              </w:rPr>
-            </w:pPr>
-            <w:r>
-              <w:rPr>
-                <w:sz w:val="20"/>
-                <w:lang w:val="pl-PL"/>
-              </w:rPr>
-              <w:t>3</w:t>
-            </w:r>
-          </w:p>
-        </w:tc>
-        <w:tc>
-          <w:tcPr>
-            <w:tcW w:w="1418" w:type="dxa"/>
-            <w:tcBorders>
-              <w:left w:val="single" w:sz="6" w:space="0" w:color="000000"/>
-              <w:right w:val="single" w:sz="6" w:space="0" w:color="000000"/>
-            </w:tcBorders>
-          </w:tcPr>
-          <w:p>
-            <w:pPr>
-              <w:spacing w:line="240" w:lineRule="auto"/>
-              <w:jc w:val="center"/>
-              <w:rPr>
-                <w:sz w:val="16"/>
-              </w:rPr>
-            </w:pPr>
-            <w:r>
-              <w:rPr>
-                <w:sz w:val="16"/>
-              </w:rPr>
-              <w:t>2010-07-28</w:t>
-            </w:r>
-          </w:p>
-        </w:tc>
-        <w:tc>
-          <w:tcPr>
-            <w:tcW w:w="1565" w:type="dxa"/>
-            <w:tcBorders>
-              <w:left w:val="single" w:sz="6" w:space="0" w:color="000000"/>
-              <w:right w:val="single" w:sz="6" w:space="0" w:color="000000"/>
-            </w:tcBorders>
-          </w:tcPr>
-          <w:p>
-            <w:pPr>
-              <w:spacing w:line="240" w:lineRule="auto"/>
-              <w:jc w:val="center"/>
-              <w:rPr>
-                <w:sz w:val="20"/>
-                <w:lang w:val="de-DE"/>
-              </w:rPr>
-            </w:pPr>
-            <w:r>
-              <w:rPr>
-                <w:sz w:val="20"/>
-                <w:lang w:val="de-DE"/>
-              </w:rPr>
-              <w:t>Stipe Čelar</w:t>
-            </w:r>
-          </w:p>
-        </w:tc>
-        <w:tc>
-          <w:tcPr>
-            <w:tcW w:w="1643" w:type="dxa"/>
-            <w:tcBorders>
-              <w:left w:val="single" w:sz="6" w:space="0" w:color="000000"/>
-              <w:right w:val="single" w:sz="6" w:space="0" w:color="000000"/>
-            </w:tcBorders>
-          </w:tcPr>
-          <w:p>
-            <w:pPr>
-              <w:spacing w:line="240" w:lineRule="auto"/>
-              <w:jc w:val="center"/>
-              <w:rPr>
-                <w:sz w:val="20"/>
-                <w:lang w:val="de-DE"/>
-              </w:rPr>
-            </w:pPr>
-            <w:r>
-              <w:rPr>
-                <w:sz w:val="20"/>
-                <w:lang w:val="de-DE"/>
-              </w:rPr>
-              <w:t>Stipe Čelar</w:t>
-            </w:r>
-          </w:p>
-        </w:tc>
-        <w:tc>
-          <w:tcPr>
-            <w:tcW w:w="3780" w:type="dxa"/>
-            <w:tcBorders>
-              <w:left w:val="single" w:sz="6" w:space="0" w:color="000000"/>
-            </w:tcBorders>
-          </w:tcPr>
-          <w:p>
-            <w:pPr>
-              <w:spacing w:line="240" w:lineRule="auto"/>
-              <w:jc w:val="left"/>
-              <w:rPr>
-                <w:i/>
-                <w:sz w:val="20"/>
-                <w:lang w:val="pl-PL"/>
-              </w:rPr>
-            </w:pPr>
-            <w:r>
-              <w:rPr>
-                <w:i/>
-                <w:sz w:val="20"/>
-                <w:lang w:val="pl-PL"/>
-              </w:rPr>
-              <w:t>Sažetak i ključne riječi ostaju kao poglavlje ali bez numeraciju na razini potpoglavlja</w:t>
-            </w:r>
-          </w:p>
-          <w:p>
-            <w:pPr>
-              <w:spacing w:line="240" w:lineRule="auto"/>
-              <w:jc w:val="left"/>
-              <w:rPr>
-                <w:i/>
-                <w:sz w:val="20"/>
-                <w:lang w:val="pl-PL"/>
-              </w:rPr>
-            </w:pPr>
-            <w:r>
-              <w:rPr>
-                <w:i/>
-                <w:sz w:val="20"/>
-                <w:lang w:val="pl-PL"/>
-              </w:rPr>
-              <w:t>Dodano poglavlje o označavanju slika i tablica.</w:t>
-            </w:r>
-          </w:p>
-        </w:tc>
-      </w:tr>
-      <w:tr>
-        <w:trPr>
-          <w:cantSplit/>
-        </w:trPr>
-        <w:tc>
-          <w:tcPr>
-            <w:tcW w:w="1242" w:type="dxa"/>
-            <w:tcBorders>
-              <w:right w:val="single" w:sz="6" w:space="0" w:color="000000"/>
-            </w:tcBorders>
-          </w:tcPr>
-          <w:p>
-            <w:pPr>
-              <w:spacing w:line="240" w:lineRule="auto"/>
-              <w:jc w:val="center"/>
-              <w:rPr>
-                <w:sz w:val="20"/>
-                <w:lang w:val="pl-PL"/>
-              </w:rPr>
-            </w:pPr>
-            <w:r>
-              <w:rPr>
-                <w:sz w:val="20"/>
-                <w:lang w:val="pl-PL"/>
-              </w:rPr>
-              <w:t>2</w:t>
-            </w:r>
-          </w:p>
-        </w:tc>
-        <w:tc>
-          <w:tcPr>
-            <w:tcW w:w="1418" w:type="dxa"/>
-            <w:tcBorders>
-              <w:left w:val="single" w:sz="6" w:space="0" w:color="000000"/>
-              <w:right w:val="single" w:sz="6" w:space="0" w:color="000000"/>
-            </w:tcBorders>
-          </w:tcPr>
-          <w:p>
-            <w:pPr>
-              <w:spacing w:line="240" w:lineRule="auto"/>
-              <w:jc w:val="center"/>
-              <w:rPr>
-                <w:sz w:val="16"/>
-              </w:rPr>
-            </w:pPr>
-            <w:r>
-              <w:rPr>
-                <w:sz w:val="16"/>
-              </w:rPr>
-              <w:t>2010-07-15</w:t>
-            </w:r>
-          </w:p>
-        </w:tc>
-        <w:tc>
-          <w:tcPr>
-            <w:tcW w:w="1565" w:type="dxa"/>
-            <w:tcBorders>
-              <w:left w:val="single" w:sz="6" w:space="0" w:color="000000"/>
-              <w:right w:val="single" w:sz="6" w:space="0" w:color="000000"/>
-            </w:tcBorders>
-          </w:tcPr>
-          <w:p>
-            <w:pPr>
-              <w:spacing w:line="240" w:lineRule="auto"/>
-              <w:jc w:val="center"/>
-              <w:rPr>
-                <w:sz w:val="20"/>
-                <w:lang w:val="de-DE"/>
-              </w:rPr>
-            </w:pPr>
-            <w:r>
-              <w:rPr>
-                <w:sz w:val="20"/>
-                <w:lang w:val="de-DE"/>
-              </w:rPr>
-              <w:t>Stipe Čelar</w:t>
-            </w:r>
-          </w:p>
-        </w:tc>
-        <w:tc>
-          <w:tcPr>
-            <w:tcW w:w="1643" w:type="dxa"/>
-            <w:tcBorders>
-              <w:left w:val="single" w:sz="6" w:space="0" w:color="000000"/>
-              <w:right w:val="single" w:sz="6" w:space="0" w:color="000000"/>
-            </w:tcBorders>
-          </w:tcPr>
-          <w:p>
-            <w:pPr>
-              <w:spacing w:line="240" w:lineRule="auto"/>
-              <w:jc w:val="center"/>
-              <w:rPr>
-                <w:sz w:val="20"/>
-                <w:lang w:val="de-DE"/>
-              </w:rPr>
-            </w:pPr>
-            <w:r>
-              <w:rPr>
-                <w:sz w:val="20"/>
-                <w:lang w:val="de-DE"/>
-              </w:rPr>
-              <w:t>Stipe Čelar</w:t>
-            </w:r>
-          </w:p>
-        </w:tc>
-        <w:tc>
-          <w:tcPr>
-            <w:tcW w:w="3780" w:type="dxa"/>
-            <w:tcBorders>
-              <w:left w:val="single" w:sz="6" w:space="0" w:color="000000"/>
-            </w:tcBorders>
-          </w:tcPr>
-          <w:p>
-            <w:pPr>
-              <w:spacing w:line="240" w:lineRule="auto"/>
-              <w:jc w:val="left"/>
-              <w:rPr>
-                <w:i/>
-                <w:sz w:val="20"/>
-                <w:lang w:val="pl-PL"/>
-              </w:rPr>
-            </w:pPr>
-            <w:r>
-              <w:rPr>
-                <w:i/>
-                <w:sz w:val="20"/>
-                <w:lang w:val="pl-PL"/>
-              </w:rPr>
-              <w:t>Dodano poglavlje o upravljanju promjenama.</w:t>
-            </w:r>
-            <w:r>
-              <w:rPr>
-                <w:i/>
-                <w:sz w:val="20"/>
-                <w:lang w:val="pl-PL"/>
-              </w:rPr>
-              <w:br/>
-              <w:t>Uključena napomena s obrane o izostanku screen shotova app</w:t>
-            </w:r>
-          </w:p>
-        </w:tc>
-      </w:tr>
-      <w:tr>
-        <w:trPr>
-          <w:cantSplit/>
-        </w:trPr>
-        <w:tc>
-          <w:tcPr>
-            <w:tcW w:w="1242" w:type="dxa"/>
-            <w:tcBorders>
-              <w:right w:val="single" w:sz="6" w:space="0" w:color="000000"/>
-            </w:tcBorders>
-          </w:tcPr>
-          <w:p>
-            <w:pPr>
-              <w:spacing w:line="240" w:lineRule="auto"/>
-              <w:jc w:val="center"/>
-              <w:rPr>
-                <w:sz w:val="20"/>
-                <w:lang w:val="de-DE"/>
-              </w:rPr>
-            </w:pPr>
-            <w:r>
-              <w:rPr>
-                <w:sz w:val="20"/>
-                <w:lang w:val="de-DE"/>
-              </w:rPr>
-              <w:t>1</w:t>
-            </w:r>
-          </w:p>
-        </w:tc>
-        <w:tc>
-          <w:tcPr>
-            <w:tcW w:w="1418" w:type="dxa"/>
-            <w:tcBorders>
-              <w:left w:val="single" w:sz="6" w:space="0" w:color="000000"/>
-              <w:right w:val="single" w:sz="6" w:space="0" w:color="000000"/>
-            </w:tcBorders>
-          </w:tcPr>
-          <w:p>
-            <w:pPr>
-              <w:spacing w:line="240" w:lineRule="auto"/>
-              <w:jc w:val="center"/>
-              <w:rPr>
-                <w:sz w:val="20"/>
-                <w:lang w:val="de-DE"/>
-              </w:rPr>
-            </w:pPr>
-            <w:r>
-              <w:rPr>
-                <w:sz w:val="16"/>
-              </w:rPr>
-              <w:t>2010-03-08</w:t>
-            </w:r>
-          </w:p>
-        </w:tc>
-        <w:tc>
-          <w:tcPr>
-            <w:tcW w:w="1565" w:type="dxa"/>
-            <w:tcBorders>
-              <w:left w:val="single" w:sz="6" w:space="0" w:color="000000"/>
-              <w:right w:val="single" w:sz="6" w:space="0" w:color="000000"/>
-            </w:tcBorders>
-          </w:tcPr>
-          <w:p>
-            <w:pPr>
-              <w:spacing w:line="240" w:lineRule="auto"/>
-              <w:jc w:val="center"/>
-              <w:rPr>
-                <w:sz w:val="20"/>
-                <w:lang w:val="de-DE"/>
-              </w:rPr>
-            </w:pPr>
-            <w:r>
-              <w:rPr>
-                <w:sz w:val="20"/>
-                <w:lang w:val="de-DE"/>
-              </w:rPr>
-              <w:t>Stipe Čelar</w:t>
-            </w:r>
-          </w:p>
-        </w:tc>
-        <w:tc>
-          <w:tcPr>
-            <w:tcW w:w="1643" w:type="dxa"/>
-            <w:tcBorders>
-              <w:left w:val="single" w:sz="6" w:space="0" w:color="000000"/>
-              <w:right w:val="single" w:sz="6" w:space="0" w:color="000000"/>
-            </w:tcBorders>
-          </w:tcPr>
-          <w:p>
-            <w:pPr>
-              <w:spacing w:line="240" w:lineRule="auto"/>
-              <w:jc w:val="center"/>
-              <w:rPr>
-                <w:sz w:val="20"/>
-                <w:lang w:val="de-DE"/>
-              </w:rPr>
-            </w:pPr>
-            <w:r>
-              <w:rPr>
-                <w:sz w:val="20"/>
-                <w:lang w:val="de-DE"/>
-              </w:rPr>
-              <w:t>Stipe Čelar</w:t>
-            </w:r>
-          </w:p>
-        </w:tc>
-        <w:tc>
-          <w:tcPr>
-            <w:tcW w:w="3780" w:type="dxa"/>
-            <w:tcBorders>
-              <w:left w:val="single" w:sz="6" w:space="0" w:color="000000"/>
-            </w:tcBorders>
-          </w:tcPr>
-          <w:p>
-            <w:pPr>
-              <w:spacing w:line="240" w:lineRule="auto"/>
-              <w:jc w:val="left"/>
-              <w:rPr>
-                <w:sz w:val="20"/>
-                <w:lang w:val="pl-PL"/>
-              </w:rPr>
-            </w:pPr>
-            <w:r>
-              <w:rPr>
-                <w:sz w:val="20"/>
-                <w:lang w:val="pl-PL"/>
-              </w:rPr>
-              <w:t>Prva verzija poslana svim diplomantima</w:t>
-            </w:r>
-          </w:p>
-        </w:tc>
-      </w:tr>
-      <w:tr>
-        <w:trPr>
-          <w:cantSplit/>
-        </w:trPr>
-        <w:tc>
-          <w:tcPr>
-            <w:tcW w:w="1242" w:type="dxa"/>
-            <w:tcBorders>
-              <w:right w:val="single" w:sz="6" w:space="0" w:color="000000"/>
-            </w:tcBorders>
-          </w:tcPr>
-          <w:p>
-            <w:pPr>
-              <w:spacing w:line="240" w:lineRule="auto"/>
-              <w:jc w:val="center"/>
-              <w:rPr>
-                <w:sz w:val="20"/>
-                <w:lang w:val="de-DE"/>
-              </w:rPr>
-            </w:pPr>
-            <w:r>
-              <w:rPr>
-                <w:sz w:val="20"/>
-                <w:lang w:val="de-DE"/>
-              </w:rPr>
-              <w:t>0</w:t>
-            </w:r>
-          </w:p>
-        </w:tc>
-        <w:tc>
-          <w:tcPr>
-            <w:tcW w:w="1418" w:type="dxa"/>
-            <w:tcBorders>
-              <w:left w:val="single" w:sz="6" w:space="0" w:color="000000"/>
-              <w:right w:val="single" w:sz="6" w:space="0" w:color="000000"/>
-            </w:tcBorders>
-          </w:tcPr>
-          <w:p>
-            <w:pPr>
-              <w:spacing w:line="240" w:lineRule="auto"/>
-              <w:jc w:val="center"/>
-              <w:rPr>
-                <w:sz w:val="16"/>
-              </w:rPr>
-            </w:pPr>
-            <w:r>
-              <w:rPr>
-                <w:sz w:val="16"/>
-              </w:rPr>
-              <w:t>2009</w:t>
-            </w:r>
-          </w:p>
-        </w:tc>
-        <w:tc>
-          <w:tcPr>
-            <w:tcW w:w="1565" w:type="dxa"/>
-            <w:tcBorders>
-              <w:left w:val="single" w:sz="6" w:space="0" w:color="000000"/>
-              <w:right w:val="single" w:sz="6" w:space="0" w:color="000000"/>
-            </w:tcBorders>
-          </w:tcPr>
-          <w:p>
-            <w:pPr>
-              <w:spacing w:line="240" w:lineRule="auto"/>
-              <w:jc w:val="center"/>
-              <w:rPr>
-                <w:sz w:val="20"/>
-                <w:lang w:val="de-DE"/>
-              </w:rPr>
-            </w:pPr>
-            <w:r>
-              <w:rPr>
-                <w:sz w:val="20"/>
-                <w:lang w:val="de-DE"/>
-              </w:rPr>
-              <w:t>Stipe Čelar</w:t>
-            </w:r>
-          </w:p>
-        </w:tc>
-        <w:tc>
-          <w:tcPr>
-            <w:tcW w:w="1643" w:type="dxa"/>
-            <w:tcBorders>
-              <w:left w:val="single" w:sz="6" w:space="0" w:color="000000"/>
-              <w:right w:val="single" w:sz="6" w:space="0" w:color="000000"/>
-            </w:tcBorders>
-          </w:tcPr>
-          <w:p>
-            <w:pPr>
-              <w:spacing w:line="240" w:lineRule="auto"/>
-              <w:jc w:val="center"/>
-              <w:rPr>
-                <w:sz w:val="20"/>
-                <w:lang w:val="de-DE"/>
-              </w:rPr>
-            </w:pPr>
-          </w:p>
-        </w:tc>
-        <w:tc>
-          <w:tcPr>
-            <w:tcW w:w="3780" w:type="dxa"/>
-            <w:tcBorders>
-              <w:left w:val="single" w:sz="6" w:space="0" w:color="000000"/>
-            </w:tcBorders>
-          </w:tcPr>
-          <w:p>
-            <w:pPr>
-              <w:spacing w:line="240" w:lineRule="auto"/>
-              <w:jc w:val="left"/>
-              <w:rPr>
-                <w:sz w:val="20"/>
-                <w:lang w:val="pl-PL"/>
-              </w:rPr>
-            </w:pPr>
-            <w:r>
-              <w:rPr>
-                <w:sz w:val="20"/>
-                <w:lang w:val="pl-PL"/>
-              </w:rPr>
-              <w:t>Inicijalna verzija. Nastala na laboratorijskim vježbama za potrebe seminara.</w:t>
-            </w:r>
-          </w:p>
-        </w:tc>
-      </w:tr>
-    </w:tbl>
-    <w:p/>
-    <w:p>
-      <w:r>
-        <w:lastRenderedPageBreak/>
-        <w:t>U svojoj radnji napravite ovakvu tablicu sve do zadnje verzije – do printanja. Tada ovo stavite kao jedan od priloga (ako mislite da vam je to bitno) ili ga izbrišite.</w:t>
-      </w:r>
-    </w:p>
-    <w:p/>
-    <w:p>
-      <w:r>
-        <w:t>Potrebno je priložiti i primjerke ostale dokumentacije</w:t>
-      </w:r>
-      <w:r>
-        <w:t xml:space="preserve"> (ako postoje)</w:t>
-      </w:r>
-      <w:r>
-        <w:t>:</w:t>
-      </w:r>
-    </w:p>
-    <w:p>
-      <w:pPr>
-        <w:numPr>
-          <w:ilvl w:val="0"/>
-          <w:numId w:val="5"/>
-        </w:numPr>
-        <w:spacing w:line="240" w:lineRule="auto"/>
-      </w:pPr>
-      <w:r>
-        <w:t>plan upravljanja kvalitetom</w:t>
-      </w:r>
-    </w:p>
-    <w:p>
-      <w:pPr>
-        <w:numPr>
-          <w:ilvl w:val="0"/>
-          <w:numId w:val="5"/>
-        </w:numPr>
-        <w:spacing w:line="240" w:lineRule="auto"/>
-      </w:pPr>
-      <w:r>
-        <w:t>projektni planovi</w:t>
-      </w:r>
-    </w:p>
-    <w:p>
-      <w:pPr>
-        <w:numPr>
-          <w:ilvl w:val="0"/>
-          <w:numId w:val="5"/>
-        </w:numPr>
-        <w:spacing w:line="240" w:lineRule="auto"/>
-      </w:pPr>
-      <w:r>
-        <w:t>plan testiranja</w:t>
-      </w:r>
-    </w:p>
-    <w:p>
-      <w:pPr>
-        <w:numPr>
-          <w:ilvl w:val="0"/>
-          <w:numId w:val="5"/>
-        </w:numPr>
-        <w:spacing w:line="240" w:lineRule="auto"/>
-      </w:pPr>
-      <w:r>
-        <w:t>evidencije</w:t>
-      </w:r>
-    </w:p>
-    <w:p>
-      <w:pPr>
-        <w:numPr>
-          <w:ilvl w:val="0"/>
-          <w:numId w:val="5"/>
-        </w:numPr>
-        <w:spacing w:line="240" w:lineRule="auto"/>
-      </w:pPr>
-      <w:r>
-        <w:t>projektna izvješća</w:t>
-      </w:r>
-    </w:p>
-    <w:p>
-      <w:pPr>
-        <w:numPr>
-          <w:ilvl w:val="0"/>
-          <w:numId w:val="5"/>
-        </w:numPr>
-        <w:spacing w:line="240" w:lineRule="auto"/>
-      </w:pPr>
-      <w:r>
-        <w:t>zapisnici</w:t>
-      </w:r>
-    </w:p>
-    <w:p/>
-    <w:p>
-      <w:pPr>
         <w:pStyle w:val="Prilog1"/>
       </w:pPr>
-      <w:bookmarkStart w:id="84" w:name="_Toc176299324"/>
+      <w:bookmarkStart w:id="81" w:name="_Toc176299324"/>
       <w:r>
         <w:lastRenderedPageBreak/>
         <w:t>SAŽETAK/ABSTRACT I KLJUČNE RIJEČI/KEYWORDS</w:t>
       </w:r>
-      <w:bookmarkEnd w:id="84"/>
+      <w:bookmarkEnd w:id="81"/>
     </w:p>
     <w:p/>
     <w:p>
@@ -20519,7 +15816,7 @@
       <w:rPr>
         <w:noProof/>
       </w:rPr>
-      <w:t>41</w:t>
+      <w:t>36</w:t>
     </w:r>
     <w:r>
       <w:rPr>
@@ -26166,7 +21463,7 @@
 </file>
 
 <file path=customXml/itemProps1.xml><?xml version="1.0" encoding="utf-8"?>
-<ds:datastoreItem xmlns:ds="http://schemas.openxmlformats.org/officeDocument/2006/customXml" ds:itemID="{A4514D9D-27F0-4568-BFF8-2603DB67CB0B}">
+<ds:datastoreItem xmlns:ds="http://schemas.openxmlformats.org/officeDocument/2006/customXml" ds:itemID="{D95053A2-84C3-4E0E-A836-955574C78E0D}">
   <ds:schemaRefs>
     <ds:schemaRef ds:uri="http://schemas.openxmlformats.org/officeDocument/2006/bibliography"/>
   </ds:schemaRefs>

</xml_diff>